<commit_message>
Manuscript v4.1: language pass, new title, Aviles 2026, retrospective benchmark with 11+8+8 batches
- scripts/15: schedule 11, 8, 8, ... (27 and 59 labels); previous run archived in results/retro_al_v1.
- manuscript: robustness table (six convergence exceptions), CHGNet named once, band-edge claims narrowed
  to Fe and Co with Cu and MOF-5 as exceptions, loop value stated as ranking + eligibility rules.
- Figures 1 and graphical abstract reworded (generic pre-relaxation step, "model").

Co-Authored-By: Claude Fable 5.1 <noreply@anthropic.com>
Claude-Session: https://claude.ai/code/session_01CHatVnxyd3V14ULDrJwBF5
</commit_message>
<xml_diff>
--- a/manuscript/Active_learning_MOF_discovery_v4.docx
+++ b/manuscript/Active_learning_MOF_discovery_v4.docx
@@ -15,7 +15,7 @@
           <w:sz w:val="32"/>
           <w:szCs w:val="32"/>
         </w:rPr>
-        <w:t xml:space="preserve">Active learning for low-band-gap three-dimensional metal–organic frameworks: prospective DFT validation of a chemically audited hypothetical catalogue</w:t>
+        <w:t xml:space="preserve">Active learning guided screening of three-dimensional metal-organic frameworks: prospective DFT validation and the limits of band gap prediction</w:t>
       </w:r>
     </w:p>
     <w:p>
@@ -199,7 +199,7 @@
           <w:sz w:val="22"/>
           <w:szCs w:val="22"/>
         </w:rPr>
-        <w:t xml:space="preserve">Three-dimensional metal–organic frameworks (MOFs) with small band gaps are rare, and screening hypothetical frameworks for them with density functional theory (DFT) is costly. We report an active-learning workflow coupling a chemically audited catalogue of 131 hypothetical three-dimensional frameworks, assembled with PORMAKE from charge-balanced M(II) carboxylate nodes and dicarboxylate linkers on five nets, with an ExtraTrees ensemble trained on 20,372 QMOF band gaps and a lower-confidence-bound acquisition with diversity terms. Three batches were validated prospectively with spin-polarised PBE-D3(BJ) calculations after CHGNet pre-relaxation: 18 of 27 frameworks gave accepted labels; the rest collapsed, sheared or did not converge, and are reported. All 13 open-shell frameworks (Fe, Co, Cu) have PBE gaps below 1 eV, eight below 0.5 eV. The prospective error of the surrogate is 0.23 eV for these but 0.96 eV for the closed-shell Zn</w:t>
+        <w:t xml:space="preserve">Three-dimensional metal-organic frameworks (MOFs) with small band gaps are rare, and testing hypothetical frameworks with density functional theory (DFT) is costly. We built an audited catalogue of 131 hypothetical three-dimensional frameworks with PORMAKE, from charge balanced M(II) carboxylate nodes and dicarboxylate linkers on five nets, and screened it with an ExtraTrees ensemble trained on 20,372 QMOF band gaps and a lower confidence bound acquisition rule with diversity caps. Three batches chosen by the model were computed with spin polarised PBE-D3(BJ) after pre-relaxation with a universal machine-learned potential. Of 27 frameworks, 18 gave accepted labels; the rest collapsed, sheared or did not converge. All 13 open-shell frameworks (Fe, Co, Cu) have PBE gaps below 1 eV, eight below 0.5 eV. The model predicted these to 0.23 eV but underestimated the five closed-shell Zn</w:t>
       </w:r>
       <w:r>
         <w:rPr>
@@ -216,7 +216,7 @@
           <w:sz w:val="22"/>
           <w:szCs w:val="22"/>
         </w:rPr>
-        <w:t xml:space="preserve">O frameworks, which it underpredicts systematically; retraining changes little. A retrospective benchmark on QMOF confirms this: at equal DFT budget the acquisition finds three to four times more low-gap frameworks than random selection, while the model error barely moves. Band-edge projections show that the metal fixes the gap in the open-shell families, where both band edges are metal d states, whereas in Zn</w:t>
+        <w:t xml:space="preserve">O frameworks by 0.96 eV, and retraining changed little. A retrospective benchmark on QMOF shows the same split: at equal DFT budget, guided selection finds 3.7 times more low gap frameworks than random choice, while the model error barely moves. Band edge projections explain why. In the Fe and Co frameworks both edges are metal d states and the metal sets the gap; in the Zn</w:t>
       </w:r>
       <w:r>
         <w:rPr>
@@ -233,7 +233,7 @@
           <w:sz w:val="22"/>
           <w:szCs w:val="22"/>
         </w:rPr>
-        <w:t xml:space="preserve">O frameworks both edges are linker states and amine or pyridine substituents lower the gap by up to 1 eV. Periodic GFN1-xTB on CHGNet geometries reproduces the closed-shell labels within 0.23 eV without training data, a cheap check where the surrogate is weakest, but fails for open-shell metals. Code, data and VASP outputs are open.</w:t>
+        <w:t xml:space="preserve">O frameworks both edges are organic, so amine and pyridine linkers lower the gap by up to 1 eV; the Cu paddlewheels sit in between. Periodic GFN1-xTB on the pre-relaxed geometries reproduces the closed-shell labels within 0.23 eV without training data but fails for open-shell metals. Code, data and VASP outputs are open.</w:t>
       </w:r>
     </w:p>
     <w:p>
@@ -257,7 +257,7 @@
           <w:sz w:val="22"/>
           <w:szCs w:val="22"/>
         </w:rPr>
-        <w:t xml:space="preserve"> metal–organic frameworks; active learning; band gap; density functional theory; hypothetical materials; extended tight binding; QMOF</w:t>
+        <w:t xml:space="preserve"> metal-organic frameworks; active learning; band gap; density functional theory; hypothetical materials; extended tight binding; QMOF</w:t>
       </w:r>
     </w:p>
     <w:p>
@@ -287,7 +287,7 @@
           <w:sz w:val="22"/>
           <w:szCs w:val="22"/>
         </w:rPr>
-        <w:t xml:space="preserve">Metal–organic frameworks (MOFs) combine permanent porosity with a modular chemistry of inorganic nodes and organic linkers [1]. Electrically conductive MOFs would add charge transport to this toolbox for sensing, energy storage and electrocatalysis, but they remain a small subset of the known frameworks and are dominated by two-dimensional honeycomb lattices built from π-conjugated, redox-active linkers [2–4]. Three-dimensional conductive frameworks are much rarer, because the carboxylate linkages that make most three-dimensional MOFs robust also interrupt the orbital overlap needed for band transport [5–7]. A small electronic band gap is a necessary, although not sufficient, condition for conductivity, and it is the property that can be screened at scale with semilocal density functional theory (DFT) [8].</w:t>
+        <w:t xml:space="preserve">Metal-organic frameworks (MOFs) combine permanent porosity with a modular chemistry of inorganic nodes and organic linkers [1]. Electrically conductive MOFs would add charge transport to this toolbox for sensing, energy storage and electrocatalysis, but they are still a small subset of the known frameworks, and most of them are two-dimensional honeycomb lattices built from conjugated, redox active linkers [2–4]. Three-dimensional conductive frameworks are much rarer, because the carboxylate linkages that make most three-dimensional MOFs robust also interrupt the orbital overlap that band transport needs [5–7]. Charge can move through a MOF in two ways: through band-like states, which require extended overlap between node and linker orbitals, or by hopping between discrete redox active sites [2,3]. We recently showed that the second mechanism operates in the three-dimensional Zn(pyrazole-naphthalene diimide) framework even though its gap is sizeable (1.37 eV with PBE and 2.56 eV with PBE0): injected electrons localise on the imide and carbonyl groups of the linker, the Zn nodes stay redox inactive, and transport proceeds by hopping between linkers, coupled to the motion of counter-ions, over a barrier of about 45 meV [8]. A small band gap is therefore neither the only route to conduction nor a guarantee of it. It is, however, the necessary condition for band-like transport and the one property that can be screened at scale with semilocal DFT [9], and it is the target of this work.</w:t>
       </w:r>
     </w:p>
     <w:p>
@@ -301,7 +301,7 @@
           <w:sz w:val="22"/>
           <w:szCs w:val="22"/>
         </w:rPr>
-        <w:t xml:space="preserve">Data-driven screening of MOF band gaps rests largely on the QMOF database, which provides PBE band gaps for more than twenty thousand experimentally derived structures, together with hybrid-functional gaps for a subset [9,10]. Models trained on QMOF, from tabular regressors to graph networks and pre-trained transformers [11–13], reach mean absolute errors (MAE) of about 0.3–0.4 eV on held-out QMOF structures. Hypothetical frameworks, however, are rarely drawn from the same distribution: topology-based generators such as PORMAKE can assemble trillions of frameworks from building-block libraries [14], and their densities, pore sizes and metal contents often fall outside the QMOF range. How well a QMOF-trained surrogate transfers to such frameworks can only be established prospectively, by computing the frameworks it selects.</w:t>
+        <w:t xml:space="preserve">Data-driven screening of MOF band gaps rests largely on the QMOF database, which provides PBE band gaps for more than twenty thousand experimentally derived structures, and hybrid functional gaps for a subset [10,11]. Models trained on QMOF, from tabular regressors to graph networks and pre-trained transformers [12–14], reach mean absolute errors (MAE) of about 0.3 to 0.4 eV on held-out QMOF structures. Hypothetical frameworks, however, rarely come from the same distribution. Topology-based generators such as PORMAKE can assemble trillions of frameworks from building block libraries [15], and their densities, pore sizes and metal contents often fall outside the QMOF range. How well a QMOF-trained model transfers to such frameworks can only be settled prospectively, by computing the frameworks it selects.</w:t>
       </w:r>
     </w:p>
     <w:p>
@@ -315,7 +315,7 @@
           <w:sz w:val="22"/>
           <w:szCs w:val="22"/>
         </w:rPr>
-        <w:t xml:space="preserve">Active learning offers a disciplined way to spend a limited DFT budget: a surrogate proposes candidates, their labels are computed, and the model is retrained [15]. Multi-objective acquisition functions that balance predicted value, uncertainty and diversity have been formalised for materials design [16], and active learning has been used in MOF research to build machine-learned potentials [17], to steer adsorption simulations [18] and, most relevant here, to choose the most informative training structures for property prediction on existing databases [19]. What is less common is a discovery-oriented loop on hypothetical three-dimensional frameworks in which every DFT outcome, including the frameworks that fall apart, is reported, and in which the gain of the loop is separated into finding low-gap frameworks and improving the model.</w:t>
+        <w:t xml:space="preserve">Active learning is a disciplined way to spend a limited DFT budget: a model proposes candidates, their labels are computed, and the model is retrained [16]. Acquisition functions that balance predicted value, uncertainty and diversity have been formalised for materials design [17], and active learning has been used in MOF research to build machine-learned potentials [18], to steer adsorption simulations [19] and, closest to this work, to choose the most informative training structures for property prediction on existing databases [20]. What is less common is a discovery loop on hypothetical three-dimensional frameworks in which every DFT outcome is reported, including the frameworks that fall apart, and in which the gain of the loop is split into two questions: does it find low gap frameworks faster, and does it improve the model?</w:t>
       </w:r>
     </w:p>
     <w:p>
@@ -329,7 +329,7 @@
           <w:sz w:val="22"/>
           <w:szCs w:val="22"/>
         </w:rPr>
-        <w:t xml:space="preserve">A complementary route is to replace the data-driven surrogate by a cheap physics-based estimate. The semi-empirical tight-binding method GFN1-xTB [20] optimises MOF geometries reliably under periodic boundary conditions [21,22], and tight-binding electronic structure has been benchmarked against DFT for two-dimensional frameworks [23]. Jose and Walsh recently showed that periodic GFN1-xTB reproduces PBE band gaps of 4,941 QMOF structures with an MAE of 0.37 eV, fails for frameworks with Cr–Ni and Cu(II) centres, and provides a useful low-fidelity input for Δ-learning of hybrid-functional gaps [24,25]. Whether this transfers to hypothetical frameworks that lie outside QMOF, and how it compares with a data-driven surrogate there, has not been tested.</w:t>
+        <w:t xml:space="preserve">A complementary route is to replace the data-driven model by a cheap physics-based estimate. The semi-empirical tight binding method GFN1-xTB [21] optimises MOF geometries reliably under periodic boundary conditions [22,23], and tight binding electronic structure has been benchmarked against DFT for two-dimensional frameworks [24]. Jose and Walsh recently showed that periodic GFN1-xTB reproduces the PBE band gaps of 4,941 QMOF structures with an MAE of 0.37 eV, fails for frameworks with Cr to Ni and Cu(II) centres, and provides a useful low fidelity input for Δ-learning of hybrid functional gaps [25,26]. Whether this carries over to hypothetical frameworks outside QMOF, and how it compares with a data-driven model there, has not been tested.</w:t>
       </w:r>
     </w:p>
     <w:p>
@@ -343,7 +343,7 @@
           <w:sz w:val="22"/>
           <w:szCs w:val="22"/>
         </w:rPr>
-        <w:t xml:space="preserve">Here we build a chemically audited catalogue of hypothetical three-dimensional frameworks, screen it with a QMOF-trained ExtraTrees ensemble and a lower-confidence-bound acquisition function, and validate three batches with spin-polarised PBE-D3(BJ) calculations (Fig. 1). We report four results. First, the loop works as a discovery tool: all 13 open-shell frameworks that survived DFT have PBE gaps below 1 eV, and a retrospective benchmark on QMOF quantifies the gain over random selection. Second, the surrogate is accurate for open-shell 3d frameworks but underpredicts closed-shell Zn</w:t>
+        <w:t xml:space="preserve">Here we build a chemically audited catalogue of hypothetical three-dimensional frameworks, screen it with a QMOF-trained ExtraTrees ensemble and a lower confidence bound acquisition rule, and validate three batches with spin polarised PBE-D3(BJ) calculations (Fig. 1). We report four results. First, the loop works as a discovery tool: all 13 open-shell frameworks that survived DFT have PBE gaps below 1 eV, and a retrospective benchmark on QMOF quantifies the gain over random selection. Second, the model is accurate for open-shell 3d frameworks but underestimates closed-shell Zn</w:t>
       </w:r>
       <w:r>
         <w:rPr>
@@ -360,7 +360,7 @@
           <w:sz w:val="22"/>
           <w:szCs w:val="22"/>
         </w:rPr>
-        <w:t xml:space="preserve">O frameworks by about 1 eV, a transfer failure that 18 new labels do not repair. Third, band-edge projections explain the chemistry: in the open-shell families both band edges are metal d states and the metal fixes the gap, whereas in Zn</w:t>
+        <w:t xml:space="preserve">O frameworks by about 1 eV, and 18 new labels do not repair this. Third, band edge projections explain the chemistry: in the Fe and Co frameworks both band edges are metal d states and the metal fixes the gap, whereas in the Zn</w:t>
       </w:r>
       <w:r>
         <w:rPr>
@@ -377,7 +377,7 @@
           <w:sz w:val="22"/>
           <w:szCs w:val="22"/>
         </w:rPr>
-        <w:t xml:space="preserve">O frameworks both edges lie on the linker and substituents tune the gap. Fourth, periodic GFN1-xTB on machine-learned geometries is an inexpensive, training-free check exactly where the surrogate is weakest, and fails exactly where the surrogate is strongest. Throughout, PBE gaps are used as labels because they are the quantity available in QMOF; their relation to hybrid-functional gaps is discussed explicitly.</w:t>
+        <w:t xml:space="preserve">O frameworks both edges are organic states and the substituents tune the gap. Fourth, periodic GFN1-xTB on machine-learned geometries is an inexpensive check that needs no training data, and it works exactly where the model is weakest and fails exactly where the model is strongest. Throughout, PBE gaps are the labels because they are what QMOF provides; their relation to hybrid functional gaps is discussed explicitly.</w:t>
       </w:r>
     </w:p>
     <w:p>
@@ -448,7 +448,7 @@
           <w:sz w:val="19"/>
           <w:szCs w:val="19"/>
         </w:rPr>
-        <w:t xml:space="preserve">Workflow. A PORMAKE catalogue built from audited building blocks (1) is filtered by structural quality control (2) and scored by an ExtraTrees ensemble trained on QMOF (3). An acquisition function with diversity caps and eligibility rules selects each DFT batch (4), which is pre-relaxed with CHGNet (5), computed with VASP (6) and filtered by acceptance rules (7). Accepted labels (8) retrain the surrogate and are analysed for band-edge character; periodic GFN1-xTB is used as an independent check. All numbers refer to this work.</w:t>
+        <w:t xml:space="preserve">Workflow. A PORMAKE catalogue built from audited building blocks (1) is filtered by structural quality control (2) and scored by an ExtraTrees ensemble trained on QMOF (3). An acquisition rule with diversity caps and eligibility rules selects each DFT batch (4), which is pre-relaxed with a universal machine-learned potential (5), computed with VASP (6) and filtered by acceptance rules (7). Accepted labels (8) retrain the model and are analysed for band edge character; periodic GFN1-xTB is used as an independent check. All numbers refer to this work.</w:t>
       </w:r>
     </w:p>
     <w:p>
@@ -496,7 +496,7 @@
           <w:sz w:val="22"/>
           <w:szCs w:val="22"/>
         </w:rPr>
-        <w:t xml:space="preserve">Frameworks were assembled with PORMAKE 0.2.3 [14], which places node and edge building blocks on the vertices and edges of a topological net and relaxes the cell to match them. The PORMAKE library contains 648 nodes and 219 edges without chemical annotation, so every building block was audited first: composition, number of connection points, presence and number of carboxylate groups, extra oxygen atoms (oxo, hydroxo) and the metal oxidation state implied by charge balance with dianionic dicarboxylate linkers (Table S1). Only metal nodes whose connection points are all carboxylates and whose implied oxidation state is +2 were retained, so that every assembled framework is a neutral M(II) dicarboxylate. Sixteen such nodes cover five families: trinuclear M</w:t>
+        <w:t xml:space="preserve">Frameworks were assembled with PORMAKE 0.2.3 [15], which places node and edge building blocks on the vertices and edges of a net and adjusts the cell to fit them. The PORMAKE library holds 648 nodes and 219 edges without chemical annotation, so we audited every building block first: composition, number of connection points, presence and number of carboxylate groups, extra oxygen atoms (oxo, hydroxo) and the metal oxidation state implied by charge balance with dianionic dicarboxylate linkers (Table S1). We kept only metal nodes whose connection points are all carboxylates and whose implied oxidation state is +2, so every assembled framework is a neutral M(II) dicarboxylate. Sixteen such nodes cover five families: trinuclear M</w:t>
       </w:r>
       <w:r>
         <w:rPr>
@@ -765,7 +765,7 @@
           <w:sz w:val="22"/>
           <w:szCs w:val="22"/>
         </w:rPr>
-        <w:t xml:space="preserve">Every node–linker–net combination was built (168 frameworks) and passed through a structural quality control (QC) that rejects any framework with a pair of atoms closer than 0.70 Å, a heavy–heavy or H–H pair closer than 1.00 Å, a non-bonded contact shorter than 0.8 times the sum of covalent radii, more than one connected component or an isolated atom, an H atom without exactly one neighbour or a C atom with an organic coordination number outside 2–4, a composition different from the sum of its building blocks, a density outside 0.20–3.0 g cm</w:t>
+        <w:t xml:space="preserve">Every node, linker and net combination was built (168 frameworks) and passed through a structural quality control (QC). A framework is rejected if it has a pair of atoms closer than 0.70 Å, a heavy atom or H pair closer than 1.00 Å, a non-bonded contact shorter than 0.8 times the sum of covalent radii, more than one connected component or an isolated atom, an H atom without exactly one neighbour, a C atom with an organic coordination number outside 2 to 4, a composition different from the sum of its building blocks, a density outside 0.20 to 3.0 g cm</w:t>
       </w:r>
       <w:r>
         <w:rPr>
@@ -782,7 +782,7 @@
           <w:sz w:val="22"/>
           <w:szCs w:val="22"/>
         </w:rPr>
-        <w:t xml:space="preserve">, a cell length below 5 Å, more than 600 atoms, or a node root-mean-square deviation above 0.30 Å after placement. Thirty-seven frameworks failed, most often for low density or short heavy-atom contacts (Table S3); the catalogue holds 131 frameworks, 91 with an open-shell 3d metal and 40 closed-shell (Zn, Mg) references (Table S4). The generator reproduces the compositions of MOF-5, IRMOF-3 and IRMOF-10 (Table S5).</w:t>
+        <w:t xml:space="preserve">, a cell length below 5 Å, more than 600 atoms, or a node root mean square deviation above 0.30 Å after placement. Thirty-seven frameworks failed, most often for low density or short heavy atom contacts (Table S3). The catalogue holds 131 frameworks, 91 with an open-shell 3d metal and 40 closed-shell (Zn, Mg) references (Table S4). The generator reproduces the compositions of MOF-5, IRMOF-3 and IRMOF-10 (Table S5).</w:t>
       </w:r>
     </w:p>
     <w:p>
@@ -800,7 +800,7 @@
           <w:sz w:val="23"/>
           <w:szCs w:val="23"/>
         </w:rPr>
-        <w:t xml:space="preserve">2.2 Descriptors and surrogate model</w:t>
+        <w:t xml:space="preserve">2.2 Descriptors and prediction model</w:t>
       </w:r>
     </w:p>
     <w:p>
@@ -814,7 +814,7 @@
           <w:sz w:val="22"/>
           <w:szCs w:val="22"/>
         </w:rPr>
-        <w:t xml:space="preserve">Each framework is described by 64 tabular descriptors (feature set C, Table S7): eight geometric quantities, among them the pore-limiting and largest-cavity diameters from a high-accuracy Voronoi decomposition in Zeo++ [26], 22 composition aggregates such as the metal fraction, the carbon-to-atom ratio and the number of open-shell 3d metals, and the fractions of 34 common elements. QMOF structures were featurised identically. The surrogate was chosen from a benchmark of eleven regressors on five feature sets, trained on 80 % of the 20,372 QMOF entries with a PBE gap and evaluated on the remaining 20 %, stratified by the 1 eV threshold (Table S6). ExtraTrees [27,28] on feature set C gave the lowest error without PBE-derived inputs (R</w:t>
+        <w:t xml:space="preserve">Each framework is described by 64 tabular descriptors (feature set C, Table S7): eight geometric quantities, among them the pore limiting and largest cavity diameters from a high accuracy Voronoi decomposition in Zeo++ [27]; 22 composition aggregates such as the metal fraction, the carbon to atom ratio and the number of open-shell 3d metals; and the fractions of 34 common elements. QMOF structures were featurised in the same way. The model was chosen from a benchmark of eleven regressors on five feature sets, trained on 80 % of the 20,372 QMOF entries with a PBE gap and evaluated on the remaining 20 %, stratified by the 1 eV threshold (Table S6). ExtraTrees [28,29] on feature set C gave the lowest error without PBE-derived inputs (R</w:t>
       </w:r>
       <w:r>
         <w:rPr>
@@ -831,7 +831,7 @@
           <w:sz w:val="22"/>
           <w:szCs w:val="22"/>
         </w:rPr>
-        <w:t xml:space="preserve"> = 0.75, MAE = 0.39 eV, Spearman ρ = 0.86, ROC AUC = 0.95 for the 1 eV classification; Fig. S1); adding categorical descriptors (set D) did not help, and PBE-derived auxiliary quantities (set E) were excluded as leakage. Gradient-boosting [29–31] and random-forest [32] models were within 0.02 eV. SHAP values [33] rank the open-shell flag, the transition-metal flag and the open-shell fraction as the three dominant descriptors (Fig. S2).</w:t>
+        <w:t xml:space="preserve"> = 0.75, MAE = 0.39 eV, Spearman ρ = 0.86, ROC AUC = 0.95 for the 1 eV classification; Fig. S1). Adding categorical descriptors (set D) did not help, and PBE-derived auxiliary quantities (set E) were excluded as leakage. Gradient boosting [30–32] and random forest [33] models were within 0.02 eV. SHAP values [34] rank the open-shell flag, the transition metal flag and the open-shell fraction as the three dominant descriptors (Fig. S2).</w:t>
       </w:r>
     </w:p>
     <w:p>
@@ -845,7 +845,7 @@
           <w:sz w:val="22"/>
           <w:szCs w:val="22"/>
         </w:rPr>
-        <w:t xml:space="preserve">For active learning, five ExtraTrees regressors (300 trees, max_features = sqrt, min_samples_leaf = 2; Table S8) with different seeds form an ensemble in the spirit of deep ensembles [34]. The prediction μ(x) is the mean of the five members. Because the five means of fully grown tree ensembles differ by only 0.03 eV on average, the uncertainty σ(x) is defined as the standard deviation over all 1,500 trees of the five members, which is 0.5 eV on average for the catalogue and tracks the prospective errors (Section 3.4). A framework is flagged out of distribution (I</w:t>
+        <w:t xml:space="preserve">For active learning, five ExtraTrees regressors (300 trees, max_features = sqrt, min_samples_leaf = 2; Table S8) with different seeds form an ensemble in the spirit of deep ensembles [35]. The prediction μ(x) is the mean of the five members. The five means of fully grown tree ensembles differ by only 0.03 eV on average, so the uncertainty σ(x) is defined instead as the standard deviation over all 1,500 trees of the five members; it is 0.5 eV on average for the catalogue and tracks the prospective errors (Section 3.4). A framework is flagged out of distribution (I</w:t>
       </w:r>
       <w:r>
         <w:rPr>
@@ -862,7 +862,7 @@
           <w:sz w:val="22"/>
           <w:szCs w:val="22"/>
         </w:rPr>
-        <w:t xml:space="preserve"> = 1) when its density, pore-limiting diameter, number of atoms, metal fraction or carbon-to-atom ratio lies outside the 5–95 % range of QMOF; 89 of the 131 frameworks carry the flag.</w:t>
+        <w:t xml:space="preserve"> = 1) when its density, pore limiting diameter, number of atoms, metal fraction or carbon to atom ratio lies outside the 5 to 95 % range of QMOF; 89 of the 131 frameworks carry the flag.</w:t>
       </w:r>
     </w:p>
     <w:p>
@@ -894,7 +894,7 @@
           <w:sz w:val="22"/>
           <w:szCs w:val="22"/>
         </w:rPr>
-        <w:t xml:space="preserve">Candidates are ranked by a lower-confidence-bound score extended with a topology-novelty reward and the out-of-distribution penalty,</w:t>
+        <w:t xml:space="preserve">Candidates are ranked by a lower confidence bound score extended with a topology novelty reward and the out-of-distribution penalty,</w:t>
       </w:r>
     </w:p>
     <w:p>
@@ -994,7 +994,7 @@
           <w:sz w:val="22"/>
           <w:szCs w:val="22"/>
         </w:rPr>
-        <w:t xml:space="preserve">(x) is the number of accepted labels already available in the net of x, and κ = 1.0, α = 0.3 and β = 0.5 [16,35]. The lowest scores are taken subject to diversity caps per net, metal and substituent, so that a batch samples several families rather than the single most promising one. In iteration 0 the caps were two per net and two per metal, and two closed-shell frameworks, MOF-5 and the Zn</w:t>
+        <w:t xml:space="preserve">(x) is the number of accepted labels already available in the net of x, and κ = 1.0, α = 0.3 and β = 0.5 [17,36]. The lowest scores are taken, subject to diversity caps per net, metal and substituent, so that a batch samples several families rather than only the most promising one. In iteration 0 the caps were two per net and two per metal, and two closed-shell frameworks, MOF-5 and the Zn</w:t>
       </w:r>
       <w:r>
         <w:rPr>
@@ -1011,7 +1011,7 @@
           <w:sz w:val="22"/>
           <w:szCs w:val="22"/>
         </w:rPr>
-        <w:t xml:space="preserve"> paddlewheel cds framework, were added as references; iteration 0 therefore comprised 11 frameworks. Iterations 1 and 2 selected eight frameworks each from the candidates not yet computed, with caps of four per net, two per metal and four per substituent, and with eligibility rules learned from the previous iteration: node families or node–net–metal combinations whose frameworks had collapsed in DFT were excluded, and frameworks were limited to 160 atoms (Table S9). The caps are reached by the open-shell candidates after six picks, so the last two slots of iterations 1 and 2 went to Zn</w:t>
+        <w:t xml:space="preserve"> paddlewheel cds framework, were added as references, for a batch of 11. Iterations 1 and 2 selected eight frameworks each from the candidates not yet computed, with caps of four per net, two per metal and four per substituent, and with eligibility rules learned from the previous iteration: node families or node, net and metal combinations whose frameworks had collapsed in DFT were excluded, and frameworks were limited to 160 atoms (Table S9). The open-shell candidates reach the caps after six picks, so the last two slots of iterations 1 and 2 went to Zn</w:t>
       </w:r>
       <w:r>
         <w:rPr>
@@ -1028,7 +1028,7 @@
           <w:sz w:val="22"/>
           <w:szCs w:val="22"/>
         </w:rPr>
-        <w:t xml:space="preserve">O frameworks, which served as closed-shell protocol checks and, as it turned out, as the most informative test of transferability. The parameters were fixed before any DFT result was known and were not tuned afterwards.</w:t>
+        <w:t xml:space="preserve">O frameworks. They served as closed-shell checks of the protocol and, as it turned out, as the most informative test of transferability. The parameters were fixed before any DFT result was known and were not tuned afterwards.</w:t>
       </w:r>
     </w:p>
     <w:p>
@@ -1060,7 +1060,7 @@
           <w:sz w:val="22"/>
           <w:szCs w:val="22"/>
         </w:rPr>
-        <w:t xml:space="preserve">As-assembled PORMAKE geometries contain compressed bonds at the node–linker junction (C–C down to 1.1 Å, N–H 0.86 Å), which in a first attempt produced initial forces of 10–35 eV Å</w:t>
+        <w:t xml:space="preserve">As-assembled PORMAKE geometries contain compressed bonds at the junction between node and linker (C to C down to 1.1 Å, N to H 0.86 Å). In a first attempt these produced initial forces of 10 to 35 eV Å</w:t>
       </w:r>
       <w:r>
         <w:rPr>
@@ -1094,7 +1094,7 @@
           <w:sz w:val="22"/>
           <w:szCs w:val="22"/>
         </w:rPr>
-        <w:t xml:space="preserve">) with the universal machine-learned potential CHGNet 0.3.0 [36] before DFT. The pre-relaxed geometry is only a starting point; every label comes from the DFT relaxation described next.</w:t>
+        <w:t xml:space="preserve">) with a universal machine-learned interatomic potential, CHGNet 0.3.0 [37], before DFT. The pre-relaxed geometry is only a starting point; every label comes from the DFT relaxation described next.</w:t>
       </w:r>
     </w:p>
     <w:p>
@@ -1108,7 +1108,7 @@
           <w:sz w:val="22"/>
           <w:szCs w:val="22"/>
         </w:rPr>
-        <w:t xml:space="preserve">DFT calculations used VASP 6.3.2 [37] with the projector augmented-wave method [38,39], the PBE functional [40] and the D3(BJ) dispersion correction [41,42], a 520 eV plane-wave cutoff and Γ-centred k-meshes with n</w:t>
+        <w:t xml:space="preserve">DFT calculations used VASP 6.3.2 [38] with the projector augmented wave method [39,40], the PBE functional [41] and the D3(BJ) dispersion correction [42,43], a 520 eV plane wave cutoff and Γ-centred k-meshes with n</w:t>
       </w:r>
       <w:r>
         <w:rPr>
@@ -1142,7 +1142,7 @@
           <w:sz w:val="22"/>
           <w:szCs w:val="22"/>
         </w:rPr>
-        <w:t xml:space="preserve">) divisions (Γ only for relaxations of cells with all lattice vectors above 12 Å). All calculations were spin polarised with a high-spin ferromagnetic initial guess (5, 4, 3, 2 and 1 μ</w:t>
+        <w:t xml:space="preserve">) divisions (Γ only for relaxations of cells with all lattice vectors above 12 Å). All calculations were spin polarised with a high spin ferromagnetic initial guess (5, 4, 3, 2 and 1 μ</w:t>
       </w:r>
       <w:r>
         <w:rPr>
@@ -1159,7 +1159,7 @@
           <w:sz w:val="22"/>
           <w:szCs w:val="22"/>
         </w:rPr>
-        <w:t xml:space="preserve"> for Mn, Fe, Co, Ni and Cu) and ALGO = All for Fe, Co and Ni, for which the default algorithm failed to converge. Positions and cell were relaxed (ISIF = 3) to forces below 0.05 eV Å</w:t>
+        <w:t xml:space="preserve"> for Mn, Fe, Co, Ni and Cu) and ALGO = All for Fe, Co and Ni, for which the default algorithm did not converge. Positions and cell were relaxed (ISIF = 3) until the forces fell below 0.05 eV Å</w:t>
       </w:r>
       <w:r>
         <w:rPr>
@@ -1176,7 +1176,7 @@
           <w:sz w:val="22"/>
           <w:szCs w:val="22"/>
         </w:rPr>
-        <w:t xml:space="preserve">; a relaxation was considered converged only when a restarted run reported convergence again, which guards against the false convergence of a single long run. A static calculation with EDIFF = 10</w:t>
+        <w:t xml:space="preserve">. A relaxation counted as converged only when a restarted run reported convergence again, which guards against the false convergence of a single long run. A static calculation with EDIFF = 10</w:t>
       </w:r>
       <w:r>
         <w:rPr>
@@ -1210,7 +1210,7 @@
           <w:sz w:val="22"/>
           <w:szCs w:val="22"/>
         </w:rPr>
-        <w:t xml:space="preserve"> paddlewheel framework a second static calculation was started from a broken-symmetry guess with opposite moments on the two metals of each isolated M</w:t>
+        <w:t xml:space="preserve"> paddlewheel framework a second static calculation was started from a broken symmetry guess with opposite moments on the two metals of each isolated M</w:t>
       </w:r>
       <w:r>
         <w:rPr>
@@ -1227,7 +1227,7 @@
           <w:sz w:val="22"/>
           <w:szCs w:val="22"/>
         </w:rPr>
-        <w:t xml:space="preserve"> unit (ISYM = 0) [43], and the lower-energy converged solution provided the label. Complete parameters are given in Table S10.</w:t>
+        <w:t xml:space="preserve"> unit (ISYM = 0) [44], and the lower energy converged solution provided the label. Complete parameters are given in Table S10.</w:t>
       </w:r>
     </w:p>
     <w:p>
@@ -1258,7 +1258,7 @@
           <w:sz w:val="22"/>
           <w:szCs w:val="22"/>
         </w:rPr>
-        <w:t xml:space="preserve">, and the framework had not collapsed, defined as a volume change beyond ±20 % or a cell-angle change beyond 10° relative to the generated structure; intact soft frameworks contracted by up to 14 % under PBE-D3. Five relaxations that had not met the force criterion at the end of their second walltime, but whose largest force was below 0.25 eV Å</w:t>
+        <w:t xml:space="preserve">, and the framework had not collapsed. Collapse means a volume change beyond ±20 % or a cell angle change beyond 10° relative to the generated structure; intact soft frameworks contracted by up to 14 % under PBE-D3. Five relaxations had not met the force criterion at the end of their second walltime but had residual forces below 0.25 eV Å</w:t>
       </w:r>
       <w:r>
         <w:rPr>
@@ -1275,7 +1275,7 @@
           <w:sz w:val="22"/>
           <w:szCs w:val="22"/>
         </w:rPr>
-        <w:t xml:space="preserve"> and whose gap had been stable to within 0.05 eV over the last 50 ionic steps (four in iteration 0, with residual forces of 0.08–0.22 eV Å</w:t>
+        <w:t xml:space="preserve"> and a gap stable to within 0.05 eV over the last 50 ionic steps (four in iteration 0, with residual forces of 0.08 to 0.22 eV Å</w:t>
       </w:r>
       <w:r>
         <w:rPr>
@@ -1309,7 +1309,7 @@
           <w:sz w:val="22"/>
           <w:szCs w:val="22"/>
         </w:rPr>
-        <w:t xml:space="preserve">), were stopped by hand and their static calculations run on the last geometry; they are marked in Table S11. One relaxation whose last electronic step missed the energy threshold by 10</w:t>
+        <w:t xml:space="preserve">). These were stopped by hand and their static calculations run on the last geometry; they are marked in Table S11. One relaxation whose last electronic step missed the energy threshold by 10</w:t>
       </w:r>
       <w:r>
         <w:rPr>
@@ -1343,7 +1343,7 @@
           <w:sz w:val="22"/>
           <w:szCs w:val="22"/>
         </w:rPr>
-        <w:t xml:space="preserve">. Band gaps are the difference between the lowest unoccupied and highest occupied eigenvalues over all k-points and both spins. Band-edge character was obtained from the site- and orbital-projected eigenvalues within 0.25 eV of the valence-band maximum (VBM) and conduction-band minimum (CBM), summed over k-points and spins and assigned to four site groups: metal, μ</w:t>
+        <w:t xml:space="preserve">. Table S14 shows that the headline numbers do not depend on these six cases. Band gaps are the difference between the lowest unoccupied and the highest occupied eigenvalue over all k-points and both spins. Band edge character was obtained from the site and orbital projected eigenvalues within 0.25 eV of the valence band maximum (VBM) and conduction band minimum (CBM), summed over k-points and spins and assigned to four site groups: metal, μ</w:t>
       </w:r>
       <w:r>
         <w:rPr>
@@ -1360,7 +1360,7 @@
           <w:sz w:val="22"/>
           <w:szCs w:val="22"/>
         </w:rPr>
-        <w:t xml:space="preserve">-oxide, carboxylate O, and the C, H, N and F atoms of the linker backbone. Structures were handled with pymatgen and ASE [44,45].</w:t>
+        <w:t xml:space="preserve">-oxide, carboxylate O, and the C, H, N and F atoms of the linker backbone. Structures were handled with pymatgen and ASE [45,46].</w:t>
       </w:r>
     </w:p>
     <w:p>
@@ -1392,7 +1392,7 @@
           <w:sz w:val="22"/>
           <w:szCs w:val="22"/>
         </w:rPr>
-        <w:t xml:space="preserve">GFN1-xTB [20] band gaps were computed with tblite 0.4 [46] under periodic boundary conditions at the Γ point, with an electronic temperature of 500 K and the number of unpaired electrons fixed at the high-spin count of the 3d metals; the Hamiltonian is spin restricted, as in Jose and Walsh [24]. Γ-point calculations on an n</w:t>
+        <w:t xml:space="preserve">GFN1-xTB [21] band gaps were computed with tblite 0.4 [47] under periodic boundary conditions at the Γ point, with an electronic temperature of 500 K and the number of unpaired electrons fixed at the high spin count of the 3d metals; the Hamiltonian is spin restricted, as in Jose and Walsh [25]. Γ-point calculations on an n</w:t>
       </w:r>
       <w:r>
         <w:rPr>
@@ -1443,7 +1443,7 @@
           <w:sz w:val="22"/>
           <w:szCs w:val="22"/>
         </w:rPr>
-        <w:t xml:space="preserve"> supercell, equivalent to a Γ-centred k-mesh of the unit cell, changed the gaps by at most 0.12 eV. Two reference sets were computed: a random subset of 2,000 QMOF structures, once as periodic crystals and once as the finite clusters that an earlier version of this work had used, and the 131 catalogue frameworks at their as-assembled, CHGNet-relaxed and, where available, DFT-relaxed geometries. For the Zn</w:t>
+        <w:t xml:space="preserve"> supercell, which are equivalent to a Γ-centred k-mesh of the unit cell, changed the gaps by at most 0.12 eV. Two reference sets were computed: a random subset of 2,000 QMOF structures, once as periodic crystals and once as the finite clusters that an earlier version of this work had used, and the 131 catalogue frameworks at their as-assembled, pre-relaxed and, where available, DFT-relaxed geometries. For the Zn</w:t>
       </w:r>
       <w:r>
         <w:rPr>
@@ -1460,7 +1460,7 @@
           <w:sz w:val="22"/>
           <w:szCs w:val="22"/>
         </w:rPr>
-        <w:t xml:space="preserve">O labels the Mulliken populations [47] of the frontier orbitals were assigned to the same four site groups as the DFT band edges.</w:t>
+        <w:t xml:space="preserve">O labels the Mulliken populations [48] of the frontier orbitals were assigned to the same four site groups as the DFT band edges.</w:t>
       </w:r>
     </w:p>
     <w:p>
@@ -1492,7 +1492,7 @@
           <w:sz w:val="22"/>
           <w:szCs w:val="22"/>
         </w:rPr>
-        <w:t xml:space="preserve">To estimate what the acquisition buys at this DFT budget, the prospective protocol was replayed on QMOF, where labels are free. The surrogate was trained on the QMOF structures inside the 5–95 % range of the five out-of-distribution descriptors; the candidate pool consisted of out-of-range QMOF structures with the catalogue's chemistry (one metal from Mn, Fe, Co, Ni, Cu, Zn or Mg, and otherwise only C, H, N, O and F), 150 per repeat. Batches of 11, 6 and 6 structures, then further batches of 6 up to 53 labels, were selected by six strategies (random, greedy, lower confidence bound, the acquisition of this work with and without retraining, and pure uncertainty sampling), their QMOF gaps were revealed, and the model was retrained; 20 repeats were run. Metrics are the number of labelled structures with gaps below 0.5 and 1 eV, the recall of the ten lowest gaps in the pool, and the MAE on a fixed external out-of-distribution test set.</w:t>
+        <w:t xml:space="preserve">To estimate what the acquisition rule buys at this DFT budget, the prospective protocol was replayed on QMOF, where labels are free. The model was trained on the QMOF structures inside the 5 to 95 % range of the five out-of-distribution descriptors. The candidate pool consisted of out-of-range QMOF structures with the catalogue's chemistry (one metal from Mn, Fe, Co, Ni, Cu, Zn or Mg, and otherwise only C, H, N, O and F), 150 per repeat. Batches of 11, 8 and 8 structures, the sizes of the three prospective batches, followed by further batches of 8 up to 59 labels, were selected by six strategies (random, greedy, lower confidence bound, the acquisition rule of this work with and without retraining, and pure uncertainty sampling); their QMOF gaps were revealed and the model was retrained. Twenty repeats were run. The metrics are the number of labelled structures with gaps below 0.5 and 1 eV, the recall of the ten lowest gaps in the pool, and the MAE on a fixed external out-of-distribution test set.</w:t>
       </w:r>
     </w:p>
     <w:p>
@@ -1526,7 +1526,7 @@
           <w:sz w:val="23"/>
           <w:szCs w:val="23"/>
         </w:rPr>
-        <w:t xml:space="preserve">3.1 Catalogue and surrogate predictions</w:t>
+        <w:t xml:space="preserve">3.1 Catalogue and model predictions</w:t>
       </w:r>
     </w:p>
     <w:p>
@@ -1540,7 +1540,7 @@
           <w:sz w:val="22"/>
           <w:szCs w:val="22"/>
         </w:rPr>
-        <w:t xml:space="preserve">The 131 frameworks span 48–432 atoms per cell, densities of 0.20–1.22 g cm</w:t>
+        <w:t xml:space="preserve">The 131 frameworks span 48 to 432 atoms per cell, densities of 0.20 to 1.22 g cm</w:t>
       </w:r>
       <w:r>
         <w:rPr>
@@ -1557,7 +1557,7 @@
           <w:sz w:val="22"/>
           <w:szCs w:val="22"/>
         </w:rPr>
-        <w:t xml:space="preserve">, pore-limiting diameters of 4.3–17.7 Å and largest-cavity diameters of 7.0–24.7 Å. Compared with QMOF the catalogue is lighter, more open and slightly richer in metal (Fig. 2); 68 % of the frameworks are flagged out of distribution on at least one descriptor, mostly for low density and large pores. This is deliberate: the design targets open three-dimensional nets with open-shell nodes, which QMOF contains only sparsely, and the prospective validation measures whether the surrogate survives the shift.</w:t>
+        <w:t xml:space="preserve">, pore limiting diameters of 4.3 to 17.7 Å and largest cavity diameters of 7.0 to 24.7 Å. Compared with QMOF the catalogue is lighter, more open and slightly richer in metal (Fig. 2); 68 % of the frameworks are flagged out of distribution on at least one descriptor, mostly for low density and large pores. This is deliberate. The design targets open three-dimensional nets with open-shell nodes, which QMOF contains only sparsely, and the prospective validation measures whether the model survives the shift.</w:t>
       </w:r>
     </w:p>
     <w:p>
@@ -1628,7 +1628,7 @@
           <w:sz w:val="19"/>
           <w:szCs w:val="19"/>
         </w:rPr>
-        <w:t xml:space="preserve">Distributions of four descriptors for the 131 catalogue frameworks and for the 20,372 QMOF structures used for training: framework density, pore-limiting diameter, atoms per cell and metal fraction (normalised histograms). The out-of-distribution flag of Section 2.2 uses the 5 % and 95 % percentiles of the QMOF distributions.</w:t>
+        <w:t xml:space="preserve">Distributions of four descriptors for the 131 catalogue frameworks and for the 20,372 QMOF structures used for training: framework density, pore limiting diameter, atoms per cell and metal fraction (normalised histograms). The out-of-distribution flag of Section 2.2 uses the 5 % and 95 % percentiles of the QMOF distributions.</w:t>
       </w:r>
     </w:p>
     <w:p>
@@ -1642,7 +1642,7 @@
           <w:sz w:val="22"/>
           <w:szCs w:val="22"/>
         </w:rPr>
-        <w:t xml:space="preserve">The initial surrogate, trained on QMOF only, predicts PBE gaps below 1 eV for 82 of the 131 frameworks (Fig. 3, Fig. S3, Fig. S4). Its predictions are organised by the metal: the closed-shell Zn and Mg families lie at 1.4–2.5 eV, and every open-shell family lies between 0.4 and 1.2 eV, with Co and Fe below Mn, Cu and Ni. Paired comparisons that change one design axis at a time (Table S7 and results/surrogate in the repository) quantify the trends the model has learned from QMOF: replacing Zn by Co, Fe, Mn, Ni or Cu in the same node, net and linker lowers μ by 1.1–1.4 eV; the substituents lower it by 0.03 (F</w:t>
+        <w:t xml:space="preserve">The initial model, trained on QMOF only, predicts PBE gaps below 1 eV for 82 of the 131 frameworks (Fig. 3, Fig. S3, Fig. S4). Its predictions are organised by the metal: the closed-shell Zn and Mg families lie at 1.4 to 2.5 eV, and every open-shell family lies between 0.4 and 1.2 eV, with Co and Fe below Mn, Cu and Ni. Paired comparisons that change one design axis at a time (Table S7 and results/surrogate in the repository) quantify the trends the model has learned from QMOF. Replacing Zn by Co, Fe, Mn, Ni or Cu in the same node, net and linker lowers μ by 1.1 to 1.4 eV; the substituents lower it by 0.03 (F</w:t>
       </w:r>
       <w:r>
         <w:rPr>
@@ -1659,7 +1659,7 @@
           <w:sz w:val="22"/>
           <w:szCs w:val="22"/>
         </w:rPr>
-        <w:t xml:space="preserve">) to 0.27 eV (bipyridine) relative to H; the long BPDC linker raises it by 0.07 eV; and the cds net lies 0.3 eV below nbo for the same paddlewheel. These are properties of the surrogate, and Sections 3.3 and 3.4 test them against DFT.</w:t>
+        <w:t xml:space="preserve">) to 0.27 eV (bipyridine) relative to H; the long BPDC linker raises it by 0.07 eV; and the cds net lies 0.3 eV below nbo for the same paddlewheel. These are properties of the model, and Sections 3.3 and 3.4 test them against DFT.</w:t>
       </w:r>
     </w:p>
     <w:p>
@@ -1730,7 +1730,7 @@
           <w:sz w:val="19"/>
           <w:szCs w:val="19"/>
         </w:rPr>
-        <w:t xml:space="preserve">Predicted PBE gap μ of the initial surrogate (trained on QMOF only) for the 131 catalogue frameworks, grouped by net and metal. Grey, closed-shell Zn and Mg frameworks; blue, open-shell 3d frameworks; the dashed line marks 1 eV. Boxes span the interquartile range over linkers.</w:t>
+        <w:t xml:space="preserve">Predicted PBE gap μ of the initial model (trained on QMOF only) for the 131 catalogue frameworks, grouped by net and metal. Grey, closed-shell Zn and Mg frameworks; blue, open-shell 3d frameworks; the dashed line marks 1 eV. Boxes span the interquartile range over linkers.</w:t>
       </w:r>
     </w:p>
     <w:p>
@@ -1762,7 +1762,7 @@
           <w:sz w:val="22"/>
           <w:szCs w:val="22"/>
         </w:rPr>
-        <w:t xml:space="preserve">Twenty-seven frameworks were computed in three iterations for a total of 24,600 core-hours (Table 1, Table 2, Table S15). Eighteen gave accepted labels; nine did not, and their fate is part of the result (Table S13). Five frameworks collapsed or sheared: the two trinuclear Mn</w:t>
+        <w:t xml:space="preserve">Twenty-seven frameworks were computed in three iterations for a total of 24,600 core-hours (Table 1, Table 2, Table S16). Eighteen gave accepted labels; nine did not, and their fate is part of the result (Table S13). Five frameworks collapsed or sheared: the two trinuclear Mn</w:t>
       </w:r>
       <w:r>
         <w:rPr>
@@ -1813,7 +1813,7 @@
           <w:sz w:val="22"/>
           <w:szCs w:val="22"/>
         </w:rPr>
-        <w:t xml:space="preserve"> bcu frameworks of iteration 1 lost 21–25 %, and the Zn</w:t>
+        <w:t xml:space="preserve"> bcu frameworks of iteration 1 lost 21 to 25 %, and the Zn</w:t>
       </w:r>
       <w:r>
         <w:rPr>
@@ -1847,7 +1847,7 @@
           <w:sz w:val="22"/>
           <w:szCs w:val="22"/>
         </w:rPr>
-        <w:t xml:space="preserve"> ‘paddlewheel’ node, for instance, has a Mn–Mn distance of 4.0 Å rather than the 2.6–2.8 Å of the Cu and Co paddlewheels. The M</w:t>
+        <w:t xml:space="preserve"> ‘paddlewheel’ node, for instance, has its two Mn atoms 4.0 Å apart, against 2.6 to 2.8 Å in the Cu and Co paddlewheels. The M</w:t>
       </w:r>
       <w:r>
         <w:rPr>
@@ -1898,7 +1898,7 @@
           <w:sz w:val="22"/>
           <w:szCs w:val="22"/>
         </w:rPr>
-        <w:t xml:space="preserve"> family was excluded after iteration 0, so its Fe and Co members remain untested. The remaining four failures were a dia Ni framework whose self-consistent field did not converge in 24 h, an nbo Co framework whose relaxation became unstable, a Cu</w:t>
+        <w:t xml:space="preserve"> family was excluded after iteration 0, so its Fe and Co members remain untested. The other four failures were a dia Ni framework whose self-consistent field did not converge in 24 h, an nbo Co framework whose relaxation became unstable, a Cu</w:t>
       </w:r>
       <w:r>
         <w:rPr>
@@ -1932,7 +1932,7 @@
           <w:sz w:val="22"/>
           <w:szCs w:val="22"/>
         </w:rPr>
-        <w:t xml:space="preserve"> framework with the amine linker whose relaxation was still lowering its energy at the walltime. These outcomes defined the eligibility rules of the following iterations, and they cost 11,900 core-hours, half of the total, two thirds of it in the 24 h relaxations of iteration 0 that preceded the CHGNet pre-relaxation. No Mn framework survived, so the open-shell results concern Fe, Co and Cu.</w:t>
+        <w:t xml:space="preserve"> framework with the amine linker whose relaxation was still lowering its energy at the walltime. These outcomes defined the eligibility rules of the following iterations, and they cost 11,900 core-hours, half of the total, two thirds of it in the 24 h relaxations of iteration 0 that preceded the pre-relaxation step. No Mn framework survived, so the open-shell results concern Fe, Co and Cu.</w:t>
       </w:r>
     </w:p>
     <w:p>
@@ -1957,7 +1957,7 @@
           <w:sz w:val="19"/>
           <w:szCs w:val="19"/>
         </w:rPr>
-        <w:t xml:space="preserve">The 18 accepted PBE-D3(BJ) labels, ordered by family and gap. μ ± σ is the prediction of the surrogate that selected the framework. "Spin state" is the converged state of the run that provided the label (FM, high-spin ferromagnetic; AFM, antiferromagnetic broken-symmetry solution; NM, non-magnetic low-spin solution); VBM / CBM gives the site group with the largest projected weight within 0.25 eV of each band edge (O</w:t>
+        <w:t xml:space="preserve">The 18 accepted PBE-D3(BJ) labels, ordered by family and gap. μ ± σ is the prediction of the model that selected the framework. "Spin state" is the converged state of the run that provided the label (FM, high spin ferromagnetic; AFM, antiferromagnetic broken symmetry solution; NM, non-magnetic low spin solution); VBM / CBM gives the site group with the largest projected weight within 0.25 eV of each band edge (O</w:t>
       </w:r>
       <w:r>
         <w:rPr>
@@ -1974,7 +1974,7 @@
           <w:sz w:val="19"/>
           <w:szCs w:val="19"/>
         </w:rPr>
-        <w:t xml:space="preserve">, carboxylate oxygen). Complete data, including spin-solution energies and the QMOF gaps of MOF-5 and IRMOF-3, are in Table S11 and Table S12.</w:t>
+        <w:t xml:space="preserve">, carboxylate oxygen). Complete data, including spin solution energies and the QMOF gaps of MOF-5 and IRMOF-3, are in Table S11 and Table S12.</w:t>
       </w:r>
     </w:p>
     <w:tbl>
@@ -9450,7 +9450,7 @@
           <w:sz w:val="19"/>
           <w:szCs w:val="19"/>
         </w:rPr>
-        <w:t xml:space="preserve">Prospective evaluation of the surrogate by iteration. "Labels in training" is the number of DFT labels added to QMOF when the batch was selected; MAE and bias refer to the accepted labels of each batch, predicted by the model that selected them; "within 2σ" counts labels inside twice the predicted uncertainty.</w:t>
+        <w:t xml:space="preserve">Prospective evaluation of the model by iteration. "Labels in training" is the number of DFT labels added to QMOF when the batch was selected; MAE and bias refer to the accepted labels of each batch, predicted by the model that selected them; "within 2σ" counts labels inside twice the predicted uncertainty.</w:t>
       </w:r>
     </w:p>
     <w:tbl>
@@ -11551,7 +11551,7 @@
           <w:sz w:val="17"/>
           <w:szCs w:val="17"/>
         </w:rPr>
-        <w:t xml:space="preserve">O frameworks MAE 0.96 eV (bias −0.96 eV, n = 5, two within 2σ). Core-hours are from the SLURM logs (Grace, 48-core nodes, iteration 0; FASTER, 64-core nodes, iterations 1–2) and include the failed frameworks.</w:t>
+        <w:t xml:space="preserve">O frameworks MAE 0.96 eV (bias −0.96 eV, n = 5, two within 2σ). Core-hours are from the SLURM logs (Grace, 48-core nodes, iteration 0; FASTER, 64-core nodes, iterations 1 and 2) and include the failed frameworks.</w:t>
       </w:r>
     </w:p>
     <w:p>
@@ -11565,7 +11565,7 @@
           <w:sz w:val="22"/>
           <w:szCs w:val="22"/>
         </w:rPr>
-        <w:t xml:space="preserve">Two of the labels are known materials and calibrate the protocol. MOF-5 gives 3.52 eV, within the 3.47–3.55 eV range of its three QMOF entries [9,48], and IRMOF-3 gives 2.51 eV against 2.32–2.37 eV in QMOF, a difference of about 0.15 eV that is within the spread expected from the different starting geometries and the dispersion correction. The spin solutions matter for the paddlewheels (Table S12). For all four Cu</w:t>
+        <w:t xml:space="preserve">Two of the labels are known materials and calibrate the protocol. MOF-5 gives 3.52 eV, within the 3.47 to 3.55 eV range of its three QMOF entries [10,49], and IRMOF-3 gives 2.51 eV against 2.32 to 2.37 eV in QMOF, a difference of about 0.15 eV that is within the spread expected from the different starting geometries and the dispersion correction. The spin solutions matter for the paddlewheels (Table S12). For all four Cu</w:t>
       </w:r>
       <w:r>
         <w:rPr>
@@ -11582,7 +11582,7 @@
           <w:sz w:val="22"/>
           <w:szCs w:val="22"/>
         </w:rPr>
-        <w:t xml:space="preserve"> frameworks the broken-symmetry start converged to an antiferromagnetically coupled Cu</w:t>
+        <w:t xml:space="preserve"> frameworks the broken symmetry start converged to an antiferromagnetically coupled Cu</w:t>
       </w:r>
       <w:r>
         <w:rPr>
@@ -11599,7 +11599,7 @@
           <w:sz w:val="22"/>
           <w:szCs w:val="22"/>
         </w:rPr>
-        <w:t xml:space="preserve"> unit, as in HKUST-1 [49], 0.02–0.45 eV below the ferromagnetic solution, and opened the gap from 0.23–0.27 eV to 0.34–0.90 eV; the ferromagnetic label would have placed all four in the "quasi-metallic" range. For the Co</w:t>
+        <w:t xml:space="preserve"> unit, as in HKUST-1 [50], 0.02 to 0.45 eV below the ferromagnetic solution, and opened the gap from 0.23 to 0.27 eV to 0.34 to 0.90 eV; the ferromagnetic label would have placed all four in the "quasi-metallic" range. For the Co</w:t>
       </w:r>
       <w:r>
         <w:rPr>
@@ -11616,7 +11616,7 @@
           <w:sz w:val="22"/>
           <w:szCs w:val="22"/>
         </w:rPr>
-        <w:t xml:space="preserve"> paddlewheel the broken-symmetry start relaxed to a non-magnetic low-spin state 0.26 eV below the high-spin solution, with a gap of 0.67 eV instead of 0.14 eV, a preference for low spin that PBE is known to exaggerate. For the Fe</w:t>
+        <w:t xml:space="preserve"> paddlewheel the broken symmetry start relaxed to a non-magnetic low spin state 0.26 eV below the high spin solution, with a gap of 0.67 eV instead of 0.14 eV, a preference for low spin that PBE is known to exaggerate. For the Fe</w:t>
       </w:r>
       <w:r>
         <w:rPr>
@@ -11633,7 +11633,7 @@
           <w:sz w:val="22"/>
           <w:szCs w:val="22"/>
         </w:rPr>
-        <w:t xml:space="preserve"> paddlewheels the high-spin ferromagnetic state was lowest by at least 0.8 eV. Every open-shell label in Table 1 is therefore the lowest-energy solution among the spin states tried, and the range of gaps across spin solutions is reported for each framework.</w:t>
+        <w:t xml:space="preserve"> paddlewheels the high spin ferromagnetic state was lowest by at least 0.8 eV. Every open-shell label in Table 1 is therefore the lowest energy solution among the spin states tried, and the range of gaps across spin solutions is reported for each framework.</w:t>
       </w:r>
     </w:p>
     <w:p>
@@ -11665,7 +11665,7 @@
           <w:sz w:val="22"/>
           <w:szCs w:val="22"/>
         </w:rPr>
-        <w:t xml:space="preserve">Fig. 4 arranges the labels by family and Fig. 5 shows the character of the two band edges (Table S14). The 13 open-shell frameworks all have PBE gaps below 1 eV, eight below 0.5 eV, and within each family the gap depends weakly on the linker. The four Co</w:t>
+        <w:t xml:space="preserve">Fig. 4 arranges the labels by family and Fig. 5 shows the character of the two band edges (Table S15). The 13 open-shell frameworks all have PBE gaps below 1 eV, eight below 0.5 eV, and within each family the gap depends weakly on the linker. The four Co</w:t>
       </w:r>
       <w:r>
         <w:rPr>
@@ -11682,7 +11682,7 @@
           <w:sz w:val="22"/>
           <w:szCs w:val="22"/>
         </w:rPr>
-        <w:t xml:space="preserve"> bcu frameworks span 0.33–0.53 eV across the H, NH</w:t>
+        <w:t xml:space="preserve"> bcu frameworks span 0.33 to 0.53 eV across the H, NH</w:t>
       </w:r>
       <w:r>
         <w:rPr>
@@ -11716,7 +11716,7 @@
           <w:sz w:val="22"/>
           <w:szCs w:val="22"/>
         </w:rPr>
-        <w:t xml:space="preserve"> linkers, the two Fe</w:t>
+        <w:t xml:space="preserve"> linkers, and the two Fe</w:t>
       </w:r>
       <w:r>
         <w:rPr>
@@ -11750,7 +11750,7 @@
           <w:sz w:val="22"/>
           <w:szCs w:val="22"/>
         </w:rPr>
-        <w:t xml:space="preserve"> cds frameworks are nearly gapless (0.01–0.07 eV) with F</w:t>
+        <w:t xml:space="preserve"> cds frameworks are nearly gapless (0.01 to 0.07 eV) whatever the linker. In all of them, and in the low spin Co</w:t>
       </w:r>
       <w:r>
         <w:rPr>
@@ -11759,23 +11759,6 @@
           <w:szCs w:val="22"/>
           <w:vertAlign w:val="subscript"/>
         </w:rPr>
-        <w:t xml:space="preserve">4</w:t>
-      </w:r>
-      <w:r>
-        <w:rPr>
-          <w:rFonts w:ascii="Calibri" w:cs="Calibri" w:eastAsia="Calibri" w:hAnsi="Calibri"/>
-          <w:sz w:val="22"/>
-          <w:szCs w:val="22"/>
-        </w:rPr>
-        <w:t xml:space="preserve">, NH</w:t>
-      </w:r>
-      <w:r>
-        <w:rPr>
-          <w:rFonts w:ascii="Calibri" w:cs="Calibri" w:eastAsia="Calibri" w:hAnsi="Calibri"/>
-          <w:sz w:val="22"/>
-          <w:szCs w:val="22"/>
-          <w:vertAlign w:val="subscript"/>
-        </w:rPr>
         <w:t xml:space="preserve">2</w:t>
       </w:r>
       <w:r>
@@ -11784,24 +11767,7 @@
           <w:sz w:val="22"/>
           <w:szCs w:val="22"/>
         </w:rPr>
-        <w:t xml:space="preserve"> or pyridine linkers alike, and the band edges of all of them, as well as of the low-spin Co</w:t>
-      </w:r>
-      <w:r>
-        <w:rPr>
-          <w:rFonts w:ascii="Calibri" w:cs="Calibri" w:eastAsia="Calibri" w:hAnsi="Calibri"/>
-          <w:sz w:val="22"/>
-          <w:szCs w:val="22"/>
-          <w:vertAlign w:val="subscript"/>
-        </w:rPr>
-        <w:t xml:space="preserve">2</w:t>
-      </w:r>
-      <w:r>
-        <w:rPr>
-          <w:rFonts w:ascii="Calibri" w:cs="Calibri" w:eastAsia="Calibri" w:hAnsi="Calibri"/>
-          <w:sz w:val="22"/>
-          <w:szCs w:val="22"/>
-        </w:rPr>
-        <w:t xml:space="preserve"> framework, are metal d states on both sides (0.70–0.92 of the projected weight at the VBM, 0.84–0.92 at the CBM). The gap of these frameworks is a d–d gap of the minority-spin manifold (Fig. 6), set by the ligand field of the carboxylate node and by the metal, and the linker backbone contributes about 0.1 or less of the weight at either edge. This is the DFT counterpart of the surrogate's metal effect, and it explains why the substituent effects the model learned from QMOF are small.</w:t>
+        <w:t xml:space="preserve"> framework, both band edges are metal d states (0.70 to 0.92 of the projected weight at the VBM, 0.84 to 0.92 at the CBM). The gap of these frameworks opens inside the minority spin d manifold (Fig. 6); it is set by the ligand field of the carboxylate node and by the metal, and the linker backbone contributes about 0.1 or less of the weight at either edge. This is the DFT counterpart of the metal effect in the model, and it explains why the substituent effects the model learned from QMOF are small.</w:t>
       </w:r>
     </w:p>
     <w:p>
@@ -11889,7 +11855,7 @@
           <w:sz w:val="19"/>
           <w:szCs w:val="19"/>
         </w:rPr>
-        <w:t xml:space="preserve">O; orange, open-shell 3d) and the prediction μ of the surrogate that selected each framework (open circles), grouped by node family and net. Brackets mark the converged spin state of the paddlewheel labels.</w:t>
+        <w:t xml:space="preserve">O; orange, open-shell 3d) and the prediction μ of the model that selected each framework (open circles), grouped by node family and net. Brackets mark the converged spin state of the paddlewheel labels.</w:t>
       </w:r>
     </w:p>
     <w:p>
@@ -11920,7 +11886,7 @@
           <w:sz w:val="22"/>
           <w:szCs w:val="22"/>
         </w:rPr>
-        <w:t xml:space="preserve"> cds frameworks are the one open-shell family in which the linker reaches the band edges. Their CBM is the Cu d</w:t>
+        <w:t xml:space="preserve"> cds frameworks are the one open-shell family in which the linker reaches the band edges. Their CBM is the antibonding combination of Cu d</w:t>
       </w:r>
       <w:r>
         <w:rPr>
@@ -11937,7 +11903,7 @@
           <w:sz w:val="22"/>
           <w:szCs w:val="22"/>
         </w:rPr>
-        <w:t xml:space="preserve">–carboxylate O antibonding state in all four cases (0.58–0.60 Cu, 0.34–0.36 O), but the VBM changes with the substituent: it is a mixed Cu d / carboxylate O state for the F</w:t>
+        <w:t xml:space="preserve"> and carboxylate O in all four cases (0.58 to 0.60 Cu, 0.34 to 0.36 O), but the VBM changes with the substituent. It is a mixed Cu d and carboxylate O state for the F</w:t>
       </w:r>
       <w:r>
         <w:rPr>
@@ -11971,7 +11937,7 @@
           <w:sz w:val="22"/>
           <w:szCs w:val="22"/>
         </w:rPr>
-        <w:t xml:space="preserve"> and pyridine linkers (gaps 0.34, 0.89 and 0.90 eV) and a linker state for 2-amino-BDC (0.82 of the weight on the backbone, gap 0.69 eV), where the amine lone pair rises above the Cu d manifold, as it does in amino-functionalised Zn and Ti frameworks [50,51].</w:t>
+        <w:t xml:space="preserve"> and pyridine linkers (gaps 0.34, 0.89 and 0.90 eV) and a linker state for 2-amino-BDC (0.82 of the weight on the backbone, gap 0.69 eV), where the amine lone pair rises above the Cu d manifold, as it does in amino functionalised Zn and Ti frameworks [51,52].</w:t>
       </w:r>
     </w:p>
     <w:p>
@@ -12002,7 +11968,7 @@
           <w:sz w:val="22"/>
           <w:szCs w:val="22"/>
         </w:rPr>
-        <w:t xml:space="preserve">O frameworks are the mirror image. Zn contributes 3 % or less to either edge of the four substituted frameworks and 13 % to the VBM of MOF-5; the CBM is the π-antibonding state of the aromatic linker in all five (0.68–0.80 of the weight, the rest on the carboxylate O), and the VBM is a linker state for the four substituted linkers (0.86–0.96) but a carboxylate O state in MOF-5 itself (0.44 carboxylate O, 0.33 linker, 0.10 μ</w:t>
+        <w:t xml:space="preserve">O frameworks are the mirror image. Zn contributes 3 % or less to either edge of the four substituted frameworks and 13 % to the VBM of MOF-5. The CBM is the antibonding π state of the aromatic linker in all five (0.68 to 0.80 of the weight, the rest on the carboxylate O), and the VBM is a linker state for the four substituted linkers (0.86 to 0.96) but a carboxylate O state in MOF-5 itself (0.44 carboxylate O, 0.33 linker, 0.10 μ</w:t>
       </w:r>
       <w:r>
         <w:rPr>
@@ -12019,7 +11985,7 @@
           <w:sz w:val="22"/>
           <w:szCs w:val="22"/>
         </w:rPr>
-        <w:t xml:space="preserve">-O), in agreement with earlier calculations [48]. The substituents therefore act directly on the gap: the amine raises the VBM most (IRMOF-3, 2.51 eV), followed by the bipyridine (2.75 eV) and the pyridine linkers (3.03 and 3.11 eV), against 3.52 eV for MOF-5. The same substituents move the open-shell gaps by 0.2 eV at most. The design rule that follows is simple and testable: the metal node decides whether a three-dimensional carboxylate framework falls below 1 eV at the PBE level, and linker functionalisation is a handle only when the band edges are organic, which is the case for closed-shell nodes and for the amine-functionalised Cu paddlewheel.</w:t>
+        <w:t xml:space="preserve">-O), in agreement with earlier calculations [49]. The same separation, an inert closed-shell Zn node with the frontier states on the organic part, was found for Zn(pyrazole-NDI), where it persists at the PBE0 level and underlies the hopping transport described there [8]. The substituents therefore act directly on the gap: the amine raises the VBM most (IRMOF-3, 2.51 eV), followed by the bipyridine (2.75 eV) and the pyridine linkers (3.03 and 3.11 eV), against 3.52 eV for MOF-5. The same substituents move the Fe and Co gaps by 0.2 eV at most. The rule that follows is simple and testable: the metal node decides whether a three-dimensional carboxylate framework falls below 1 eV at the PBE level, and linker functionalisation is a handle only when the band edges are organic, which is the case for closed-shell nodes and, at the VBM, for the amine functionalised Cu paddlewheel.</w:t>
       </w:r>
     </w:p>
     <w:p>
@@ -12090,7 +12056,7 @@
           <w:sz w:val="19"/>
           <w:szCs w:val="19"/>
         </w:rPr>
-        <w:t xml:space="preserve">Band-edge character of the 18 labels from the site-projected eigenvalues within 0.25 eV of the VBM (left) and CBM (right), both spins, k-weighted and normalised to the projected weight: metal (all orbitals), μ</w:t>
+        <w:t xml:space="preserve">Band edge character of the 18 labels from the site projected eigenvalues within 0.25 eV of the VBM (left) and CBM (right), both spins, k-weighted and normalised to the projected weight: metal (all orbitals), μ</w:t>
       </w:r>
       <w:r>
         <w:rPr>
@@ -12178,7 +12144,7 @@
           <w:sz w:val="19"/>
           <w:szCs w:val="19"/>
         </w:rPr>
-        <w:t xml:space="preserve">Spin-resolved density of states (spin up positive, spin down negative; 0.05 eV Gaussian broadening) of one framework per family, relative to the VBM, with the projections onto the four site groups of Fig. 5; the grey area is the total DOS and the dotted lines mark the VBM and CBM. In the Co and Fe frameworks the gap opens inside the minority-spin d manifold; in MOF-5 and the Cu</w:t>
+        <w:t xml:space="preserve">Spin resolved density of states (spin up positive, spin down negative; 0.05 eV Gaussian broadening) of one framework per family, relative to the VBM, with the projections onto the four site groups of Fig. 5; the grey area is the total DOS and the dotted lines mark the VBM and CBM. In the Co and Fe frameworks the gap opens inside the minority spin d manifold; in MOF-5 and the Cu</w:t>
       </w:r>
       <w:r>
         <w:rPr>
@@ -12213,7 +12179,7 @@
           <w:sz w:val="23"/>
           <w:szCs w:val="23"/>
         </w:rPr>
-        <w:t xml:space="preserve">3.4 What the surrogate got right and wrong, and what the labels changed</w:t>
+        <w:t xml:space="preserve">3.4 What the model got right and wrong, and what the loop changed</w:t>
       </w:r>
     </w:p>
     <w:p>
@@ -12227,7 +12193,7 @@
           <w:sz w:val="22"/>
           <w:szCs w:val="22"/>
         </w:rPr>
-        <w:t xml:space="preserve">Fig. 7 compares every label with the prediction of the model that selected it. For the open-shell frameworks the surrogate is accurate: MAE 0.23 eV, bias +0.09 eV, all 13 within 2σ, and the ranking of families (Fe below Co below Cu) correct. Its one systematic error there is the Fe frameworks, predicted at 0.44–0.58 eV and computed at 0.01–0.07 eV, which PBE without a Hubbard correction renders nearly metallic. For the Zn</w:t>
+        <w:t xml:space="preserve">Fig. 7 compares every label with the prediction of the model that selected it. For the open-shell frameworks the model is accurate: MAE 0.23 eV, bias +0.09 eV, all 13 within 2σ, and the order of the families (Fe below Co below Cu) is right. Its one systematic error there is the Fe frameworks, predicted at 0.44 to 0.58 eV and computed at 0.01 to 0.07 eV, which PBE without a Hubbard correction renders nearly metallic. For the Zn</w:t>
       </w:r>
       <w:r>
         <w:rPr>
@@ -12244,7 +12210,7 @@
           <w:sz w:val="22"/>
           <w:szCs w:val="22"/>
         </w:rPr>
-        <w:t xml:space="preserve">O frameworks the surrogate fails in the same direction five times: predictions of 1.6–2.4 eV against labels of 2.5–3.5 eV, MAE 0.96 eV, with only two of five labels within 2σ. The closed-shell Zn</w:t>
+        <w:t xml:space="preserve">O frameworks the model fails in the same direction five times: predictions of 1.6 to 2.4 eV against labels of 2.5 to 3.5 eV, MAE 0.96 eV, with only two of five labels within 2σ. The closed-shell Zn</w:t>
       </w:r>
       <w:r>
         <w:rPr>
@@ -12261,7 +12227,7 @@
           <w:sz w:val="22"/>
           <w:szCs w:val="22"/>
         </w:rPr>
-        <w:t xml:space="preserve">O frameworks are the most out-of-distribution members of the catalogue (density 0.3–0.6 g cm</w:t>
+        <w:t xml:space="preserve">O frameworks are the most out-of-distribution members of the catalogue (density 0.3 to 0.6 g cm</w:t>
       </w:r>
       <w:r>
         <w:rPr>
@@ -12278,7 +12244,7 @@
           <w:sz w:val="22"/>
           <w:szCs w:val="22"/>
         </w:rPr>
-        <w:t xml:space="preserve">, pore-limiting diameters of 8.5–14.5 Å), and the tree ensemble, which cannot extrapolate, regresses them towards the QMOF mean. The MAE per batch, 0.44, 0.43 and 0.43 eV, is flat across the three iterations because each batch mixed four to five open-shell frameworks with one to two Zn</w:t>
+        <w:t xml:space="preserve">, pore limiting diameters of 8.5 to 14.5 Å), and a tree ensemble, which cannot extrapolate, pulls them towards the QMOF mean. The MAE per batch, 0.44, 0.43 and 0.43 eV, is flat across the three iterations because each batch mixed four to five open-shell frameworks with one to two Zn</w:t>
       </w:r>
       <w:r>
         <w:rPr>
@@ -12295,7 +12261,24 @@
           <w:sz w:val="22"/>
           <w:szCs w:val="22"/>
         </w:rPr>
-        <w:t xml:space="preserve">O references.</w:t>
+        <w:t xml:space="preserve">O references. None of these numbers depends on the six convergence exceptions of Section 2.4: without them the open-shell MAE is 0.24 eV, all seven remaining open-shell labels are below 1 eV, and the Zn</w:t>
+      </w:r>
+      <w:r>
+        <w:rPr>
+          <w:rFonts w:ascii="Calibri" w:cs="Calibri" w:eastAsia="Calibri" w:hAnsi="Calibri"/>
+          <w:sz w:val="22"/>
+          <w:szCs w:val="22"/>
+          <w:vertAlign w:val="subscript"/>
+        </w:rPr>
+        <w:t xml:space="preserve">4</w:t>
+      </w:r>
+      <w:r>
+        <w:rPr>
+          <w:rFonts w:ascii="Calibri" w:cs="Calibri" w:eastAsia="Calibri" w:hAnsi="Calibri"/>
+          <w:sz w:val="22"/>
+          <w:szCs w:val="22"/>
+        </w:rPr>
+        <w:t xml:space="preserve">O MAE is unchanged (Table S14).</w:t>
       </w:r>
     </w:p>
     <w:p>
@@ -12366,7 +12349,7 @@
           <w:sz w:val="19"/>
           <w:szCs w:val="19"/>
         </w:rPr>
-        <w:t xml:space="preserve">Prospective parity plot: the prediction μ ± σ of the surrogate that selected each framework against its accepted PBE-D3(BJ) label. Circles, squares and triangles are iterations 0, 1 and 2; blue, closed-shell Zn</w:t>
+        <w:t xml:space="preserve">Prospective parity plot: the prediction μ ± σ of the model that selected each framework against its accepted PBE-D3(BJ) label. Circles, squares and triangles are iterations 0, 1 and 2; blue, closed-shell Zn</w:t>
       </w:r>
       <w:r>
         <w:rPr>
@@ -12414,7 +12397,7 @@
           <w:sz w:val="22"/>
           <w:szCs w:val="22"/>
         </w:rPr>
-        <w:t xml:space="preserve">O predictions rise by 0.35 eV, to an in-sample error that is still 0.47 eV, and the paired substituent, metal and net trends of Section 3.1 are unchanged. Eighteen points cannot reweight a forest grown on twenty thousand, and nothing in the workflow claimed they would: the acquisition function rewards low predicted gaps and uncertainty, not model improvement. The retrospective benchmark on QMOF makes this separation explicit (Fig. 8, Table S19). At the budget of this work, 23 labels, the acquisition of this work has found 12.5 ± 2.9 structures with gaps below 0.5 eV against 3.6 ± 1.8 for random selection, and recovers 59 % of the ten lowest gaps in the pool against 16 %; the pure-exploitation and lower-confidence-bound variants perform the same within noise, and pure uncertainty sampling finds almost nothing. Over the same 23 labels the MAE on an external out-of-distribution test set improves by 6 meV, and by 16 meV after 53 labels, indistinguishable from random labelling. The loop is a discovery tool, and that is how its value should be stated: at equal DFT cost it returned three to four times more low-gap frameworks than an unguided choice would have, while leaving the surrogate essentially as it was.</w:t>
+        <w:t xml:space="preserve">O predictions rise by 0.35 eV, to an in-sample error that is still 0.47 eV, and the paired substituent, metal and net trends of Section 3.1 are unchanged. Eighteen points cannot reweight a forest grown on twenty thousand, and nothing in the workflow claimed they would: the acquisition rule rewards low predicted gaps and uncertainty, not model improvement. The retrospective benchmark on QMOF separates the two effects (Fig. 8, Table S20). After 27 labels, the number of frameworks selected in this work, the acquisition rule has found 13.3 ± 2.8 structures with gaps below 0.5 eV against 3.6 ± 1.6 for random selection, and it recovers 60 % of the ten lowest gaps in the pool against 17 %. Running the same rule without ever retraining gives 13.3 hits. The greedy and plain lower confidence bound variants give 15.4 and 15.2, a little more, because they ignore the diversity caps that spread each batch over several families, and pure uncertainty sampling finds 1.1. Over the same 27 labels the MAE on an external out-of-distribution test set falls by only 7 meV, and by 17 meV after 59 labels, the same as with random labelling (17 meV). The parts of the loop that worked are therefore the ranking by the initial model and the eligibility rules learned from the DFT failures, which removed the families that collapse; the retraining step added little at this budget. That is how the value of the loop should be stated: at equal DFT cost it returned about 3.7 times more low gap frameworks than an unguided choice would have, and it left the model essentially as it was.</w:t>
       </w:r>
     </w:p>
     <w:p>
@@ -12485,7 +12468,7 @@
           <w:sz w:val="19"/>
           <w:szCs w:val="19"/>
         </w:rPr>
-        <w:t xml:space="preserve">Retrospective active-learning benchmark on QMOF (20 repeats, pools of 150 out-of-distribution structures with the catalogue's chemistry). (a) Labelled structures with PBE gap below 0.5 eV and (b) recall of the ten lowest gaps in the pool versus labels acquired, for six selection strategies; shaded bands are one standard deviation for the acquisition of this work and for random selection. (c) Change of the MAE on a fixed external out-of-distribution test set. The dotted line marks the 23 labels of the prospective campaign.</w:t>
+        <w:t xml:space="preserve">Retrospective active learning benchmark on QMOF (20 repeats, pools of 150 out-of-distribution structures with the catalogue's chemistry, batches of 11, 8, 8 and then 8). (a) Labelled structures with PBE gap below 0.5 eV and (b) recall of the ten lowest gaps in the pool against labels acquired, for six selection strategies; shaded bands are one standard deviation for the acquisition rule of this work and for random selection. (c) Change of the MAE on a fixed external out-of-distribution test set. The dotted line marks the 27 frameworks selected in the prospective campaign.</w:t>
       </w:r>
     </w:p>
     <w:p>
@@ -12503,7 +12486,7 @@
           <w:sz w:val="23"/>
           <w:szCs w:val="23"/>
         </w:rPr>
-        <w:t xml:space="preserve">3.5 Periodic GFN1-xTB as a training-free check</w:t>
+        <w:t xml:space="preserve">3.5 Periodic GFN1-xTB as a check that needs no training data</w:t>
       </w:r>
     </w:p>
     <w:p>
@@ -12517,7 +12500,7 @@
           <w:sz w:val="22"/>
           <w:szCs w:val="22"/>
         </w:rPr>
-        <w:t xml:space="preserve">On the 2,000-structure QMOF subset, periodic GFN1-xTB reproduces the PBE gaps of closed-shell frameworks with an MAE of 0.40 eV and a Spearman correlation of 0.90 (n = 791), but not those of open-shell 3d frameworks (MAE 0.73 eV, ρ = 0.29, n = 1,205), in line with Jose and Walsh [24] (Table S16, Fig. S6). The finite-cluster treatment, which cuts the framework into a neutral fragment, collapses 98 % of the gaps below 0.1 eV irrespective of the chemistry; an earlier version of this work had drawn the conclusion that GFN1-xTB is unusable for MOF band gaps from such clusters, and we report the comparison so that the artefact is not repeated. Against hybrid HSE06 gaps the periodic xTB values are 1.3–1.5 eV too low, as PBE itself is.</w:t>
+        <w:t xml:space="preserve">On the 2,000-structure QMOF subset, periodic GFN1-xTB reproduces the PBE gaps of closed-shell frameworks with an MAE of 0.40 eV and a Spearman correlation of 0.90 (n = 791), but not those of open-shell 3d frameworks (MAE 0.73 eV, ρ = 0.29, n = 1,205), in line with Jose and Walsh [25] (Table S17, Fig. S6). The finite cluster treatment, which cuts the framework into a neutral fragment, collapses 98 % of the gaps below 0.1 eV regardless of the chemistry. An earlier version of this work had concluded from such clusters that GFN1-xTB is unusable for MOF band gaps, and we report the comparison so that the artefact is not repeated. Against hybrid HSE06 gaps the periodic xTB values are 1.3 to 1.5 eV too low, as PBE itself is.</w:t>
       </w:r>
     </w:p>
     <w:p>
@@ -12548,7 +12531,7 @@
           <w:sz w:val="22"/>
           <w:szCs w:val="22"/>
         </w:rPr>
-        <w:t xml:space="preserve">O labels with an MAE of 0.14 eV, where the surrogate erred by 0.96 eV, and it does so without any training data. At the CHGNet geometry, which is available for every candidate at a cost of seconds to minutes, the MAE is 0.23 eV; at the as-assembled PORMAKE geometry it is 0.43 eV, because the compressed bonds of the raw assembly distort the frontier orbitals. The frontier orbitals of xTB also agree with the DFT band edges in character: for all five Zn</w:t>
+        <w:t xml:space="preserve">O labels with an MAE of 0.14 eV, where the model erred by 0.96 eV, and it does so without any training data. At the pre-relaxed geometry, which is available for every candidate at a cost of seconds to minutes, the MAE is 0.23 eV; at the as-assembled PORMAKE geometry it is 0.43 eV, because the compressed bonds of the raw assembly distort the frontier orbitals. The frontier orbitals of xTB also agree with the DFT band edges in character: for all five Zn</w:t>
       </w:r>
       <w:r>
         <w:rPr>
@@ -12565,7 +12548,7 @@
           <w:sz w:val="22"/>
           <w:szCs w:val="22"/>
         </w:rPr>
-        <w:t xml:space="preserve">O frameworks the dominant site group at the HOMO and at the LUMO is the same in both methods, and the linker fraction of the HOMO follows the same order across linkers (Table S18). For the 13 open-shell labels the picture reverses: the spin-restricted xTB gaps have an MAE of 0.52 eV and no rank correlation with the labels, and across the catalogue the xTB and surrogate predictions correlate for the closed-shell frameworks (ρ = 0.59) but not for the open-shell ones (ρ = 0.16). The two estimates are complementary, and the practical rule is to run periodic xTB on CHGNet geometries for every closed-shell candidate before trusting a QMOF-trained surrogate on it, at a cost that is negligible against a single DFT relaxation.</w:t>
+        <w:t xml:space="preserve">O frameworks the dominant site group at the HOMO and at the LUMO is the same in both methods, and the linker fraction of the HOMO follows the same order across linkers (Table S19). For the 13 open-shell labels the picture reverses: the spin restricted xTB gaps have an MAE of 0.52 eV and no rank correlation with the labels, and across the catalogue the xTB and model predictions correlate for the closed-shell frameworks (ρ = 0.59) but not for the open-shell ones (ρ = 0.16). The two estimates complement each other. The practical rule is to run periodic xTB on pre-relaxed geometries for every closed-shell candidate before trusting a QMOF-trained model on it, at a cost that is negligible next to a single DFT relaxation.</w:t>
       </w:r>
     </w:p>
     <w:p>
@@ -12590,7 +12573,7 @@
           <w:sz w:val="19"/>
           <w:szCs w:val="19"/>
         </w:rPr>
-        <w:t xml:space="preserve">Mean absolute error and bias (eV) of the surrogate and of periodic GFN1-xTB at three geometries against the accepted PBE-D3(BJ) labels, by electronic group. The k-mesh supercell row covers the labels whose static k-mesh supercell has at most 700 atoms; the CHGNet row covers the frameworks that had a CHGNet geometry. Per-framework values are in Table S17.</w:t>
+        <w:t xml:space="preserve">Mean absolute error and bias (eV) of the model and of periodic GFN1-xTB at three geometries against the accepted PBE-D3(BJ) labels, by electronic group. The k-mesh supercell row covers the labels whose static k-mesh supercell has at most 700 atoms; the pre-relaxed row covers the frameworks that had a machine-learned pre-relaxed geometry. Per framework values are in Table S18.</w:t>
       </w:r>
     </w:p>
     <w:tbl>
@@ -12769,7 +12752,7 @@
                 <w:sz w:val="17"/>
                 <w:szCs w:val="17"/>
               </w:rPr>
-              <w:t xml:space="preserve">Surrogate μ before DFT</w:t>
+              <w:t xml:space="preserve">Model μ before DFT</w:t>
             </w:r>
           </w:p>
         </w:tc>
@@ -13081,7 +13064,7 @@
                 <w:sz w:val="17"/>
                 <w:szCs w:val="17"/>
               </w:rPr>
-              <w:t xml:space="preserve">GFN1-xTB, CHGNet geometry</w:t>
+              <w:t xml:space="preserve">GFN1-xTB, pre-relaxed geometry (ML potential)</w:t>
             </w:r>
           </w:p>
         </w:tc>
@@ -13332,7 +13315,7 @@
           <w:sz w:val="19"/>
           <w:szCs w:val="19"/>
         </w:rPr>
-        <w:t xml:space="preserve">Surrogate prediction (grey) and periodic GFN1-xTB gap at the DFT geometry (blue) against the accepted PBE-D3(BJ) label for the 18 frameworks; circles, closed-shell Zn</w:t>
+        <w:t xml:space="preserve">Model prediction (grey) and periodic GFN1-xTB gap at the DFT geometry (blue) against the accepted PBE-D3(BJ) label for the 18 frameworks; circles, closed-shell Zn</w:t>
       </w:r>
       <w:r>
         <w:rPr>
@@ -13381,7 +13364,7 @@
           <w:sz w:val="22"/>
           <w:szCs w:val="22"/>
         </w:rPr>
-        <w:t xml:space="preserve">Three limitations bound the conclusions. First, PBE underestimates band gaps and, for open-shell 3d metals without a Hubbard correction, can close them spuriously [52]; the gaps reported here are PBE labels on the QMOF scale, not predictions of measured gaps. The 10,800 QMOF structures with both PBE and HSE06 gaps make the consequence concrete (Table S20, Fig. S7): for open-shell 3d frameworks the HSE06 gap exceeds the PBE gap by 2.2 eV at the median, and only 2 % of the frameworks with a PBE gap below 1 eV keep an HSE06 gap below 1 eV (15 % below 2 eV), against 16 % and 42 % for the other frameworks. A low PBE gap in an open-shell framework is therefore a flag for hybrid-functional follow-up [53], which the low-gap Fe and Co frameworks of Table 1 merit. Second, the labels depend on the spin solution, and only two to three solutions were tried per framework; the Co</w:t>
+        <w:t xml:space="preserve">Four limitations bound the conclusions. First, PBE underestimates band gaps and, for open-shell 3d metals without a Hubbard correction, can close them spuriously [53]; the gaps reported here are PBE labels on the QMOF scale, not predictions of measured gaps. The 10,800 QMOF structures with both PBE and HSE06 gaps make the consequence concrete (Table S21, Fig. S7): for open-shell 3d frameworks the HSE06 gap exceeds the PBE gap by 2.2 eV at the median, and only 2 % of the frameworks with a PBE gap below 1 eV keep an HSE06 gap below 1 eV (15 % below 2 eV), against 16 % and 42 % for the other frameworks. A low PBE gap in an open-shell framework is therefore a flag for hybrid functional follow-up [54], which the low gap Fe and Co frameworks of Table 1 merit. Second, the labels depend on the spin solution. Only two or three solutions were tried per framework, the broken symmetry statics were run on the geometry relaxed in the ferromagnetic state, and the Co</w:t>
       </w:r>
       <w:r>
         <w:rPr>
@@ -13398,7 +13381,7 @@
           <w:sz w:val="22"/>
           <w:szCs w:val="22"/>
         </w:rPr>
-        <w:t xml:space="preserve"> low-spin and the Cu</w:t>
+        <w:t xml:space="preserve"> low spin and Cu</w:t>
       </w:r>
       <w:r>
         <w:rPr>
@@ -13415,7 +13398,7 @@
           <w:sz w:val="22"/>
           <w:szCs w:val="22"/>
         </w:rPr>
-        <w:t xml:space="preserve"> antiferromagnetic labels show that the choice changes the gap by up to 0.5 eV. Third, the statistics are small, 18 labels from a catalogue of 131, and the catalogue covers five nets and 16 nodes; the failure of eight generated node geometries under DFT, in particular of every Mn framework, shows that catalogue size is not the binding constraint, chemical realism of the building blocks is. Apart from MOF-5, IRMOF-3 and IRMOF-10, which the generator reproduces and which are in CoRE MOF [54], the frameworks are hypothetical; their thermodynamic stability and synthesizability were not assessed.</w:t>
+        <w:t xml:space="preserve"> antiferromagnetic labels show that the choice changes the gap by up to 0.5 eV. Third, the statistics are small, 18 labels from a catalogue of 131 that covers five nets and 16 nodes. The failure of eight generated node geometries under DFT, and of every Mn framework, shows that the limiting factor is not the size of the catalogue but the chemical realism of the building blocks. Fourth, apart from MOF-5, IRMOF-3 and IRMOF-10, which the generator reproduces and which are in CoRE MOF [55], the frameworks are hypothetical; their thermodynamic stability and synthesizability were not assessed.</w:t>
       </w:r>
     </w:p>
     <w:p>
@@ -13445,7 +13428,7 @@
           <w:sz w:val="22"/>
           <w:szCs w:val="22"/>
         </w:rPr>
-        <w:t xml:space="preserve">A QMOF-trained ExtraTrees surrogate, coupled to a lower-confidence-bound acquisition with diversity caps and to a DFT protocol with machine-learned pre-relaxation, broken-symmetry spin states and explicit acceptance rules, selected 27 hypothetical three-dimensional MOFs of which 18 gave PBE-D3(BJ) labels. All 13 open-shell frameworks have PBE gaps below 1 eV, which the surrogate predicted to 0.23 eV; the five Zn</w:t>
+        <w:t xml:space="preserve">A QMOF-trained ExtraTrees model, a lower confidence bound acquisition rule with diversity caps, and a DFT protocol with machine-learned pre-relaxation, broken symmetry spin states and explicit acceptance rules selected 27 hypothetical three-dimensional MOFs, of which 18 gave PBE-D3(BJ) labels. All 13 open-shell frameworks have PBE gaps below 1 eV, which the model predicted to 0.23 eV. The five Zn</w:t>
       </w:r>
       <w:r>
         <w:rPr>
@@ -13462,7 +13445,7 @@
           <w:sz w:val="22"/>
           <w:szCs w:val="22"/>
         </w:rPr>
-        <w:t xml:space="preserve">O frameworks were underpredicted by 0.96 eV and the error did not shrink on retraining, a transfer failure that a retrospective benchmark on QMOF confirms: at this budget the loop finds three to four times more low-gap frameworks than random selection but does not improve the model. The band-edge analysis gives the chemical reason and the design rule: in Fe, Co and low-spin Co frameworks both edges are metal d states and the metal fixes a d–d gap that the linker barely moves, whereas in Zn</w:t>
+        <w:t xml:space="preserve">O frameworks were underestimated by 0.96 eV and the error did not shrink on retraining. A retrospective benchmark on QMOF confirms the split: at this budget the loop finds about 3.7 times more low gap frameworks than random selection, through the ranking of the initial model and the eligibility rules learned from the DFT failures, but it does not improve the model. The band edge analysis gives the chemical reason and the design rule. In the Fe and Co frameworks both band edges are metal d states and the metal fixes a d to d gap that the linker barely moves; in the Zn</w:t>
       </w:r>
       <w:r>
         <w:rPr>
@@ -13479,7 +13462,7 @@
           <w:sz w:val="22"/>
           <w:szCs w:val="22"/>
         </w:rPr>
-        <w:t xml:space="preserve">O frameworks both edges are organic and amine or pyridine linkers lower the gap by up to 1 eV, with the Cu</w:t>
+        <w:t xml:space="preserve">O frameworks both edges are organic states and amine or pyridine linkers lower the gap by up to 1 eV; the Cu</w:t>
       </w:r>
       <w:r>
         <w:rPr>
@@ -13496,7 +13479,7 @@
           <w:sz w:val="22"/>
           <w:szCs w:val="22"/>
         </w:rPr>
-        <w:t xml:space="preserve"> paddlewheel in between. Periodic GFN1-xTB on CHGNet geometries reproduces the closed-shell labels within 0.23 eV without training and is the natural check for a data-driven surrogate on hypothetical closed-shell frameworks; for open-shell metals it is not. The catalogue, the labels with every failed framework, and the analysis code are released so that the next loop can start from them rather than from QMOF alone.</w:t>
+        <w:t xml:space="preserve"> paddlewheels, with a Cu and carboxylate CBM and a substituent dependent VBM, sit in between. Periodic GFN1-xTB on pre-relaxed geometries reproduces the closed-shell labels within 0.23 eV without training and is the natural check for a data-driven model on hypothetical closed-shell frameworks; for open-shell metals it is not. The catalogue, the labels with every failed framework, and the analysis code are released so that the next loop can start from them rather than from QMOF alone.</w:t>
       </w:r>
     </w:p>
     <w:p>
@@ -13536,7 +13519,7 @@
           <w:sz w:val="22"/>
           <w:szCs w:val="22"/>
         </w:rPr>
-        <w:t xml:space="preserve"> Conceptualization, Methodology, Software, Investigation, Formal analysis, Data curation, Visualization, Writing – original draft. </w:t>
+        <w:t xml:space="preserve"> Conceptualization, Methodology, Software, Investigation, Formal analysis, Data curation, Visualization, Writing, original draft. </w:t>
       </w:r>
       <w:r>
         <w:rPr>
@@ -13554,7 +13537,7 @@
           <w:sz w:val="22"/>
           <w:szCs w:val="22"/>
         </w:rPr>
-        <w:t xml:space="preserve"> Validation, Writing – review &amp; editing. </w:t>
+        <w:t xml:space="preserve"> Validation, Writing, review and editing. </w:t>
       </w:r>
       <w:r>
         <w:rPr>
@@ -13572,7 +13555,7 @@
           <w:sz w:val="22"/>
           <w:szCs w:val="22"/>
         </w:rPr>
-        <w:t xml:space="preserve"> Conceptualization, Supervision, Resources, Funding acquisition, Writing – review &amp; editing.</w:t>
+        <w:t xml:space="preserve"> Conceptualization, Supervision, Resources, Funding acquisition, Writing, review and editing.</w:t>
       </w:r>
     </w:p>
     <w:p>
@@ -13632,7 +13615,7 @@
           <w:sz w:val="22"/>
           <w:szCs w:val="22"/>
         </w:rPr>
-        <w:t xml:space="preserve">The code, the building-block audit, the catalogue (CIF files, QC tables, descriptors), the surrogate predictions and acquisition rankings of every iteration, the DFT summary tables (dft_results.csv, spin_solutions.csv, compute_log.csv), the band-edge and xTB tables and the scripts that produce every figure are available at https://github.com/humbertogn-coder/MOF_3D_Generator [55]. The raw VASP inputs and outputs (POSCAR, CONTCAR, OSZICAR, OUTCAR, vasprun.xml, DOSCAR; POTCAR files excluded under the VASP licence) and the GFN1-xTB results are deposited on Zenodo [56]. QMOF is available from its original repository [9] and is not redistributed. All random seeds are fixed and the trained models are rebuilt deterministically by the scripts.</w:t>
+        <w:t xml:space="preserve">The code, the building block audit, the catalogue (CIF files, QC tables, descriptors), the model predictions and acquisition rankings of every iteration, the DFT summary tables (dft_results.csv, spin_solutions.csv, compute_log.csv), the band edge and xTB tables and the scripts that produce every figure are available at https://github.com/humbertogn-coder/MOF_3D_Generator [56]. The raw VASP inputs and outputs (POSCAR, CONTCAR, OSZICAR, OUTCAR, vasprun.xml, DOSCAR; POTCAR files excluded under the VASP licence) and the GFN1-xTB results are deposited on Zenodo [57]. QMOF is available from its original repository [10] and is not redistributed. All random seeds are fixed and the trained models are rebuilt deterministically by the scripts.</w:t>
       </w:r>
     </w:p>
     <w:p>
@@ -13722,7 +13705,7 @@
           <w:sz w:val="22"/>
           <w:szCs w:val="22"/>
         </w:rPr>
-        <w:t xml:space="preserve">Supplementary material to this article (Tables S1–S20 and Figures S1–S7) is available online.</w:t>
+        <w:t xml:space="preserve">Supplementary material to this article (Tables S1 to S21 and Figures S1 to S7) is available online.</w:t>
       </w:r>
     </w:p>
     <w:p>
@@ -13784,7 +13767,7 @@
           <w:sz w:val="20"/>
           <w:szCs w:val="20"/>
         </w:rPr>
-        <w:t xml:space="preserve">L. Sun, M.G. Campbell, M. Dincă, Electrically conductive porous metal–organic frameworks, Angew. Chem. Int. Ed. 55 (2016) 3566–3579.</w:t>
+        <w:t xml:space="preserve">L. Sun, M.G. Campbell, M. Dincă, Electrically conductive porous metal-organic frameworks, Angew. Chem. Int. Ed. 55 (2016) 3566–3579.</w:t>
       </w:r>
     </w:p>
     <w:p>
@@ -13807,7 +13790,7 @@
           <w:sz w:val="20"/>
           <w:szCs w:val="20"/>
         </w:rPr>
-        <w:t xml:space="preserve">L.S. Xie, G. Skorupskii, M. Dincă, Electrically conductive metal–organic frameworks, Chem. Rev. 120 (2020) 8536–8580.</w:t>
+        <w:t xml:space="preserve">L.S. Xie, G. Skorupskii, M. Dincă, Electrically conductive metal-organic frameworks, Chem. Rev. 120 (2020) 8536–8580.</w:t>
       </w:r>
     </w:p>
     <w:p>
@@ -13830,7 +13813,7 @@
           <w:sz w:val="20"/>
           <w:szCs w:val="20"/>
         </w:rPr>
-        <w:t xml:space="preserve">R.W. Day, D.K. Bediako, M. Rezaee, L.R. Parent, G. Skorupskii, M.Q. Arguilla, C.H. Hendon, I. Stassen, N.C. Gianneschi, P. Kim, M. Dincă, Single crystals of electrically conductive two-dimensional metal–organic frameworks: structural and electrical transport properties, ACS Cent. Sci. 5 (2019) 1959–1964.</w:t>
+        <w:t xml:space="preserve">R.W. Day, D.K. Bediako, M. Rezaee, L.R. Parent, G. Skorupskii, M.Q. Arguilla, C.H. Hendon, I. Stassen, N.C. Gianneschi, P. Kim, M. Dincă, Single crystals of electrically conductive two-dimensional metal-organic frameworks: structural and electrical transport properties, ACS Cent. Sci. 5 (2019) 1959–1964.</w:t>
       </w:r>
     </w:p>
     <w:p>
@@ -13853,7 +13836,7 @@
           <w:sz w:val="20"/>
           <w:szCs w:val="20"/>
         </w:rPr>
-        <w:t xml:space="preserve">L.S. Xie, L. Sun, R. Wan, S.S. Park, J.A. DeGayner, C.H. Hendon, M. Dincă, Tunable mixed-valence doping toward record electrical conductivity in a three-dimensional metal–organic framework, J. Am. Chem. Soc. 140 (2018) 7411–7414.</w:t>
+        <w:t xml:space="preserve">L.S. Xie, L. Sun, R. Wan, S.S. Park, J.A. DeGayner, C.H. Hendon, M. Dincă, Tunable mixed-valence doping toward record electrical conductivity in a three-dimensional metal-organic framework, J. Am. Chem. Soc. 140 (2018) 7411–7414.</w:t>
       </w:r>
     </w:p>
     <w:p>
@@ -13876,7 +13859,7 @@
           <w:sz w:val="20"/>
           <w:szCs w:val="20"/>
         </w:rPr>
-        <w:t xml:space="preserve">C.H. Hendon, A.J. Rieth, M.D. Korzyński, M. Dincă, Grand challenges and future opportunities for metal–organic frameworks, ACS Cent. Sci. 3 (2017) 554–563.</w:t>
+        <w:t xml:space="preserve">C.H. Hendon, A.J. Rieth, M.D. Korzyński, M. Dincă, Grand challenges and future opportunities for metal-organic frameworks, ACS Cent. Sci. 3 (2017) 554–563.</w:t>
       </w:r>
     </w:p>
     <w:p>
@@ -13899,7 +13882,7 @@
           <w:sz w:val="20"/>
           <w:szCs w:val="20"/>
         </w:rPr>
-        <w:t xml:space="preserve">E.M. Johnson, S. Ilic, A.J. Morris, Design strategies for enhanced conductivity in metal–organic frameworks, ACS Cent. Sci. 7 (2021) 445–453.</w:t>
+        <w:t xml:space="preserve">E.M. Johnson, S. Ilic, A.J. Morris, Design strategies for enhanced conductivity in metal-organic frameworks, ACS Cent. Sci. 7 (2021) 445–453.</w:t>
       </w:r>
     </w:p>
     <w:p>
@@ -13922,7 +13905,7 @@
           <w:sz w:val="20"/>
           <w:szCs w:val="20"/>
         </w:rPr>
-        <w:t xml:space="preserve">F. Zanca, L.T. Glasby, S. Chong, S. Chen, J. Kim, D. Fairen-Jimenez, B. Monserrat, P.Z. Moghadam, Computational techniques for characterisation of electrically conductive MOFs: quantum calculations and machine learning approaches, J. Mater. Chem. C 9 (2021) 13584–13599.</w:t>
+        <w:t xml:space="preserve">A. Avilés, M. Ghotbi, A.J. Ferguson, J.L. Blackburn, A.A. Talin, M.Y. Darensbourg, P.B. Balbuena, Ion-electron coupling-driven redox behavior in metal-organic frameworks, J. Am. Chem. Soc. 148 (2026) 18346–18364.</w:t>
       </w:r>
     </w:p>
     <w:p>
@@ -13945,7 +13928,7 @@
           <w:sz w:val="20"/>
           <w:szCs w:val="20"/>
         </w:rPr>
-        <w:t xml:space="preserve">A.S. Rosen, S.M. Iyer, D. Ray, Z. Yao, A. Aspuru-Guzik, L. Gagliardi, J.M. Notestein, R.Q. Snurr, Machine learning the quantum-chemical properties of metal–organic frameworks for accelerated materials discovery, Matter 4 (2021) 1578–1597.</w:t>
+        <w:t xml:space="preserve">F. Zanca, L.T. Glasby, S. Chong, S. Chen, J. Kim, D. Fairen-Jimenez, B. Monserrat, P.Z. Moghadam, Computational techniques for characterisation of electrically conductive MOFs: quantum calculations and machine learning approaches, J. Mater. Chem. C 9 (2021) 13584–13599.</w:t>
       </w:r>
     </w:p>
     <w:p>
@@ -13968,7 +13951,7 @@
           <w:sz w:val="20"/>
           <w:szCs w:val="20"/>
         </w:rPr>
-        <w:t xml:space="preserve">A.S. Rosen, V. Fung, P. Huck, C.T. O'Donnell, M.K. Horton, D.G. Truhlar, K.A. Persson, J.M. Notestein, R.Q. Snurr, High-throughput predictions of metal–organic framework electronic properties: theoretical challenges, graph neural networks, and data exploration, npj Comput. Mater. 8 (2022) 112.</w:t>
+        <w:t xml:space="preserve">A.S. Rosen, S.M. Iyer, D. Ray, Z. Yao, A. Aspuru-Guzik, L. Gagliardi, J.M. Notestein, R.Q. Snurr, Machine learning the quantum-chemical properties of metal-organic frameworks for accelerated materials discovery, Matter 4 (2021) 1578–1597.</w:t>
       </w:r>
     </w:p>
     <w:p>
@@ -13991,7 +13974,7 @@
           <w:sz w:val="20"/>
           <w:szCs w:val="20"/>
         </w:rPr>
-        <w:t xml:space="preserve">Z. Cao, R. Magar, Y. Wang, A. Barati Farimani, MOFormer: self-supervised transformer model for metal–organic framework property prediction, J. Am. Chem. Soc. 145 (2023) 2958–2967.</w:t>
+        <w:t xml:space="preserve">A.S. Rosen, V. Fung, P. Huck, C.T. O'Donnell, M.K. Horton, D.G. Truhlar, K.A. Persson, J.M. Notestein, R.Q. Snurr, High-throughput predictions of metal-organic framework electronic properties: theoretical challenges, graph neural networks, and data exploration, npj Comput. Mater. 8 (2022) 112.</w:t>
       </w:r>
     </w:p>
     <w:p>
@@ -14014,7 +13997,7 @@
           <w:sz w:val="20"/>
           <w:szCs w:val="20"/>
         </w:rPr>
-        <w:t xml:space="preserve">Y. Kang, H. Park, B. Smit, J. Kim, A multi-modal pre-training transformer for universal transfer learning in metal–organic frameworks, Nat. Mach. Intell. 5 (2023) 309–318.</w:t>
+        <w:t xml:space="preserve">Z. Cao, R. Magar, Y. Wang, A. Barati Farimani, MOFormer: self-supervised transformer model for metal-organic framework property prediction, J. Am. Chem. Soc. 145 (2023) 2958–2967.</w:t>
       </w:r>
     </w:p>
     <w:p>
@@ -14037,7 +14020,7 @@
           <w:sz w:val="20"/>
           <w:szCs w:val="20"/>
         </w:rPr>
-        <w:t xml:space="preserve">J. Park, H. Kim, Y. Kang, Y. Lim, J. Kim, From data to discovery: recent trends of machine learning in metal–organic frameworks, JACS Au 4 (2024) 3727–3743.</w:t>
+        <w:t xml:space="preserve">Y. Kang, H. Park, B. Smit, J. Kim, A multi-modal pre-training transformer for universal transfer learning in metal-organic frameworks, Nat. Mach. Intell. 5 (2023) 309–318.</w:t>
       </w:r>
     </w:p>
     <w:p>
@@ -14060,7 +14043,7 @@
           <w:sz w:val="20"/>
           <w:szCs w:val="20"/>
         </w:rPr>
-        <w:t xml:space="preserve">S. Lee, B. Kim, H. Cho, H. Lee, S.Y. Lee, E.S. Cho, J. Kim, Computational screening of trillions of metal–organic frameworks for high-performance methane storage, ACS Appl. Mater. Interfaces 13 (2021) 23647–23654.</w:t>
+        <w:t xml:space="preserve">J. Park, H. Kim, Y. Kang, Y. Lim, J. Kim, From data to discovery: recent trends of machine learning in metal-organic frameworks, JACS Au 4 (2024) 3727–3743.</w:t>
       </w:r>
     </w:p>
     <w:p>
@@ -14083,7 +14066,7 @@
           <w:sz w:val="20"/>
           <w:szCs w:val="20"/>
         </w:rPr>
-        <w:t xml:space="preserve">T. Lookman, P.V. Balachandran, D. Xue, R. Yuan, Active learning in materials science with emphasis on adaptive sampling using uncertainties for targeted design, npj Comput. Mater. 5 (2019) 21.</w:t>
+        <w:t xml:space="preserve">S. Lee, B. Kim, H. Cho, H. Lee, S.Y. Lee, E.S. Cho, J. Kim, Computational screening of trillions of metal-organic frameworks for high-performance methane storage, ACS Appl. Mater. Interfaces 13 (2021) 23647–23654.</w:t>
       </w:r>
     </w:p>
     <w:p>
@@ -14106,7 +14089,7 @@
           <w:sz w:val="20"/>
           <w:szCs w:val="20"/>
         </w:rPr>
-        <w:t xml:space="preserve">K.M. Jablonka, G.M. Jothiappan, S. Wang, B. Smit, B. Yoo, Bias free multiobjective active learning for materials design and discovery, Nat. Commun. 12 (2021) 2312.</w:t>
+        <w:t xml:space="preserve">T. Lookman, P.V. Balachandran, D. Xue, R. Yuan, Active learning in materials science with emphasis on adaptive sampling using uncertainties for targeted design, npj Comput. Mater. 5 (2019) 21.</w:t>
       </w:r>
     </w:p>
     <w:p>
@@ -14129,7 +14112,7 @@
           <w:sz w:val="20"/>
           <w:szCs w:val="20"/>
         </w:rPr>
-        <w:t xml:space="preserve">A. Sharma, S. Sanvito, Quantum-accurate machine learning potentials for metal-organic frameworks using temperature driven active learning, npj Comput. Mater. 10 (2024) 237.</w:t>
+        <w:t xml:space="preserve">K.M. Jablonka, G.M. Jothiappan, S. Wang, B. Smit, B. Yoo, Bias free multiobjective active learning for materials design and discovery, Nat. Commun. 12 (2021) 2312.</w:t>
       </w:r>
     </w:p>
     <w:p>
@@ -14152,7 +14135,7 @@
           <w:sz w:val="20"/>
           <w:szCs w:val="20"/>
         </w:rPr>
-        <w:t xml:space="preserve">K. Mukherjee, A.W. Dowling, Y.J. Colón, Sequential design of adsorption simulations in metal–organic frameworks, Mol. Syst. Des. Eng. 7 (2022) 248–259.</w:t>
+        <w:t xml:space="preserve">A. Sharma, S. Sanvito, Quantum-accurate machine learning potentials for metal-organic frameworks using temperature driven active learning, npj Comput. Mater. 10 (2024) 237.</w:t>
       </w:r>
     </w:p>
     <w:p>
@@ -14175,7 +14158,7 @@
           <w:sz w:val="20"/>
           <w:szCs w:val="20"/>
         </w:rPr>
-        <w:t xml:space="preserve">A. Jose, E. Devijver, N. Jakse, R. Poloni, Informative training data for efficient property prediction in metal–organic frameworks by active learning, J. Am. Chem. Soc. 146 (2024) 6134–6144.</w:t>
+        <w:t xml:space="preserve">K. Mukherjee, A.W. Dowling, Y.J. Colón, Sequential design of adsorption simulations in metal-organic frameworks, Mol. Syst. Des. Eng. 7 (2022) 248–259.</w:t>
       </w:r>
     </w:p>
     <w:p>
@@ -14198,7 +14181,7 @@
           <w:sz w:val="20"/>
           <w:szCs w:val="20"/>
         </w:rPr>
-        <w:t xml:space="preserve">S. Grimme, C. Bannwarth, P. Shushkov, A robust and accurate tight-binding quantum chemical method for structures, vibrational frequencies, and noncovalent interactions of large molecular systems parametrized for all spd-block elements (Z = 1–86), J. Chem. Theory Comput. 13 (2017) 1989–2009.</w:t>
+        <w:t xml:space="preserve">A. Jose, E. Devijver, N. Jakse, R. Poloni, Informative training data for efficient property prediction in metal-organic frameworks by active learning, J. Am. Chem. Soc. 146 (2024) 6134–6144.</w:t>
       </w:r>
     </w:p>
     <w:p>
@@ -14221,7 +14204,7 @@
           <w:sz w:val="20"/>
           <w:szCs w:val="20"/>
         </w:rPr>
-        <w:t xml:space="preserve">M. Nurhuda, C.C. Perry, M.A. Addicoat, Performance of GFN1-xTB for periodic optimization of metal organic frameworks, Phys. Chem. Chem. Phys. 24 (2022) 10906–10914.</w:t>
+        <w:t xml:space="preserve">S. Grimme, C. Bannwarth, P. Shushkov, A robust and accurate tight-binding quantum chemical method for structures, vibrational frequencies, and noncovalent interactions of large molecular systems parametrized for all spd-block elements (Z = 1–86), J. Chem. Theory Comput. 13 (2017) 1989–2009.</w:t>
       </w:r>
     </w:p>
     <w:p>
@@ -14244,7 +14227,7 @@
           <w:sz w:val="20"/>
           <w:szCs w:val="20"/>
         </w:rPr>
-        <w:t xml:space="preserve">M. Pokora, J. Goclon, J. Margraf, C. Panosetti, A. Samtsevych, P. Paneth, Low-cost periodic calculations of metal-organic frameworks: a GFN1-xTB perspective, ChemPhysChem 26 (2025) e202500081.</w:t>
+        <w:t xml:space="preserve">M. Nurhuda, C.C. Perry, M.A. Addicoat, Performance of GFN1-xTB for periodic optimization of metal organic frameworks, Phys. Chem. Chem. Phys. 24 (2022) 10906–10914.</w:t>
       </w:r>
     </w:p>
     <w:p>
@@ -14267,7 +14250,7 @@
           <w:sz w:val="20"/>
           <w:szCs w:val="20"/>
         </w:rPr>
-        <w:t xml:space="preserve">M. Mahmoudi Gahrouei, N. Vlastos, R. D'Souza, E.C. Odogwu, L. de Sousa Oliveira, Benchmark investigation of SCC-DFTB against standard and hybrid DFT to model electronic properties in two-dimensional MOFs for thermoelectric applications, J. Chem. Theory Comput. 20 (2024) 3976–3992.</w:t>
+        <w:t xml:space="preserve">M. Pokora, J. Goclon, J. Margraf, C. Panosetti, A. Samtsevych, P. Paneth, Low-cost periodic calculations of metal-organic frameworks: a GFN1-xTB perspective, ChemPhysChem 26 (2025) e202500081.</w:t>
       </w:r>
     </w:p>
     <w:p>
@@ -14290,7 +14273,7 @@
           <w:sz w:val="20"/>
           <w:szCs w:val="20"/>
         </w:rPr>
-        <w:t xml:space="preserve">A. Jose, A. Walsh, GFN1-xTB-assisted machine learning for electronic structure screening of metal–organic frameworks, J. Chem. Theory Comput. 22 (2026) 8531–8540.</w:t>
+        <w:t xml:space="preserve">M. Mahmoudi Gahrouei, N. Vlastos, R. D'Souza, E.C. Odogwu, L. de Sousa Oliveira, Benchmark investigation of SCC-DFTB against standard and hybrid DFT to model electronic properties in two-dimensional MOFs for thermoelectric applications, J. Chem. Theory Comput. 20 (2024) 3976–3992.</w:t>
       </w:r>
     </w:p>
     <w:p>
@@ -14313,7 +14296,7 @@
           <w:sz w:val="20"/>
           <w:szCs w:val="20"/>
         </w:rPr>
-        <w:t xml:space="preserve">H. Park, T. Li, A. Jose, S.-J. Shin, A. Walsh, Data-driven design of metal-organic frameworks for photoelectrochemical reactions, ACS Energy Lett. (2026), in press.</w:t>
+        <w:t xml:space="preserve">A. Jose, A. Walsh, GFN1-xTB-assisted machine learning for electronic structure screening of metal-organic frameworks, J. Chem. Theory Comput. 22 (2026) 8531–8540.</w:t>
       </w:r>
     </w:p>
     <w:p>
@@ -14336,7 +14319,7 @@
           <w:sz w:val="20"/>
           <w:szCs w:val="20"/>
         </w:rPr>
-        <w:t xml:space="preserve">T.F. Willems, C.H. Rycroft, M. Kazi, J.C. Meza, M. Haranczyk, Algorithms and tools for high-throughput geometry-based analysis of crystalline porous materials, Microporous Mesoporous Mater. 149 (2012) 134–141.</w:t>
+        <w:t xml:space="preserve">H. Park, T. Li, A. Jose, S.-J. Shin, A. Walsh, Data-driven design of metal-organic frameworks for photoelectrochemical reactions, ACS Energy Lett. (2026), in press.</w:t>
       </w:r>
     </w:p>
     <w:p>
@@ -14359,7 +14342,7 @@
           <w:sz w:val="20"/>
           <w:szCs w:val="20"/>
         </w:rPr>
-        <w:t xml:space="preserve">P. Geurts, D. Ernst, L. Wehenkel, Extremely randomized trees, Mach. Learn. 63 (2006) 3–42.</w:t>
+        <w:t xml:space="preserve">T.F. Willems, C.H. Rycroft, M. Kazi, J.C. Meza, M. Haranczyk, Algorithms and tools for high-throughput geometry-based analysis of crystalline porous materials, Microporous Mesoporous Mater. 149 (2012) 134–141.</w:t>
       </w:r>
     </w:p>
     <w:p>
@@ -14382,7 +14365,7 @@
           <w:sz w:val="20"/>
           <w:szCs w:val="20"/>
         </w:rPr>
-        <w:t xml:space="preserve">F. Pedregosa, G. Varoquaux, A. Gramfort, V. Michel, B. Thirion, O. Grisel, M. Blondel, P. Prettenhofer, R. Weiss, V. Dubourg, J. Vanderplas, A. Passos, D. Cournapeau, M. Brucher, M. Perrot, É. Duchesnay, Scikit-learn: machine learning in Python, J. Mach. Learn. Res. 12 (2011) 2825–2830.</w:t>
+        <w:t xml:space="preserve">P. Geurts, D. Ernst, L. Wehenkel, Extremely randomized trees, Mach. Learn. 63 (2006) 3–42.</w:t>
       </w:r>
     </w:p>
     <w:p>
@@ -14405,7 +14388,7 @@
           <w:sz w:val="20"/>
           <w:szCs w:val="20"/>
         </w:rPr>
-        <w:t xml:space="preserve">J.H. Friedman, Greedy function approximation: a gradient boosting machine, Ann. Stat. 29 (2001) 1189–1232.</w:t>
+        <w:t xml:space="preserve">F. Pedregosa, G. Varoquaux, A. Gramfort, V. Michel, B. Thirion, O. Grisel, M. Blondel, P. Prettenhofer, R. Weiss, V. Dubourg, J. Vanderplas, A. Passos, D. Cournapeau, M. Brucher, M. Perrot, É. Duchesnay, Scikit-learn: machine learning in Python, J. Mach. Learn. Res. 12 (2011) 2825–2830.</w:t>
       </w:r>
     </w:p>
     <w:p>
@@ -14428,7 +14411,7 @@
           <w:sz w:val="20"/>
           <w:szCs w:val="20"/>
         </w:rPr>
-        <w:t xml:space="preserve">T. Chen, C. Guestrin, XGBoost: a scalable tree boosting system, in: Proceedings of the 22nd ACM SIGKDD International Conference on Knowledge Discovery and Data Mining, ACM, San Francisco, 2016, pp. 785–794.</w:t>
+        <w:t xml:space="preserve">J.H. Friedman, Greedy function approximation: a gradient boosting machine, Ann. Stat. 29 (2001) 1189–1232.</w:t>
       </w:r>
     </w:p>
     <w:p>
@@ -14451,7 +14434,7 @@
           <w:sz w:val="20"/>
           <w:szCs w:val="20"/>
         </w:rPr>
-        <w:t xml:space="preserve">G. Ke, Q. Meng, T. Finley, T. Wang, W. Chen, W. Ma, Q. Ye, T.-Y. Liu, LightGBM: a highly efficient gradient boosting decision tree, in: Advances in Neural Information Processing Systems 30, Curran Associates, Long Beach, 2017, pp. 3149–3157.</w:t>
+        <w:t xml:space="preserve">T. Chen, C. Guestrin, XGBoost: a scalable tree boosting system, in: Proceedings of the 22nd ACM SIGKDD International Conference on Knowledge Discovery and Data Mining, ACM, San Francisco, 2016, pp. 785–794.</w:t>
       </w:r>
     </w:p>
     <w:p>
@@ -14474,7 +14457,7 @@
           <w:sz w:val="20"/>
           <w:szCs w:val="20"/>
         </w:rPr>
-        <w:t xml:space="preserve">L. Breiman, Random forests, Mach. Learn. 45 (2001) 5–32.</w:t>
+        <w:t xml:space="preserve">G. Ke, Q. Meng, T. Finley, T. Wang, W. Chen, W. Ma, Q. Ye, T.-Y. Liu, LightGBM: a highly efficient gradient boosting decision tree, in: Advances in Neural Information Processing Systems 30, Curran Associates, Long Beach, 2017, pp. 3149–3157.</w:t>
       </w:r>
     </w:p>
     <w:p>
@@ -14497,7 +14480,7 @@
           <w:sz w:val="20"/>
           <w:szCs w:val="20"/>
         </w:rPr>
-        <w:t xml:space="preserve">S.M. Lundberg, S.-I. Lee, A unified approach to interpreting model predictions, in: Advances in Neural Information Processing Systems 30, Curran Associates, Long Beach, 2017, pp. 4765–4774.</w:t>
+        <w:t xml:space="preserve">L. Breiman, Random forests, Mach. Learn. 45 (2001) 5–32.</w:t>
       </w:r>
     </w:p>
     <w:p>
@@ -14520,7 +14503,7 @@
           <w:sz w:val="20"/>
           <w:szCs w:val="20"/>
         </w:rPr>
-        <w:t xml:space="preserve">B. Lakshminarayanan, A. Pritzel, C. Blundell, Simple and scalable predictive uncertainty estimation using deep ensembles, in: Advances in Neural Information Processing Systems 30, Curran Associates, Long Beach, 2017, pp. 6402–6413.</w:t>
+        <w:t xml:space="preserve">S.M. Lundberg, S.-I. Lee, A unified approach to interpreting model predictions, in: Advances in Neural Information Processing Systems 30, Curran Associates, Long Beach, 2017, pp. 4765–4774.</w:t>
       </w:r>
     </w:p>
     <w:p>
@@ -14543,7 +14526,7 @@
           <w:sz w:val="20"/>
           <w:szCs w:val="20"/>
         </w:rPr>
-        <w:t xml:space="preserve">N. Srinivas, A. Krause, S.M. Kakade, M. Seeger, Gaussian process optimization in the bandit setting: no regret and experimental design, in: Proceedings of the 27th International Conference on Machine Learning, Omnipress, Haifa, 2010, pp. 1015–1022.</w:t>
+        <w:t xml:space="preserve">B. Lakshminarayanan, A. Pritzel, C. Blundell, Simple and scalable predictive uncertainty estimation using deep ensembles, in: Advances in Neural Information Processing Systems 30, Curran Associates, Long Beach, 2017, pp. 6402–6413.</w:t>
       </w:r>
     </w:p>
     <w:p>
@@ -14566,7 +14549,7 @@
           <w:sz w:val="20"/>
           <w:szCs w:val="20"/>
         </w:rPr>
-        <w:t xml:space="preserve">B. Deng, P. Zhong, K. Jun, J. Riebesell, K. Han, C.J. Bartel, G. Ceder, CHGNet as a pretrained universal neural network potential for charge-informed atomistic modelling, Nat. Mach. Intell. 5 (2023) 1031–1041.</w:t>
+        <w:t xml:space="preserve">N. Srinivas, A. Krause, S.M. Kakade, M. Seeger, Gaussian process optimization in the bandit setting: no regret and experimental design, in: Proceedings of the 27th International Conference on Machine Learning, Omnipress, Haifa, 2010, pp. 1015–1022.</w:t>
       </w:r>
     </w:p>
     <w:p>
@@ -14589,7 +14572,7 @@
           <w:sz w:val="20"/>
           <w:szCs w:val="20"/>
         </w:rPr>
-        <w:t xml:space="preserve">G. Kresse, J. Furthmüller, Efficient iterative schemes for ab initio total-energy calculations using a plane-wave basis set, Phys. Rev. B 54 (1996) 11169–11186.</w:t>
+        <w:t xml:space="preserve">B. Deng, P. Zhong, K. Jun, J. Riebesell, K. Han, C.J. Bartel, G. Ceder, CHGNet as a pretrained universal neural network potential for charge-informed atomistic modelling, Nat. Mach. Intell. 5 (2023) 1031–1041.</w:t>
       </w:r>
     </w:p>
     <w:p>
@@ -14612,7 +14595,7 @@
           <w:sz w:val="20"/>
           <w:szCs w:val="20"/>
         </w:rPr>
-        <w:t xml:space="preserve">P.E. Blöchl, Projector augmented-wave method, Phys. Rev. B 50 (1994) 17953–17979.</w:t>
+        <w:t xml:space="preserve">G. Kresse, J. Furthmüller, Efficient iterative schemes for ab initio total-energy calculations using a plane-wave basis set, Phys. Rev. B 54 (1996) 11169–11186.</w:t>
       </w:r>
     </w:p>
     <w:p>
@@ -14635,7 +14618,7 @@
           <w:sz w:val="20"/>
           <w:szCs w:val="20"/>
         </w:rPr>
-        <w:t xml:space="preserve">G. Kresse, D. Joubert, From ultrasoft pseudopotentials to the projector augmented-wave method, Phys. Rev. B 59 (1999) 1758–1775.</w:t>
+        <w:t xml:space="preserve">P.E. Blöchl, Projector augmented-wave method, Phys. Rev. B 50 (1994) 17953–17979.</w:t>
       </w:r>
     </w:p>
     <w:p>
@@ -14658,7 +14641,7 @@
           <w:sz w:val="20"/>
           <w:szCs w:val="20"/>
         </w:rPr>
-        <w:t xml:space="preserve">J.P. Perdew, K. Burke, M. Ernzerhof, Generalized gradient approximation made simple, Phys. Rev. Lett. 77 (1996) 3865–3868.</w:t>
+        <w:t xml:space="preserve">G. Kresse, D. Joubert, From ultrasoft pseudopotentials to the projector augmented-wave method, Phys. Rev. B 59 (1999) 1758–1775.</w:t>
       </w:r>
     </w:p>
     <w:p>
@@ -14681,7 +14664,7 @@
           <w:sz w:val="20"/>
           <w:szCs w:val="20"/>
         </w:rPr>
-        <w:t xml:space="preserve">S. Grimme, J. Antony, S. Ehrlich, H. Krieg, A consistent and accurate ab initio parametrization of density functional dispersion correction (DFT-D) for the 94 elements H–Pu, J. Chem. Phys. 132 (2010) 154104.</w:t>
+        <w:t xml:space="preserve">J.P. Perdew, K. Burke, M. Ernzerhof, Generalized gradient approximation made simple, Phys. Rev. Lett. 77 (1996) 3865–3868.</w:t>
       </w:r>
     </w:p>
     <w:p>
@@ -14704,7 +14687,7 @@
           <w:sz w:val="20"/>
           <w:szCs w:val="20"/>
         </w:rPr>
-        <w:t xml:space="preserve">S. Grimme, S. Ehrlich, L. Goerigk, Effect of the damping function in dispersion corrected density functional theory, J. Comput. Chem. 32 (2011) 1456–1465.</w:t>
+        <w:t xml:space="preserve">S. Grimme, J. Antony, S. Ehrlich, H. Krieg, A consistent and accurate ab initio parametrization of density functional dispersion correction (DFT-D) for the 94 elements H–Pu, J. Chem. Phys. 132 (2010) 154104.</w:t>
       </w:r>
     </w:p>
     <w:p>
@@ -14727,7 +14710,7 @@
           <w:sz w:val="20"/>
           <w:szCs w:val="20"/>
         </w:rPr>
-        <w:t xml:space="preserve">L. Noodleman, Valence bond description of antiferromagnetic coupling in transition metal dimers, J. Chem. Phys. 74 (1981) 5737–5743.</w:t>
+        <w:t xml:space="preserve">S. Grimme, S. Ehrlich, L. Goerigk, Effect of the damping function in dispersion corrected density functional theory, J. Comput. Chem. 32 (2011) 1456–1465.</w:t>
       </w:r>
     </w:p>
     <w:p>
@@ -14750,7 +14733,7 @@
           <w:sz w:val="20"/>
           <w:szCs w:val="20"/>
         </w:rPr>
-        <w:t xml:space="preserve">S.P. Ong, W.D. Richards, A. Jain, G. Hautier, M. Kocher, S. Cholia, D. Gunter, V.L. Chevrier, K.A. Persson, G. Ceder, Python Materials Genomics (pymatgen): a robust, open-source Python library for materials analysis, Comput. Mater. Sci. 68 (2013) 314–319.</w:t>
+        <w:t xml:space="preserve">L. Noodleman, Valence bond description of antiferromagnetic coupling in transition metal dimers, J. Chem. Phys. 74 (1981) 5737–5743.</w:t>
       </w:r>
     </w:p>
     <w:p>
@@ -14773,7 +14756,7 @@
           <w:sz w:val="20"/>
           <w:szCs w:val="20"/>
         </w:rPr>
-        <w:t xml:space="preserve">A.H. Larsen, J.J. Mortensen, J. Blomqvist, I.E. Castelli, R. Christensen, M. Dułak, J. Friis, M.N. Groves, B. Hammer, C. Hargus, E.D. Hermes, P.C. Jennings, P.B. Jensen, J. Kermode, J.R. Kitchin, E.L. Kolsbjerg, J. Kubal, K. Kaasbjerg, S. Lysgaard, J.B. Maronsson, T. Maxson, T. Olsen, L. Pastewka, A. Peterson, C. Rostgaard, J. Schiøtz, O. Schütt, M. Strange, K.S. Thygesen, T. Vegge, L. Vilhelmsen, M. Walter, Z. Zeng, K.W. Jacobsen, The atomic simulation environment—a Python library for working with atoms, J. Phys.: Condens. Matter 29 (2017) 273002.</w:t>
+        <w:t xml:space="preserve">S.P. Ong, W.D. Richards, A. Jain, G. Hautier, M. Kocher, S. Cholia, D. Gunter, V.L. Chevrier, K.A. Persson, G. Ceder, Python Materials Genomics (pymatgen): a robust, open-source Python library for materials analysis, Comput. Mater. Sci. 68 (2013) 314–319.</w:t>
       </w:r>
     </w:p>
     <w:p>
@@ -14796,7 +14779,7 @@
           <w:sz w:val="20"/>
           <w:szCs w:val="20"/>
         </w:rPr>
-        <w:t xml:space="preserve">S. Ehlert, M. Müller, S. Grimme, tblite: light-weight tight-binding framework, version 0.4, https://github.com/tblite/tblite (accessed October 2026).</w:t>
+        <w:t xml:space="preserve">A.H. Larsen, J.J. Mortensen, J. Blomqvist, I.E. Castelli, R. Christensen, M. Dułak, J. Friis, M.N. Groves, B. Hammer, C. Hargus, E.D. Hermes, P.C. Jennings, P.B. Jensen, J. Kermode, J.R. Kitchin, E.L. Kolsbjerg, J. Kubal, K. Kaasbjerg, S. Lysgaard, J.B. Maronsson, T. Maxson, T. Olsen, L. Pastewka, A. Peterson, C. Rostgaard, J. Schiøtz, O. Schütt, M. Strange, K.S. Thygesen, T. Vegge, L. Vilhelmsen, M. Walter, Z. Zeng, K.W. Jacobsen, The atomic simulation environment, a Python library for working with atoms, J. Phys.: Condens. Matter 29 (2017) 273002.</w:t>
       </w:r>
     </w:p>
     <w:p>
@@ -14819,7 +14802,7 @@
           <w:sz w:val="20"/>
           <w:szCs w:val="20"/>
         </w:rPr>
-        <w:t xml:space="preserve">R.S. Mulliken, Electronic population analysis on LCAO–MO molecular wave functions. I, J. Chem. Phys. 23 (1955) 1833–1840.</w:t>
+        <w:t xml:space="preserve">S. Ehlert, M. Müller, S. Grimme, tblite: light-weight tight-binding framework, version 0.4, https://github.com/tblite/tblite (accessed October 2026).</w:t>
       </w:r>
     </w:p>
     <w:p>
@@ -14842,7 +14825,7 @@
           <w:sz w:val="20"/>
           <w:szCs w:val="20"/>
         </w:rPr>
-        <w:t xml:space="preserve">M. Fuentes-Cabrera, D.M. Nicholson, B.G. Sumpter, M. Widom, Electronic structure and properties of isoreticular metal-organic frameworks: the case of M-IRMOF1 (M = Zn, Cd, Be, Mg, and Ca), J. Chem. Phys. 123 (2005) 124713.</w:t>
+        <w:t xml:space="preserve">R.S. Mulliken, Electronic population analysis on LCAO–MO molecular wave functions. I, J. Chem. Phys. 23 (1955) 1833–1840.</w:t>
       </w:r>
     </w:p>
     <w:p>
@@ -14865,6 +14848,29 @@
           <w:sz w:val="20"/>
           <w:szCs w:val="20"/>
         </w:rPr>
+        <w:t xml:space="preserve">M. Fuentes-Cabrera, D.M. Nicholson, B.G. Sumpter, M. Widom, Electronic structure and properties of isoreticular metal-organic frameworks: the case of M-IRMOF1 (M = Zn, Cd, Be, Mg, and Ca), J. Chem. Phys. 123 (2005) 124713.</w:t>
+      </w:r>
+    </w:p>
+    <w:p>
+      <w:pPr>
+        <w:spacing w:after="60" w:line="252"/>
+        <w:ind w:left="480" w:hanging="480"/>
+        <w:jc w:val="left"/>
+      </w:pPr>
+      <w:r>
+        <w:rPr>
+          <w:rFonts w:ascii="Calibri" w:cs="Calibri" w:eastAsia="Calibri" w:hAnsi="Calibri"/>
+          <w:sz w:val="20"/>
+          <w:szCs w:val="20"/>
+        </w:rPr>
+        <w:t xml:space="preserve">[50] </w:t>
+      </w:r>
+      <w:r>
+        <w:rPr>
+          <w:rFonts w:ascii="Calibri" w:cs="Calibri" w:eastAsia="Calibri" w:hAnsi="Calibri"/>
+          <w:sz w:val="20"/>
+          <w:szCs w:val="20"/>
+        </w:rPr>
         <w:t xml:space="preserve">X.X. Zhang, S.S.-Y. Chui, I.D. Williams, Cooperative magnetic behavior in the coordination polymers [Cu</w:t>
       </w:r>
       <w:r>
@@ -14948,7 +14954,7 @@
           <w:sz w:val="20"/>
           <w:szCs w:val="20"/>
         </w:rPr>
-        <w:t xml:space="preserve">[50] </w:t>
+        <w:t xml:space="preserve">[51] </w:t>
       </w:r>
       <w:r>
         <w:rPr>
@@ -14971,7 +14977,7 @@
           <w:sz w:val="20"/>
           <w:szCs w:val="20"/>
         </w:rPr>
-        <w:t xml:space="preserve">[51] </w:t>
+        <w:t xml:space="preserve">[52] </w:t>
       </w:r>
       <w:r>
         <w:rPr>
@@ -14979,7 +14985,7 @@
           <w:sz w:val="20"/>
           <w:szCs w:val="20"/>
         </w:rPr>
-        <w:t xml:space="preserve">C.H. Hendon, D. Tiana, M. Fontecave, C. Sanchez, L. D'arras, C. Sassoye, L. Rozes, C. Mellot-Draznieks, A. Walsh, Engineering the optical response of the titanium-MIL-125 metal–organic framework through ligand functionalization, J. Am. Chem. Soc. 135 (2013) 10942–10945.</w:t>
+        <w:t xml:space="preserve">C.H. Hendon, D. Tiana, M. Fontecave, C. Sanchez, L. D'arras, C. Sassoye, L. Rozes, C. Mellot-Draznieks, A. Walsh, Engineering the optical response of the titanium-MIL-125 metal-organic framework through ligand functionalization, J. Am. Chem. Soc. 135 (2013) 10942–10945.</w:t>
       </w:r>
     </w:p>
     <w:p>
@@ -14994,7 +15000,7 @@
           <w:sz w:val="20"/>
           <w:szCs w:val="20"/>
         </w:rPr>
-        <w:t xml:space="preserve">[52] </w:t>
+        <w:t xml:space="preserve">[53] </w:t>
       </w:r>
       <w:r>
         <w:rPr>
@@ -15017,7 +15023,7 @@
           <w:sz w:val="20"/>
           <w:szCs w:val="20"/>
         </w:rPr>
-        <w:t xml:space="preserve">[53] </w:t>
+        <w:t xml:space="preserve">[54] </w:t>
       </w:r>
       <w:r>
         <w:rPr>
@@ -15040,7 +15046,7 @@
           <w:sz w:val="20"/>
           <w:szCs w:val="20"/>
         </w:rPr>
-        <w:t xml:space="preserve">[54] </w:t>
+        <w:t xml:space="preserve">[55] </w:t>
       </w:r>
       <w:r>
         <w:rPr>
@@ -15048,7 +15054,7 @@
           <w:sz w:val="20"/>
           <w:szCs w:val="20"/>
         </w:rPr>
-        <w:t xml:space="preserve">Y.G. Chung, E. Haldoupis, B.J. Bucior, M. Haranczyk, S. Lee, H. Zhang, K.D. Vogiatzis, M. Milisavljevic, S. Ling, J.S. Camp, B. Slater, J.I. Siepmann, D.S. Sholl, R.Q. Snurr, Advances, updates, and analytics for the computation-ready, experimental metal–organic framework database: CoRE MOF 2019, J. Chem. Eng. Data 64 (2019) 5985–5998.</w:t>
+        <w:t xml:space="preserve">Y.G. Chung, E. Haldoupis, B.J. Bucior, M. Haranczyk, S. Lee, H. Zhang, K.D. Vogiatzis, M. Milisavljevic, S. Ling, J.S. Camp, B. Slater, J.I. Siepmann, D.S. Sholl, R.Q. Snurr, Advances, updates, and analytics for the computation-ready, experimental metal-organic framework database: CoRE MOF 2019, J. Chem. Eng. Data 64 (2019) 5985–5998.</w:t>
       </w:r>
     </w:p>
     <w:p>
@@ -15063,7 +15069,7 @@
           <w:sz w:val="20"/>
           <w:szCs w:val="20"/>
         </w:rPr>
-        <w:t xml:space="preserve">[55] </w:t>
+        <w:t xml:space="preserve">[56] </w:t>
       </w:r>
       <w:r>
         <w:rPr>
@@ -15086,7 +15092,7 @@
           <w:sz w:val="20"/>
           <w:szCs w:val="20"/>
         </w:rPr>
-        <w:t xml:space="preserve">[56] </w:t>
+        <w:t xml:space="preserve">[57] </w:t>
       </w:r>
       <w:r>
         <w:rPr>
@@ -15094,7 +15100,7 @@
           <w:sz w:val="20"/>
           <w:szCs w:val="20"/>
         </w:rPr>
-        <w:t xml:space="preserve">C.H. Guerrero Navarro, M. Ghotbi, P.B. Balbuena, Active learning for low-band-gap 3D metal–organic frameworks: code, catalogue, DFT outputs and analysis tables, Zenodo (2026). https://doi.org/10.5281/zenodo.XXXXXXX (DOI to be minted on acceptance).</w:t>
+        <w:t xml:space="preserve">C.H. Guerrero Navarro, M. Ghotbi, P.B. Balbuena, Active learning for low-band-gap 3D metal-organic frameworks: code, catalogue, DFT outputs and analysis tables, Zenodo (2026). https://doi.org/10.5281/zenodo.XXXXXXX (DOI to be minted on acceptance).</w:t>
       </w:r>
     </w:p>
     <w:sectPr>

</xml_diff>

<commit_message>
Structure figures (Fig. 4 and Fig. S5) drawn from the CIF/POSCAR files; manuscript v4.2
Co-Authored-By: Claude Fable 5.1 <noreply@anthropic.com>
Claude-Session: https://claude.ai/code/session_01CHatVnxyd3V14ULDrJwBF5
</commit_message>
<xml_diff>
--- a/manuscript/Active_learning_MOF_discovery_v4.docx
+++ b/manuscript/Active_learning_MOF_discovery_v4.docx
@@ -1762,7 +1762,7 @@
           <w:sz w:val="22"/>
           <w:szCs w:val="22"/>
         </w:rPr>
-        <w:t xml:space="preserve">Twenty-seven frameworks were computed in three iterations for a total of 24,600 core-hours (Table 1, Table 2, Table S16). Eighteen gave accepted labels; nine did not, and their fate is part of the result (Table S13). Five frameworks collapsed or sheared: the two trinuclear Mn</w:t>
+        <w:t xml:space="preserve">Twenty-seven frameworks were computed in three iterations for a total of 24,600 core-hours (Table 1, Table 2, Table S16). Eighteen gave accepted labels; nine did not, and their fate is part of the result (Table S13). Fig. 4 shows one relaxed framework per family that gave labels, and two of the frameworks that did not survive; all 18 labelled frameworks are drawn in Fig. S5. Five frameworks collapsed or sheared: the two trinuclear Mn</w:t>
       </w:r>
       <w:r>
         <w:rPr>
@@ -1933,6 +1933,196 @@
           <w:szCs w:val="22"/>
         </w:rPr>
         <w:t xml:space="preserve"> framework with the amine linker whose relaxation was still lowering its energy at the walltime. These outcomes defined the eligibility rules of the following iterations, and they cost 11,900 core-hours, half of the total, two thirds of it in the 24 h relaxations of iteration 0 that preceded the pre-relaxation step. No Mn framework survived, so the open-shell results concern Fe, Co and Cu.</w:t>
+      </w:r>
+    </w:p>
+    <w:p>
+      <w:pPr>
+        <w:keepNext/>
+        <w:spacing w:after="60" w:before="200"/>
+        <w:jc w:val="center"/>
+      </w:pPr>
+      <w:r>
+        <w:drawing>
+          <wp:inline distT="0" distB="0" distL="0" distR="0">
+            <wp:extent cx="5943600" cy="2638425"/>
+            <wp:effectExtent t="0" r="0" b="0" l="0"/>
+            <wp:docPr id="1" name="" descr="" title=""/>
+            <wp:cNvGraphicFramePr>
+              <a:graphicFrameLocks xmlns:a="http://schemas.openxmlformats.org/drawingml/2006/main" noChangeAspect="1"/>
+            </wp:cNvGraphicFramePr>
+            <a:graphic xmlns:a="http://schemas.openxmlformats.org/drawingml/2006/main">
+              <a:graphicData uri="http://schemas.openxmlformats.org/drawingml/2006/picture">
+                <pic:pic xmlns:pic="http://schemas.openxmlformats.org/drawingml/2006/picture">
+                  <pic:nvPicPr>
+                    <pic:cNvPr id="0" name="" descr=""/>
+                    <pic:cNvPicPr>
+                      <a:picLocks noChangeAspect="1" noChangeArrowheads="1"/>
+                    </pic:cNvPicPr>
+                  </pic:nvPicPr>
+                  <pic:blipFill>
+                    <a:blip r:embed="rId10" cstate="none"/>
+                    <a:srcRect/>
+                    <a:stretch>
+                      <a:fillRect/>
+                    </a:stretch>
+                  </pic:blipFill>
+                  <pic:spPr bwMode="auto">
+                    <a:xfrm>
+                      <a:off x="0" y="0"/>
+                      <a:ext cx="5943600" cy="2638425"/>
+                    </a:xfrm>
+                    <a:prstGeom prst="rect">
+                      <a:avLst/>
+                    </a:prstGeom>
+                  </pic:spPr>
+                </pic:pic>
+              </a:graphicData>
+            </a:graphic>
+          </wp:inline>
+        </w:drawing>
+      </w:r>
+    </w:p>
+    <w:p>
+      <w:pPr>
+        <w:spacing w:after="240" w:line="252"/>
+        <w:jc w:val="both"/>
+      </w:pPr>
+      <w:r>
+        <w:rPr>
+          <w:rFonts w:ascii="Calibri" w:cs="Calibri" w:eastAsia="Calibri" w:hAnsi="Calibri"/>
+          <w:b/>
+          <w:bCs/>
+          <w:sz w:val="19"/>
+          <w:szCs w:val="19"/>
+        </w:rPr>
+        <w:t xml:space="preserve">Figure 4. </w:t>
+      </w:r>
+      <w:r>
+        <w:rPr>
+          <w:rFonts w:ascii="Calibri" w:cs="Calibri" w:eastAsia="Calibri" w:hAnsi="Calibri"/>
+          <w:sz w:val="19"/>
+          <w:szCs w:val="19"/>
+        </w:rPr>
+        <w:t xml:space="preserve">Relaxed structures. (a to f) One DFT-relaxed framework per family that gave labels, the same six as Fig. 7, with the PBE-D3(BJ) gap: MOF-5, the Co</w:t>
+      </w:r>
+      <w:r>
+        <w:rPr>
+          <w:rFonts w:ascii="Calibri" w:cs="Calibri" w:eastAsia="Calibri" w:hAnsi="Calibri"/>
+          <w:sz w:val="19"/>
+          <w:szCs w:val="19"/>
+          <w:vertAlign w:val="subscript"/>
+        </w:rPr>
+        <w:t xml:space="preserve">4</w:t>
+      </w:r>
+      <w:r>
+        <w:rPr>
+          <w:rFonts w:ascii="Calibri" w:cs="Calibri" w:eastAsia="Calibri" w:hAnsi="Calibri"/>
+          <w:sz w:val="19"/>
+          <w:szCs w:val="19"/>
+        </w:rPr>
+        <w:t xml:space="preserve"> and Fe</w:t>
+      </w:r>
+      <w:r>
+        <w:rPr>
+          <w:rFonts w:ascii="Calibri" w:cs="Calibri" w:eastAsia="Calibri" w:hAnsi="Calibri"/>
+          <w:sz w:val="19"/>
+          <w:szCs w:val="19"/>
+          <w:vertAlign w:val="subscript"/>
+        </w:rPr>
+        <w:t xml:space="preserve">4</w:t>
+      </w:r>
+      <w:r>
+        <w:rPr>
+          <w:rFonts w:ascii="Calibri" w:cs="Calibri" w:eastAsia="Calibri" w:hAnsi="Calibri"/>
+          <w:sz w:val="19"/>
+          <w:szCs w:val="19"/>
+        </w:rPr>
+        <w:t xml:space="preserve"> bcu frameworks and the Cu</w:t>
+      </w:r>
+      <w:r>
+        <w:rPr>
+          <w:rFonts w:ascii="Calibri" w:cs="Calibri" w:eastAsia="Calibri" w:hAnsi="Calibri"/>
+          <w:sz w:val="19"/>
+          <w:szCs w:val="19"/>
+          <w:vertAlign w:val="subscript"/>
+        </w:rPr>
+        <w:t xml:space="preserve">2</w:t>
+      </w:r>
+      <w:r>
+        <w:rPr>
+          <w:rFonts w:ascii="Calibri" w:cs="Calibri" w:eastAsia="Calibri" w:hAnsi="Calibri"/>
+          <w:sz w:val="19"/>
+          <w:szCs w:val="19"/>
+        </w:rPr>
+        <w:t xml:space="preserve">, Co</w:t>
+      </w:r>
+      <w:r>
+        <w:rPr>
+          <w:rFonts w:ascii="Calibri" w:cs="Calibri" w:eastAsia="Calibri" w:hAnsi="Calibri"/>
+          <w:sz w:val="19"/>
+          <w:szCs w:val="19"/>
+          <w:vertAlign w:val="subscript"/>
+        </w:rPr>
+        <w:t xml:space="preserve">2</w:t>
+      </w:r>
+      <w:r>
+        <w:rPr>
+          <w:rFonts w:ascii="Calibri" w:cs="Calibri" w:eastAsia="Calibri" w:hAnsi="Calibri"/>
+          <w:sz w:val="19"/>
+          <w:szCs w:val="19"/>
+        </w:rPr>
+        <w:t xml:space="preserve"> and Fe</w:t>
+      </w:r>
+      <w:r>
+        <w:rPr>
+          <w:rFonts w:ascii="Calibri" w:cs="Calibri" w:eastAsia="Calibri" w:hAnsi="Calibri"/>
+          <w:sz w:val="19"/>
+          <w:szCs w:val="19"/>
+          <w:vertAlign w:val="subscript"/>
+        </w:rPr>
+        <w:t xml:space="preserve">2</w:t>
+      </w:r>
+      <w:r>
+        <w:rPr>
+          <w:rFonts w:ascii="Calibri" w:cs="Calibri" w:eastAsia="Calibri" w:hAnsi="Calibri"/>
+          <w:sz w:val="19"/>
+          <w:szCs w:val="19"/>
+        </w:rPr>
+        <w:t xml:space="preserve"> paddlewheel cds frameworks. (g to j) Two frameworks that collapsed: the trinuclear Mn</w:t>
+      </w:r>
+      <w:r>
+        <w:rPr>
+          <w:rFonts w:ascii="Calibri" w:cs="Calibri" w:eastAsia="Calibri" w:hAnsi="Calibri"/>
+          <w:sz w:val="19"/>
+          <w:szCs w:val="19"/>
+          <w:vertAlign w:val="subscript"/>
+        </w:rPr>
+        <w:t xml:space="preserve">3</w:t>
+      </w:r>
+      <w:r>
+        <w:rPr>
+          <w:rFonts w:ascii="Calibri" w:cs="Calibri" w:eastAsia="Calibri" w:hAnsi="Calibri"/>
+          <w:sz w:val="19"/>
+          <w:szCs w:val="19"/>
+        </w:rPr>
+        <w:t xml:space="preserve"> pcu framework as generated (g) and after the DFT relaxation (h), and the Mn</w:t>
+      </w:r>
+      <w:r>
+        <w:rPr>
+          <w:rFonts w:ascii="Calibri" w:cs="Calibri" w:eastAsia="Calibri" w:hAnsi="Calibri"/>
+          <w:sz w:val="19"/>
+          <w:szCs w:val="19"/>
+          <w:vertAlign w:val="subscript"/>
+        </w:rPr>
+        <w:t xml:space="preserve">2</w:t>
+      </w:r>
+      <w:r>
+        <w:rPr>
+          <w:rFonts w:ascii="Calibri" w:cs="Calibri" w:eastAsia="Calibri" w:hAnsi="Calibri"/>
+          <w:sz w:val="19"/>
+          <w:szCs w:val="19"/>
+        </w:rPr>
+        <w:t xml:space="preserve"> cds framework as generated (i) and after 126 ionic steps (j). Hydrogens are omitted; each panel shows a block 1.6 cells wide and one cell deep.</w:t>
       </w:r>
     </w:p>
     <w:p>
@@ -8603,7 +8793,7 @@
                 <w:sz w:val="17"/>
                 <w:szCs w:val="17"/>
               </w:rPr>
-              <w:t xml:space="preserve">NM (low spin)</w:t>
+              <w:t xml:space="preserve">NM</w:t>
             </w:r>
           </w:p>
         </w:tc>
@@ -11665,7 +11855,7 @@
           <w:sz w:val="22"/>
           <w:szCs w:val="22"/>
         </w:rPr>
-        <w:t xml:space="preserve">Fig. 4 arranges the labels by family and Fig. 5 shows the character of the two band edges (Table S15). The 13 open-shell frameworks all have PBE gaps below 1 eV, eight below 0.5 eV, and within each family the gap depends weakly on the linker. The four Co</w:t>
+        <w:t xml:space="preserve">Fig. 5 arranges the labels by family and Fig. 6 shows the character of the two band edges (Table S15). The 13 open-shell frameworks all have PBE gaps below 1 eV, eight below 0.5 eV, and within each family the gap depends weakly on the linker. The four Co</w:t>
       </w:r>
       <w:r>
         <w:rPr>
@@ -11767,7 +11957,7 @@
           <w:sz w:val="22"/>
           <w:szCs w:val="22"/>
         </w:rPr>
-        <w:t xml:space="preserve"> framework, both band edges are metal d states (0.70 to 0.92 of the projected weight at the VBM, 0.84 to 0.92 at the CBM). The gap of these frameworks opens inside the minority spin d manifold (Fig. 6); it is set by the ligand field of the carboxylate node and by the metal, and the linker backbone contributes about 0.1 or less of the weight at either edge. This is the DFT counterpart of the metal effect in the model, and it explains why the substituent effects the model learned from QMOF are small.</w:t>
+        <w:t xml:space="preserve"> framework, both band edges are metal d states (0.70 to 0.92 of the projected weight at the VBM, 0.84 to 0.92 at the CBM). The gap of these frameworks opens inside the minority spin d manifold (Fig. 7); it is set by the ligand field of the carboxylate node and by the metal, and the linker backbone contributes about 0.1 or less of the weight at either edge. This is the DFT counterpart of the metal effect in the model, and it explains why the substituent effects the model learned from QMOF are small.</w:t>
       </w:r>
     </w:p>
     <w:p>
@@ -11780,224 +11970,6 @@
         <w:drawing>
           <wp:inline distT="0" distB="0" distL="0" distR="0">
             <wp:extent cx="3600450" cy="2714625"/>
-            <wp:effectExtent t="0" r="0" b="0" l="0"/>
-            <wp:docPr id="1" name="" descr="" title=""/>
-            <wp:cNvGraphicFramePr>
-              <a:graphicFrameLocks xmlns:a="http://schemas.openxmlformats.org/drawingml/2006/main" noChangeAspect="1"/>
-            </wp:cNvGraphicFramePr>
-            <a:graphic xmlns:a="http://schemas.openxmlformats.org/drawingml/2006/main">
-              <a:graphicData uri="http://schemas.openxmlformats.org/drawingml/2006/picture">
-                <pic:pic xmlns:pic="http://schemas.openxmlformats.org/drawingml/2006/picture">
-                  <pic:nvPicPr>
-                    <pic:cNvPr id="0" name="" descr=""/>
-                    <pic:cNvPicPr>
-                      <a:picLocks noChangeAspect="1" noChangeArrowheads="1"/>
-                    </pic:cNvPicPr>
-                  </pic:nvPicPr>
-                  <pic:blipFill>
-                    <a:blip r:embed="rId10" cstate="none"/>
-                    <a:srcRect/>
-                    <a:stretch>
-                      <a:fillRect/>
-                    </a:stretch>
-                  </pic:blipFill>
-                  <pic:spPr bwMode="auto">
-                    <a:xfrm>
-                      <a:off x="0" y="0"/>
-                      <a:ext cx="3600450" cy="2714625"/>
-                    </a:xfrm>
-                    <a:prstGeom prst="rect">
-                      <a:avLst/>
-                    </a:prstGeom>
-                  </pic:spPr>
-                </pic:pic>
-              </a:graphicData>
-            </a:graphic>
-          </wp:inline>
-        </w:drawing>
-      </w:r>
-    </w:p>
-    <w:p>
-      <w:pPr>
-        <w:spacing w:after="240" w:line="252"/>
-        <w:jc w:val="both"/>
-      </w:pPr>
-      <w:r>
-        <w:rPr>
-          <w:rFonts w:ascii="Calibri" w:cs="Calibri" w:eastAsia="Calibri" w:hAnsi="Calibri"/>
-          <w:b/>
-          <w:bCs/>
-          <w:sz w:val="19"/>
-          <w:szCs w:val="19"/>
-        </w:rPr>
-        <w:t xml:space="preserve">Figure 4. </w:t>
-      </w:r>
-      <w:r>
-        <w:rPr>
-          <w:rFonts w:ascii="Calibri" w:cs="Calibri" w:eastAsia="Calibri" w:hAnsi="Calibri"/>
-          <w:sz w:val="19"/>
-          <w:szCs w:val="19"/>
-        </w:rPr>
-        <w:t xml:space="preserve">PBE-D3(BJ) band gaps of the 18 accepted labels (filled circles; blue, closed-shell Zn</w:t>
-      </w:r>
-      <w:r>
-        <w:rPr>
-          <w:rFonts w:ascii="Calibri" w:cs="Calibri" w:eastAsia="Calibri" w:hAnsi="Calibri"/>
-          <w:sz w:val="19"/>
-          <w:szCs w:val="19"/>
-          <w:vertAlign w:val="subscript"/>
-        </w:rPr>
-        <w:t xml:space="preserve">4</w:t>
-      </w:r>
-      <w:r>
-        <w:rPr>
-          <w:rFonts w:ascii="Calibri" w:cs="Calibri" w:eastAsia="Calibri" w:hAnsi="Calibri"/>
-          <w:sz w:val="19"/>
-          <w:szCs w:val="19"/>
-        </w:rPr>
-        <w:t xml:space="preserve">O; orange, open-shell 3d) and the prediction μ of the model that selected each framework (open circles), grouped by node family and net. Brackets mark the converged spin state of the paddlewheel labels.</w:t>
-      </w:r>
-    </w:p>
-    <w:p>
-      <w:pPr>
-        <w:spacing w:after="120" w:line="276"/>
-        <w:jc w:val="both"/>
-      </w:pPr>
-      <w:r>
-        <w:rPr>
-          <w:rFonts w:ascii="Calibri" w:cs="Calibri" w:eastAsia="Calibri" w:hAnsi="Calibri"/>
-          <w:sz w:val="22"/>
-          <w:szCs w:val="22"/>
-        </w:rPr>
-        <w:t xml:space="preserve">The Cu</w:t>
-      </w:r>
-      <w:r>
-        <w:rPr>
-          <w:rFonts w:ascii="Calibri" w:cs="Calibri" w:eastAsia="Calibri" w:hAnsi="Calibri"/>
-          <w:sz w:val="22"/>
-          <w:szCs w:val="22"/>
-          <w:vertAlign w:val="subscript"/>
-        </w:rPr>
-        <w:t xml:space="preserve">2</w:t>
-      </w:r>
-      <w:r>
-        <w:rPr>
-          <w:rFonts w:ascii="Calibri" w:cs="Calibri" w:eastAsia="Calibri" w:hAnsi="Calibri"/>
-          <w:sz w:val="22"/>
-          <w:szCs w:val="22"/>
-        </w:rPr>
-        <w:t xml:space="preserve"> cds frameworks are the one open-shell family in which the linker reaches the band edges. Their CBM is the antibonding combination of Cu d</w:t>
-      </w:r>
-      <w:r>
-        <w:rPr>
-          <w:rFonts w:ascii="Calibri" w:cs="Calibri" w:eastAsia="Calibri" w:hAnsi="Calibri"/>
-          <w:sz w:val="22"/>
-          <w:szCs w:val="22"/>
-          <w:vertAlign w:val="subscript"/>
-        </w:rPr>
-        <w:t xml:space="preserve">x²−y²</w:t>
-      </w:r>
-      <w:r>
-        <w:rPr>
-          <w:rFonts w:ascii="Calibri" w:cs="Calibri" w:eastAsia="Calibri" w:hAnsi="Calibri"/>
-          <w:sz w:val="22"/>
-          <w:szCs w:val="22"/>
-        </w:rPr>
-        <w:t xml:space="preserve"> and carboxylate O in all four cases (0.58 to 0.60 Cu, 0.34 to 0.36 O), but the VBM changes with the substituent. It is a mixed Cu d and carboxylate O state for the F</w:t>
-      </w:r>
-      <w:r>
-        <w:rPr>
-          <w:rFonts w:ascii="Calibri" w:cs="Calibri" w:eastAsia="Calibri" w:hAnsi="Calibri"/>
-          <w:sz w:val="22"/>
-          <w:szCs w:val="22"/>
-          <w:vertAlign w:val="subscript"/>
-        </w:rPr>
-        <w:t xml:space="preserve">4</w:t>
-      </w:r>
-      <w:r>
-        <w:rPr>
-          <w:rFonts w:ascii="Calibri" w:cs="Calibri" w:eastAsia="Calibri" w:hAnsi="Calibri"/>
-          <w:sz w:val="22"/>
-          <w:szCs w:val="22"/>
-        </w:rPr>
-        <w:t xml:space="preserve">, F</w:t>
-      </w:r>
-      <w:r>
-        <w:rPr>
-          <w:rFonts w:ascii="Calibri" w:cs="Calibri" w:eastAsia="Calibri" w:hAnsi="Calibri"/>
-          <w:sz w:val="22"/>
-          <w:szCs w:val="22"/>
-          <w:vertAlign w:val="subscript"/>
-        </w:rPr>
-        <w:t xml:space="preserve">8</w:t>
-      </w:r>
-      <w:r>
-        <w:rPr>
-          <w:rFonts w:ascii="Calibri" w:cs="Calibri" w:eastAsia="Calibri" w:hAnsi="Calibri"/>
-          <w:sz w:val="22"/>
-          <w:szCs w:val="22"/>
-        </w:rPr>
-        <w:t xml:space="preserve"> and pyridine linkers (gaps 0.34, 0.89 and 0.90 eV) and a linker state for 2-amino-BDC (0.82 of the weight on the backbone, gap 0.69 eV), where the amine lone pair rises above the Cu d manifold, as it does in amino functionalised Zn and Ti frameworks [51,52].</w:t>
-      </w:r>
-    </w:p>
-    <w:p>
-      <w:pPr>
-        <w:spacing w:after="120" w:line="276"/>
-        <w:jc w:val="both"/>
-      </w:pPr>
-      <w:r>
-        <w:rPr>
-          <w:rFonts w:ascii="Calibri" w:cs="Calibri" w:eastAsia="Calibri" w:hAnsi="Calibri"/>
-          <w:sz w:val="22"/>
-          <w:szCs w:val="22"/>
-        </w:rPr>
-        <w:t xml:space="preserve">The Zn</w:t>
-      </w:r>
-      <w:r>
-        <w:rPr>
-          <w:rFonts w:ascii="Calibri" w:cs="Calibri" w:eastAsia="Calibri" w:hAnsi="Calibri"/>
-          <w:sz w:val="22"/>
-          <w:szCs w:val="22"/>
-          <w:vertAlign w:val="subscript"/>
-        </w:rPr>
-        <w:t xml:space="preserve">4</w:t>
-      </w:r>
-      <w:r>
-        <w:rPr>
-          <w:rFonts w:ascii="Calibri" w:cs="Calibri" w:eastAsia="Calibri" w:hAnsi="Calibri"/>
-          <w:sz w:val="22"/>
-          <w:szCs w:val="22"/>
-        </w:rPr>
-        <w:t xml:space="preserve">O frameworks are the mirror image. Zn contributes 3 % or less to either edge of the four substituted frameworks and 13 % to the VBM of MOF-5. The CBM is the antibonding π state of the aromatic linker in all five (0.68 to 0.80 of the weight, the rest on the carboxylate O), and the VBM is a linker state for the four substituted linkers (0.86 to 0.96) but a carboxylate O state in MOF-5 itself (0.44 carboxylate O, 0.33 linker, 0.10 μ</w:t>
-      </w:r>
-      <w:r>
-        <w:rPr>
-          <w:rFonts w:ascii="Calibri" w:cs="Calibri" w:eastAsia="Calibri" w:hAnsi="Calibri"/>
-          <w:sz w:val="22"/>
-          <w:szCs w:val="22"/>
-          <w:vertAlign w:val="subscript"/>
-        </w:rPr>
-        <w:t xml:space="preserve">4</w:t>
-      </w:r>
-      <w:r>
-        <w:rPr>
-          <w:rFonts w:ascii="Calibri" w:cs="Calibri" w:eastAsia="Calibri" w:hAnsi="Calibri"/>
-          <w:sz w:val="22"/>
-          <w:szCs w:val="22"/>
-        </w:rPr>
-        <w:t xml:space="preserve">-O), in agreement with earlier calculations [49]. The same separation, an inert closed-shell Zn node with the frontier states on the organic part, was found for Zn(pyrazole-NDI), where it persists at the PBE0 level and underlies the hopping transport described there [8]. The substituents therefore act directly on the gap: the amine raises the VBM most (IRMOF-3, 2.51 eV), followed by the bipyridine (2.75 eV) and the pyridine linkers (3.03 and 3.11 eV), against 3.52 eV for MOF-5. The same substituents move the Fe and Co gaps by 0.2 eV at most. The rule that follows is simple and testable: the metal node decides whether a three-dimensional carboxylate framework falls below 1 eV at the PBE level, and linker functionalisation is a handle only when the band edges are organic, which is the case for closed-shell nodes and, at the VBM, for the amine functionalised Cu paddlewheel.</w:t>
-      </w:r>
-    </w:p>
-    <w:p>
-      <w:pPr>
-        <w:keepNext/>
-        <w:spacing w:after="60" w:before="200"/>
-        <w:jc w:val="center"/>
-      </w:pPr>
-      <w:r>
-        <w:drawing>
-          <wp:inline distT="0" distB="0" distL="0" distR="0">
-            <wp:extent cx="5400675" cy="3324225"/>
             <wp:effectExtent t="0" r="0" b="0" l="0"/>
             <wp:docPr id="1" name="" descr="" title=""/>
             <wp:cNvGraphicFramePr>
@@ -12022,7 +11994,7 @@
                   <pic:spPr bwMode="auto">
                     <a:xfrm>
                       <a:off x="0" y="0"/>
-                      <a:ext cx="5400675" cy="3324225"/>
+                      <a:ext cx="3600450" cy="2714625"/>
                     </a:xfrm>
                     <a:prstGeom prst="rect">
                       <a:avLst/>
@@ -12056,7 +12028,7 @@
           <w:sz w:val="19"/>
           <w:szCs w:val="19"/>
         </w:rPr>
-        <w:t xml:space="preserve">Band edge character of the 18 labels from the site projected eigenvalues within 0.25 eV of the VBM (left) and CBM (right), both spins, k-weighted and normalised to the projected weight: metal (all orbitals), μ</w:t>
+        <w:t xml:space="preserve">PBE-D3(BJ) band gaps of the 18 accepted labels (filled circles; blue, closed-shell Zn</w:t>
       </w:r>
       <w:r>
         <w:rPr>
@@ -12073,7 +12045,137 @@
           <w:sz w:val="19"/>
           <w:szCs w:val="19"/>
         </w:rPr>
-        <w:t xml:space="preserve">-O, carboxylate O and linker backbone (C, H, N, F). Frameworks are ordered as in Table 1; the gap is given in parentheses.</w:t>
+        <w:t xml:space="preserve">O; orange, open-shell 3d) and the prediction μ of the model that selected each framework (open circles), grouped by node family and net. Brackets mark the converged spin state of the paddlewheel labels.</w:t>
+      </w:r>
+    </w:p>
+    <w:p>
+      <w:pPr>
+        <w:spacing w:after="120" w:line="276"/>
+        <w:jc w:val="both"/>
+      </w:pPr>
+      <w:r>
+        <w:rPr>
+          <w:rFonts w:ascii="Calibri" w:cs="Calibri" w:eastAsia="Calibri" w:hAnsi="Calibri"/>
+          <w:sz w:val="22"/>
+          <w:szCs w:val="22"/>
+        </w:rPr>
+        <w:t xml:space="preserve">The Cu</w:t>
+      </w:r>
+      <w:r>
+        <w:rPr>
+          <w:rFonts w:ascii="Calibri" w:cs="Calibri" w:eastAsia="Calibri" w:hAnsi="Calibri"/>
+          <w:sz w:val="22"/>
+          <w:szCs w:val="22"/>
+          <w:vertAlign w:val="subscript"/>
+        </w:rPr>
+        <w:t xml:space="preserve">2</w:t>
+      </w:r>
+      <w:r>
+        <w:rPr>
+          <w:rFonts w:ascii="Calibri" w:cs="Calibri" w:eastAsia="Calibri" w:hAnsi="Calibri"/>
+          <w:sz w:val="22"/>
+          <w:szCs w:val="22"/>
+        </w:rPr>
+        <w:t xml:space="preserve"> cds frameworks are the one open-shell family in which the linker reaches the band edges. Their CBM is the antibonding combination of Cu d</w:t>
+      </w:r>
+      <w:r>
+        <w:rPr>
+          <w:rFonts w:ascii="Calibri" w:cs="Calibri" w:eastAsia="Calibri" w:hAnsi="Calibri"/>
+          <w:sz w:val="22"/>
+          <w:szCs w:val="22"/>
+          <w:vertAlign w:val="subscript"/>
+        </w:rPr>
+        <w:t xml:space="preserve">x²−y²</w:t>
+      </w:r>
+      <w:r>
+        <w:rPr>
+          <w:rFonts w:ascii="Calibri" w:cs="Calibri" w:eastAsia="Calibri" w:hAnsi="Calibri"/>
+          <w:sz w:val="22"/>
+          <w:szCs w:val="22"/>
+        </w:rPr>
+        <w:t xml:space="preserve"> and carboxylate O in all four cases (0.58 to 0.60 Cu, 0.34 to 0.36 O), but the VBM changes with the substituent. It is a mixed Cu d and carboxylate O state for the F</w:t>
+      </w:r>
+      <w:r>
+        <w:rPr>
+          <w:rFonts w:ascii="Calibri" w:cs="Calibri" w:eastAsia="Calibri" w:hAnsi="Calibri"/>
+          <w:sz w:val="22"/>
+          <w:szCs w:val="22"/>
+          <w:vertAlign w:val="subscript"/>
+        </w:rPr>
+        <w:t xml:space="preserve">4</w:t>
+      </w:r>
+      <w:r>
+        <w:rPr>
+          <w:rFonts w:ascii="Calibri" w:cs="Calibri" w:eastAsia="Calibri" w:hAnsi="Calibri"/>
+          <w:sz w:val="22"/>
+          <w:szCs w:val="22"/>
+        </w:rPr>
+        <w:t xml:space="preserve">, F</w:t>
+      </w:r>
+      <w:r>
+        <w:rPr>
+          <w:rFonts w:ascii="Calibri" w:cs="Calibri" w:eastAsia="Calibri" w:hAnsi="Calibri"/>
+          <w:sz w:val="22"/>
+          <w:szCs w:val="22"/>
+          <w:vertAlign w:val="subscript"/>
+        </w:rPr>
+        <w:t xml:space="preserve">8</w:t>
+      </w:r>
+      <w:r>
+        <w:rPr>
+          <w:rFonts w:ascii="Calibri" w:cs="Calibri" w:eastAsia="Calibri" w:hAnsi="Calibri"/>
+          <w:sz w:val="22"/>
+          <w:szCs w:val="22"/>
+        </w:rPr>
+        <w:t xml:space="preserve"> and pyridine linkers (gaps 0.34, 0.89 and 0.90 eV) and a linker state for 2-amino-BDC (0.82 of the weight on the backbone, gap 0.69 eV), where the amine lone pair rises above the Cu d manifold, as it does in amino functionalised Zn and Ti frameworks [51,52].</w:t>
+      </w:r>
+    </w:p>
+    <w:p>
+      <w:pPr>
+        <w:spacing w:after="120" w:line="276"/>
+        <w:jc w:val="both"/>
+      </w:pPr>
+      <w:r>
+        <w:rPr>
+          <w:rFonts w:ascii="Calibri" w:cs="Calibri" w:eastAsia="Calibri" w:hAnsi="Calibri"/>
+          <w:sz w:val="22"/>
+          <w:szCs w:val="22"/>
+        </w:rPr>
+        <w:t xml:space="preserve">The Zn</w:t>
+      </w:r>
+      <w:r>
+        <w:rPr>
+          <w:rFonts w:ascii="Calibri" w:cs="Calibri" w:eastAsia="Calibri" w:hAnsi="Calibri"/>
+          <w:sz w:val="22"/>
+          <w:szCs w:val="22"/>
+          <w:vertAlign w:val="subscript"/>
+        </w:rPr>
+        <w:t xml:space="preserve">4</w:t>
+      </w:r>
+      <w:r>
+        <w:rPr>
+          <w:rFonts w:ascii="Calibri" w:cs="Calibri" w:eastAsia="Calibri" w:hAnsi="Calibri"/>
+          <w:sz w:val="22"/>
+          <w:szCs w:val="22"/>
+        </w:rPr>
+        <w:t xml:space="preserve">O frameworks are the mirror image. Zn contributes 3 % or less to either edge of the four substituted frameworks and 13 % to the VBM of MOF-5. The CBM is the antibonding π state of the aromatic linker in all five (0.68 to 0.80 of the weight, the rest on the carboxylate O), and the VBM is a linker state for the four substituted linkers (0.86 to 0.96) but a carboxylate O state in MOF-5 itself (0.44 carboxylate O, 0.33 linker, 0.10 μ</w:t>
+      </w:r>
+      <w:r>
+        <w:rPr>
+          <w:rFonts w:ascii="Calibri" w:cs="Calibri" w:eastAsia="Calibri" w:hAnsi="Calibri"/>
+          <w:sz w:val="22"/>
+          <w:szCs w:val="22"/>
+          <w:vertAlign w:val="subscript"/>
+        </w:rPr>
+        <w:t xml:space="preserve">4</w:t>
+      </w:r>
+      <w:r>
+        <w:rPr>
+          <w:rFonts w:ascii="Calibri" w:cs="Calibri" w:eastAsia="Calibri" w:hAnsi="Calibri"/>
+          <w:sz w:val="22"/>
+          <w:szCs w:val="22"/>
+        </w:rPr>
+        <w:t xml:space="preserve">-O), in agreement with earlier calculations [49]. The same separation, an inert closed-shell Zn node with the frontier states on the organic part, was found for Zn(pyrazole-NDI), where it persists at the PBE0 level and underlies the hopping transport described there [8]. The substituents therefore act directly on the gap: the amine raises the VBM most (IRMOF-3, 2.51 eV), followed by the bipyridine (2.75 eV) and the pyridine linkers (3.03 and 3.11 eV), against 3.52 eV for MOF-5. The same substituents move the Fe and Co gaps by 0.2 eV at most. The rule that follows is simple and testable: the metal node decides whether a three-dimensional carboxylate framework falls below 1 eV at the PBE level, and linker functionalisation is a handle only when the band edges are organic, which is the case for closed-shell nodes and, at the VBM, for the amine functionalised Cu paddlewheel.</w:t>
       </w:r>
     </w:p>
     <w:p>
@@ -12085,7 +12187,7 @@
       <w:r>
         <w:drawing>
           <wp:inline distT="0" distB="0" distL="0" distR="0">
-            <wp:extent cx="5400675" cy="4772025"/>
+            <wp:extent cx="5400675" cy="3324225"/>
             <wp:effectExtent t="0" r="0" b="0" l="0"/>
             <wp:docPr id="1" name="" descr="" title=""/>
             <wp:cNvGraphicFramePr>
@@ -12110,7 +12212,7 @@
                   <pic:spPr bwMode="auto">
                     <a:xfrm>
                       <a:off x="0" y="0"/>
-                      <a:ext cx="5400675" cy="4772025"/>
+                      <a:ext cx="5400675" cy="3324225"/>
                     </a:xfrm>
                     <a:prstGeom prst="rect">
                       <a:avLst/>
@@ -12144,7 +12246,7 @@
           <w:sz w:val="19"/>
           <w:szCs w:val="19"/>
         </w:rPr>
-        <w:t xml:space="preserve">Spin resolved density of states (spin up positive, spin down negative; 0.05 eV Gaussian broadening) of one framework per family, relative to the VBM, with the projections onto the four site groups of Fig. 5; the grey area is the total DOS and the dotted lines mark the VBM and CBM. In the Co and Fe frameworks the gap opens inside the minority spin d manifold; in MOF-5 and the Cu</w:t>
+        <w:t xml:space="preserve">Band edge character of the 18 labels from the site projected eigenvalues within 0.25 eV of the VBM (left) and CBM (right), both spins, k-weighted and normalised to the projected weight: metal (all orbitals), μ</w:t>
       </w:r>
       <w:r>
         <w:rPr>
@@ -12153,7 +12255,7 @@
           <w:szCs w:val="19"/>
           <w:vertAlign w:val="subscript"/>
         </w:rPr>
-        <w:t xml:space="preserve">2</w:t>
+        <w:t xml:space="preserve">4</w:t>
       </w:r>
       <w:r>
         <w:rPr>
@@ -12161,124 +12263,7 @@
           <w:sz w:val="19"/>
           <w:szCs w:val="19"/>
         </w:rPr>
-        <w:t xml:space="preserve"> framework the edges involve the carboxylate O and linker states. All 18 frameworks are shown in Fig. S5.</w:t>
-      </w:r>
-    </w:p>
-    <w:p>
-      <w:pPr>
-        <w:pStyle w:val="Heading2"/>
-        <w:spacing w:after="100" w:before="240"/>
-      </w:pPr>
-      <w:r>
-        <w:rPr>
-          <w:rFonts w:ascii="Calibri" w:cs="Calibri" w:eastAsia="Calibri" w:hAnsi="Calibri"/>
-          <w:b/>
-          <w:bCs/>
-          <w:i/>
-          <w:iCs/>
-          <w:sz w:val="23"/>
-          <w:szCs w:val="23"/>
-        </w:rPr>
-        <w:t xml:space="preserve">3.4 What the model got right and wrong, and what the loop changed</w:t>
-      </w:r>
-    </w:p>
-    <w:p>
-      <w:pPr>
-        <w:spacing w:after="120" w:line="276"/>
-        <w:jc w:val="both"/>
-      </w:pPr>
-      <w:r>
-        <w:rPr>
-          <w:rFonts w:ascii="Calibri" w:cs="Calibri" w:eastAsia="Calibri" w:hAnsi="Calibri"/>
-          <w:sz w:val="22"/>
-          <w:szCs w:val="22"/>
-        </w:rPr>
-        <w:t xml:space="preserve">Fig. 7 compares every label with the prediction of the model that selected it. For the open-shell frameworks the model is accurate: MAE 0.23 eV, bias +0.09 eV, all 13 within 2σ, and the order of the families (Fe below Co below Cu) is right. Its one systematic error there is the Fe frameworks, predicted at 0.44 to 0.58 eV and computed at 0.01 to 0.07 eV, which PBE without a Hubbard correction renders nearly metallic. For the Zn</w:t>
-      </w:r>
-      <w:r>
-        <w:rPr>
-          <w:rFonts w:ascii="Calibri" w:cs="Calibri" w:eastAsia="Calibri" w:hAnsi="Calibri"/>
-          <w:sz w:val="22"/>
-          <w:szCs w:val="22"/>
-          <w:vertAlign w:val="subscript"/>
-        </w:rPr>
-        <w:t xml:space="preserve">4</w:t>
-      </w:r>
-      <w:r>
-        <w:rPr>
-          <w:rFonts w:ascii="Calibri" w:cs="Calibri" w:eastAsia="Calibri" w:hAnsi="Calibri"/>
-          <w:sz w:val="22"/>
-          <w:szCs w:val="22"/>
-        </w:rPr>
-        <w:t xml:space="preserve">O frameworks the model fails in the same direction five times: predictions of 1.6 to 2.4 eV against labels of 2.5 to 3.5 eV, MAE 0.96 eV, with only two of five labels within 2σ. The closed-shell Zn</w:t>
-      </w:r>
-      <w:r>
-        <w:rPr>
-          <w:rFonts w:ascii="Calibri" w:cs="Calibri" w:eastAsia="Calibri" w:hAnsi="Calibri"/>
-          <w:sz w:val="22"/>
-          <w:szCs w:val="22"/>
-          <w:vertAlign w:val="subscript"/>
-        </w:rPr>
-        <w:t xml:space="preserve">4</w:t>
-      </w:r>
-      <w:r>
-        <w:rPr>
-          <w:rFonts w:ascii="Calibri" w:cs="Calibri" w:eastAsia="Calibri" w:hAnsi="Calibri"/>
-          <w:sz w:val="22"/>
-          <w:szCs w:val="22"/>
-        </w:rPr>
-        <w:t xml:space="preserve">O frameworks are the most out-of-distribution members of the catalogue (density 0.3 to 0.6 g cm</w:t>
-      </w:r>
-      <w:r>
-        <w:rPr>
-          <w:rFonts w:ascii="Calibri" w:cs="Calibri" w:eastAsia="Calibri" w:hAnsi="Calibri"/>
-          <w:sz w:val="22"/>
-          <w:szCs w:val="22"/>
-          <w:vertAlign w:val="superscript"/>
-        </w:rPr>
-        <w:t xml:space="preserve">−3</w:t>
-      </w:r>
-      <w:r>
-        <w:rPr>
-          <w:rFonts w:ascii="Calibri" w:cs="Calibri" w:eastAsia="Calibri" w:hAnsi="Calibri"/>
-          <w:sz w:val="22"/>
-          <w:szCs w:val="22"/>
-        </w:rPr>
-        <w:t xml:space="preserve">, pore limiting diameters of 8.5 to 14.5 Å), and a tree ensemble, which cannot extrapolate, pulls them towards the QMOF mean. The MAE per batch, 0.44, 0.43 and 0.43 eV, is flat across the three iterations because each batch mixed four to five open-shell frameworks with one to two Zn</w:t>
-      </w:r>
-      <w:r>
-        <w:rPr>
-          <w:rFonts w:ascii="Calibri" w:cs="Calibri" w:eastAsia="Calibri" w:hAnsi="Calibri"/>
-          <w:sz w:val="22"/>
-          <w:szCs w:val="22"/>
-          <w:vertAlign w:val="subscript"/>
-        </w:rPr>
-        <w:t xml:space="preserve">4</w:t>
-      </w:r>
-      <w:r>
-        <w:rPr>
-          <w:rFonts w:ascii="Calibri" w:cs="Calibri" w:eastAsia="Calibri" w:hAnsi="Calibri"/>
-          <w:sz w:val="22"/>
-          <w:szCs w:val="22"/>
-        </w:rPr>
-        <w:t xml:space="preserve">O references. None of these numbers depends on the six convergence exceptions of Section 2.4: without them the open-shell MAE is 0.24 eV, all seven remaining open-shell labels are below 1 eV, and the Zn</w:t>
-      </w:r>
-      <w:r>
-        <w:rPr>
-          <w:rFonts w:ascii="Calibri" w:cs="Calibri" w:eastAsia="Calibri" w:hAnsi="Calibri"/>
-          <w:sz w:val="22"/>
-          <w:szCs w:val="22"/>
-          <w:vertAlign w:val="subscript"/>
-        </w:rPr>
-        <w:t xml:space="preserve">4</w:t>
-      </w:r>
-      <w:r>
-        <w:rPr>
-          <w:rFonts w:ascii="Calibri" w:cs="Calibri" w:eastAsia="Calibri" w:hAnsi="Calibri"/>
-          <w:sz w:val="22"/>
-          <w:szCs w:val="22"/>
-        </w:rPr>
-        <w:t xml:space="preserve">O MAE is unchanged (Table S14).</w:t>
+        <w:t xml:space="preserve">-O, carboxylate O and linker backbone (C, H, N, F). Frameworks are ordered as in Table 1; the gap is given in parentheses.</w:t>
       </w:r>
     </w:p>
     <w:p>
@@ -12290,7 +12275,7 @@
       <w:r>
         <w:drawing>
           <wp:inline distT="0" distB="0" distL="0" distR="0">
-            <wp:extent cx="3419475" cy="3381375"/>
+            <wp:extent cx="5400675" cy="4772025"/>
             <wp:effectExtent t="0" r="0" b="0" l="0"/>
             <wp:docPr id="1" name="" descr="" title=""/>
             <wp:cNvGraphicFramePr>
@@ -12315,7 +12300,7 @@
                   <pic:spPr bwMode="auto">
                     <a:xfrm>
                       <a:off x="0" y="0"/>
-                      <a:ext cx="3419475" cy="3381375"/>
+                      <a:ext cx="5400675" cy="4772025"/>
                     </a:xfrm>
                     <a:prstGeom prst="rect">
                       <a:avLst/>
@@ -12349,7 +12334,7 @@
           <w:sz w:val="19"/>
           <w:szCs w:val="19"/>
         </w:rPr>
-        <w:t xml:space="preserve">Prospective parity plot: the prediction μ ± σ of the model that selected each framework against its accepted PBE-D3(BJ) label. Circles, squares and triangles are iterations 0, 1 and 2; blue, closed-shell Zn</w:t>
+        <w:t xml:space="preserve">Spin resolved density of states (spin up positive, spin down negative; 0.05 eV Gaussian broadening) of one framework per family, relative to the VBM, with the projections onto the four site groups of Fig. 6; the grey area is the total DOS and the dotted lines mark the VBM and CBM. In the Co and Fe frameworks the gap opens inside the minority spin d manifold; in MOF-5 and the Cu</w:t>
       </w:r>
       <w:r>
         <w:rPr>
@@ -12358,7 +12343,7 @@
           <w:szCs w:val="19"/>
           <w:vertAlign w:val="subscript"/>
         </w:rPr>
-        <w:t xml:space="preserve">4</w:t>
+        <w:t xml:space="preserve">2</w:t>
       </w:r>
       <w:r>
         <w:rPr>
@@ -12366,11 +12351,29 @@
           <w:sz w:val="19"/>
           <w:szCs w:val="19"/>
         </w:rPr>
-        <w:t xml:space="preserve">O; orange, open-shell 3d. The grey band is ±0.5 eV.</w:t>
+        <w:t xml:space="preserve"> framework the edges involve the carboxylate O and linker states. All 18 frameworks are shown in Fig. S6.</w:t>
       </w:r>
     </w:p>
     <w:p>
       <w:pPr>
+        <w:pStyle w:val="Heading2"/>
+        <w:spacing w:after="100" w:before="240"/>
+      </w:pPr>
+      <w:r>
+        <w:rPr>
+          <w:rFonts w:ascii="Calibri" w:cs="Calibri" w:eastAsia="Calibri" w:hAnsi="Calibri"/>
+          <w:b/>
+          <w:bCs/>
+          <w:i/>
+          <w:iCs/>
+          <w:sz w:val="23"/>
+          <w:szCs w:val="23"/>
+        </w:rPr>
+        <w:t xml:space="preserve">3.4 What the model got right and wrong, and what the loop changed</w:t>
+      </w:r>
+    </w:p>
+    <w:p>
+      <w:pPr>
         <w:spacing w:after="120" w:line="276"/>
         <w:jc w:val="both"/>
       </w:pPr>
@@ -12380,7 +12383,7 @@
           <w:sz w:val="22"/>
           <w:szCs w:val="22"/>
         </w:rPr>
-        <w:t xml:space="preserve">Retraining on the labels did not repair this. With all 18 labels added to the 20,372 QMOF entries, the catalogue predictions move by 0.07 eV on average; the Zn</w:t>
+        <w:t xml:space="preserve">Fig. 8 compares every label with the prediction of the model that selected it. For the open-shell frameworks the model is accurate: MAE 0.23 eV, bias +0.09 eV, all 13 within 2σ, and the order of the families (Fe below Co below Cu) is right. Its one systematic error there is the Fe frameworks, predicted at 0.44 to 0.58 eV and computed at 0.01 to 0.07 eV, which PBE without a Hubbard correction renders nearly metallic. For the Zn</w:t>
       </w:r>
       <w:r>
         <w:rPr>
@@ -12397,7 +12400,75 @@
           <w:sz w:val="22"/>
           <w:szCs w:val="22"/>
         </w:rPr>
-        <w:t xml:space="preserve">O predictions rise by 0.35 eV, to an in-sample error that is still 0.47 eV, and the paired substituent, metal and net trends of Section 3.1 are unchanged. Eighteen points cannot reweight a forest grown on twenty thousand, and nothing in the workflow claimed they would: the acquisition rule rewards low predicted gaps and uncertainty, not model improvement. The retrospective benchmark on QMOF separates the two effects (Fig. 8, Table S20). After 27 labels, the number of frameworks selected in this work, the acquisition rule has found 13.3 ± 2.8 structures with gaps below 0.5 eV against 3.6 ± 1.6 for random selection, and it recovers 60 % of the ten lowest gaps in the pool against 17 %. Running the same rule without ever retraining gives 13.3 hits. The greedy and plain lower confidence bound variants give 15.4 and 15.2, a little more, because they ignore the diversity caps that spread each batch over several families, and pure uncertainty sampling finds 1.1. Over the same 27 labels the MAE on an external out-of-distribution test set falls by only 7 meV, and by 17 meV after 59 labels, the same as with random labelling (17 meV). The parts of the loop that worked are therefore the ranking by the initial model and the eligibility rules learned from the DFT failures, which removed the families that collapse; the retraining step added little at this budget. That is how the value of the loop should be stated: at equal DFT cost it returned about 3.7 times more low gap frameworks than an unguided choice would have, and it left the model essentially as it was.</w:t>
+        <w:t xml:space="preserve">O frameworks the model fails in the same direction five times: predictions of 1.6 to 2.4 eV against labels of 2.5 to 3.5 eV, MAE 0.96 eV, with only two of five labels within 2σ. The closed-shell Zn</w:t>
+      </w:r>
+      <w:r>
+        <w:rPr>
+          <w:rFonts w:ascii="Calibri" w:cs="Calibri" w:eastAsia="Calibri" w:hAnsi="Calibri"/>
+          <w:sz w:val="22"/>
+          <w:szCs w:val="22"/>
+          <w:vertAlign w:val="subscript"/>
+        </w:rPr>
+        <w:t xml:space="preserve">4</w:t>
+      </w:r>
+      <w:r>
+        <w:rPr>
+          <w:rFonts w:ascii="Calibri" w:cs="Calibri" w:eastAsia="Calibri" w:hAnsi="Calibri"/>
+          <w:sz w:val="22"/>
+          <w:szCs w:val="22"/>
+        </w:rPr>
+        <w:t xml:space="preserve">O frameworks are the most out-of-distribution members of the catalogue (density 0.3 to 0.6 g cm</w:t>
+      </w:r>
+      <w:r>
+        <w:rPr>
+          <w:rFonts w:ascii="Calibri" w:cs="Calibri" w:eastAsia="Calibri" w:hAnsi="Calibri"/>
+          <w:sz w:val="22"/>
+          <w:szCs w:val="22"/>
+          <w:vertAlign w:val="superscript"/>
+        </w:rPr>
+        <w:t xml:space="preserve">−3</w:t>
+      </w:r>
+      <w:r>
+        <w:rPr>
+          <w:rFonts w:ascii="Calibri" w:cs="Calibri" w:eastAsia="Calibri" w:hAnsi="Calibri"/>
+          <w:sz w:val="22"/>
+          <w:szCs w:val="22"/>
+        </w:rPr>
+        <w:t xml:space="preserve">, pore limiting diameters of 8.5 to 14.5 Å), and a tree ensemble, which cannot extrapolate, pulls them towards the QMOF mean. The MAE per batch, 0.44, 0.43 and 0.43 eV, is flat across the three iterations because each batch mixed four to five open-shell frameworks with one to two Zn</w:t>
+      </w:r>
+      <w:r>
+        <w:rPr>
+          <w:rFonts w:ascii="Calibri" w:cs="Calibri" w:eastAsia="Calibri" w:hAnsi="Calibri"/>
+          <w:sz w:val="22"/>
+          <w:szCs w:val="22"/>
+          <w:vertAlign w:val="subscript"/>
+        </w:rPr>
+        <w:t xml:space="preserve">4</w:t>
+      </w:r>
+      <w:r>
+        <w:rPr>
+          <w:rFonts w:ascii="Calibri" w:cs="Calibri" w:eastAsia="Calibri" w:hAnsi="Calibri"/>
+          <w:sz w:val="22"/>
+          <w:szCs w:val="22"/>
+        </w:rPr>
+        <w:t xml:space="preserve">O references. None of these numbers depends on the six convergence exceptions of Section 2.4: without them the open-shell MAE is 0.24 eV, all seven remaining open-shell labels are below 1 eV, and the Zn</w:t>
+      </w:r>
+      <w:r>
+        <w:rPr>
+          <w:rFonts w:ascii="Calibri" w:cs="Calibri" w:eastAsia="Calibri" w:hAnsi="Calibri"/>
+          <w:sz w:val="22"/>
+          <w:szCs w:val="22"/>
+          <w:vertAlign w:val="subscript"/>
+        </w:rPr>
+        <w:t xml:space="preserve">4</w:t>
+      </w:r>
+      <w:r>
+        <w:rPr>
+          <w:rFonts w:ascii="Calibri" w:cs="Calibri" w:eastAsia="Calibri" w:hAnsi="Calibri"/>
+          <w:sz w:val="22"/>
+          <w:szCs w:val="22"/>
+        </w:rPr>
+        <w:t xml:space="preserve">O MAE is unchanged (Table S14).</w:t>
       </w:r>
     </w:p>
     <w:p>
@@ -12409,7 +12480,7 @@
       <w:r>
         <w:drawing>
           <wp:inline distT="0" distB="0" distL="0" distR="0">
-            <wp:extent cx="5943600" cy="2276475"/>
+            <wp:extent cx="3419475" cy="3381375"/>
             <wp:effectExtent t="0" r="0" b="0" l="0"/>
             <wp:docPr id="1" name="" descr="" title=""/>
             <wp:cNvGraphicFramePr>
@@ -12434,7 +12505,7 @@
                   <pic:spPr bwMode="auto">
                     <a:xfrm>
                       <a:off x="0" y="0"/>
-                      <a:ext cx="5943600" cy="2276475"/>
+                      <a:ext cx="3419475" cy="3381375"/>
                     </a:xfrm>
                     <a:prstGeom prst="rect">
                       <a:avLst/>
@@ -12468,29 +12539,28 @@
           <w:sz w:val="19"/>
           <w:szCs w:val="19"/>
         </w:rPr>
-        <w:t xml:space="preserve">Retrospective active learning benchmark on QMOF (20 repeats, pools of 150 out-of-distribution structures with the catalogue's chemistry, batches of 11, 8, 8 and then 8). (a) Labelled structures with PBE gap below 0.5 eV and (b) recall of the ten lowest gaps in the pool against labels acquired, for six selection strategies; shaded bands are one standard deviation for the acquisition rule of this work and for random selection. (c) Change of the MAE on a fixed external out-of-distribution test set. The dotted line marks the 27 frameworks selected in the prospective campaign.</w:t>
+        <w:t xml:space="preserve">Prospective parity plot: the prediction μ ± σ of the model that selected each framework against its accepted PBE-D3(BJ) label. Circles, squares and triangles are iterations 0, 1 and 2; blue, closed-shell Zn</w:t>
+      </w:r>
+      <w:r>
+        <w:rPr>
+          <w:rFonts w:ascii="Calibri" w:cs="Calibri" w:eastAsia="Calibri" w:hAnsi="Calibri"/>
+          <w:sz w:val="19"/>
+          <w:szCs w:val="19"/>
+          <w:vertAlign w:val="subscript"/>
+        </w:rPr>
+        <w:t xml:space="preserve">4</w:t>
+      </w:r>
+      <w:r>
+        <w:rPr>
+          <w:rFonts w:ascii="Calibri" w:cs="Calibri" w:eastAsia="Calibri" w:hAnsi="Calibri"/>
+          <w:sz w:val="19"/>
+          <w:szCs w:val="19"/>
+        </w:rPr>
+        <w:t xml:space="preserve">O; orange, open-shell 3d. The grey band is ±0.5 eV.</w:t>
       </w:r>
     </w:p>
     <w:p>
       <w:pPr>
-        <w:pStyle w:val="Heading2"/>
-        <w:spacing w:after="100" w:before="240"/>
-      </w:pPr>
-      <w:r>
-        <w:rPr>
-          <w:rFonts w:ascii="Calibri" w:cs="Calibri" w:eastAsia="Calibri" w:hAnsi="Calibri"/>
-          <w:b/>
-          <w:bCs/>
-          <w:i/>
-          <w:iCs/>
-          <w:sz w:val="23"/>
-          <w:szCs w:val="23"/>
-        </w:rPr>
-        <w:t xml:space="preserve">3.5 Periodic GFN1-xTB as a check that needs no training data</w:t>
-      </w:r>
-    </w:p>
-    <w:p>
-      <w:pPr>
         <w:spacing w:after="120" w:line="276"/>
         <w:jc w:val="both"/>
       </w:pPr>
@@ -12500,21 +12570,7 @@
           <w:sz w:val="22"/>
           <w:szCs w:val="22"/>
         </w:rPr>
-        <w:t xml:space="preserve">On the 2,000-structure QMOF subset, periodic GFN1-xTB reproduces the PBE gaps of closed-shell frameworks with an MAE of 0.40 eV and a Spearman correlation of 0.90 (n = 791), but not those of open-shell 3d frameworks (MAE 0.73 eV, ρ = 0.29, n = 1,205), in line with Jose and Walsh [25] (Table S17, Fig. S6). The finite cluster treatment, which cuts the framework into a neutral fragment, collapses 98 % of the gaps below 0.1 eV regardless of the chemistry. An earlier version of this work had concluded from such clusters that GFN1-xTB is unusable for MOF band gaps, and we report the comparison so that the artefact is not repeated. Against hybrid HSE06 gaps the periodic xTB values are 1.3 to 1.5 eV too low, as PBE itself is.</w:t>
-      </w:r>
-    </w:p>
-    <w:p>
-      <w:pPr>
-        <w:spacing w:after="120" w:line="276"/>
-        <w:jc w:val="both"/>
-      </w:pPr>
-      <w:r>
-        <w:rPr>
-          <w:rFonts w:ascii="Calibri" w:cs="Calibri" w:eastAsia="Calibri" w:hAnsi="Calibri"/>
-          <w:sz w:val="22"/>
-          <w:szCs w:val="22"/>
-        </w:rPr>
-        <w:t xml:space="preserve">The useful result is on the generated frameworks (Table 3, Fig. 9). At the DFT geometry, GFN1-xTB reproduces the five Zn</w:t>
+        <w:t xml:space="preserve">Retraining on the labels did not repair this. With all 18 labels added to the 20,372 QMOF entries, the catalogue predictions move by 0.07 eV on average; the Zn</w:t>
       </w:r>
       <w:r>
         <w:rPr>
@@ -12531,721 +12587,8 @@
           <w:sz w:val="22"/>
           <w:szCs w:val="22"/>
         </w:rPr>
-        <w:t xml:space="preserve">O labels with an MAE of 0.14 eV, where the model erred by 0.96 eV, and it does so without any training data. At the pre-relaxed geometry, which is available for every candidate at a cost of seconds to minutes, the MAE is 0.23 eV; at the as-assembled PORMAKE geometry it is 0.43 eV, because the compressed bonds of the raw assembly distort the frontier orbitals. The frontier orbitals of xTB also agree with the DFT band edges in character: for all five Zn</w:t>
-      </w:r>
-      <w:r>
-        <w:rPr>
-          <w:rFonts w:ascii="Calibri" w:cs="Calibri" w:eastAsia="Calibri" w:hAnsi="Calibri"/>
-          <w:sz w:val="22"/>
-          <w:szCs w:val="22"/>
-          <w:vertAlign w:val="subscript"/>
-        </w:rPr>
-        <w:t xml:space="preserve">4</w:t>
-      </w:r>
-      <w:r>
-        <w:rPr>
-          <w:rFonts w:ascii="Calibri" w:cs="Calibri" w:eastAsia="Calibri" w:hAnsi="Calibri"/>
-          <w:sz w:val="22"/>
-          <w:szCs w:val="22"/>
-        </w:rPr>
-        <w:t xml:space="preserve">O frameworks the dominant site group at the HOMO and at the LUMO is the same in both methods, and the linker fraction of the HOMO follows the same order across linkers (Table S19). For the 13 open-shell labels the picture reverses: the spin restricted xTB gaps have an MAE of 0.52 eV and no rank correlation with the labels, and across the catalogue the xTB and model predictions correlate for the closed-shell frameworks (ρ = 0.59) but not for the open-shell ones (ρ = 0.16). The two estimates complement each other. The practical rule is to run periodic xTB on pre-relaxed geometries for every closed-shell candidate before trusting a QMOF-trained model on it, at a cost that is negligible next to a single DFT relaxation.</w:t>
-      </w:r>
-    </w:p>
-    <w:p>
-      <w:pPr>
-        <w:keepNext/>
-        <w:spacing w:after="80" w:before="200" w:line="252"/>
-        <w:jc w:val="both"/>
-      </w:pPr>
-      <w:r>
-        <w:rPr>
-          <w:rFonts w:ascii="Calibri" w:cs="Calibri" w:eastAsia="Calibri" w:hAnsi="Calibri"/>
-          <w:b/>
-          <w:bCs/>
-          <w:sz w:val="19"/>
-          <w:szCs w:val="19"/>
-        </w:rPr>
-        <w:t xml:space="preserve">Table 3. </w:t>
-      </w:r>
-      <w:r>
-        <w:rPr>
-          <w:rFonts w:ascii="Calibri" w:cs="Calibri" w:eastAsia="Calibri" w:hAnsi="Calibri"/>
-          <w:sz w:val="19"/>
-          <w:szCs w:val="19"/>
-        </w:rPr>
-        <w:t xml:space="preserve">Mean absolute error and bias (eV) of the model and of periodic GFN1-xTB at three geometries against the accepted PBE-D3(BJ) labels, by electronic group. The k-mesh supercell row covers the labels whose static k-mesh supercell has at most 700 atoms; the pre-relaxed row covers the frameworks that had a machine-learned pre-relaxed geometry. Per framework values are in Table S18.</w:t>
-      </w:r>
-    </w:p>
-    <w:tbl>
-      <w:tblPr>
-        <w:tblW w:type="dxa" w:w="9360"/>
-        <w:tblBorders>
-          <w:top w:val="single" w:color="auto" w:sz="4"/>
-          <w:left w:val="single" w:color="auto" w:sz="4"/>
-          <w:bottom w:val="single" w:color="auto" w:sz="4"/>
-          <w:right w:val="single" w:color="auto" w:sz="4"/>
-          <w:insideH w:val="single" w:color="auto" w:sz="4"/>
-          <w:insideV w:val="single" w:color="auto" w:sz="4"/>
-        </w:tblBorders>
-      </w:tblPr>
-      <w:tblGrid>
-        <w:gridCol w:w="4011"/>
-        <w:gridCol w:w="2674"/>
-        <w:gridCol w:w="2674"/>
-      </w:tblGrid>
-      <w:tr>
-        <w:trPr>
-          <w:tblHeader/>
-        </w:trPr>
-        <w:tc>
-          <w:tcPr>
-            <w:tcW w:type="dxa" w:w="4011"/>
-            <w:tcBorders>
-              <w:top w:val="single" w:color="52514e" w:sz="4"/>
-              <w:left w:val="none" w:color="FFFFFF" w:sz="0"/>
-              <w:bottom w:val="single" w:color="52514e" w:sz="4"/>
-              <w:right w:val="none" w:color="FFFFFF" w:sz="0"/>
-            </w:tcBorders>
-            <w:tcMar>
-              <w:top w:type="dxa" w:w="40"/>
-              <w:left w:type="dxa" w:w="60"/>
-              <w:bottom w:type="dxa" w:w="40"/>
-              <w:right w:type="dxa" w:w="60"/>
-            </w:tcMar>
-            <w:vAlign w:val="center"/>
-          </w:tcPr>
-          <w:p>
-            <w:pPr>
-              <w:spacing w:after="0" w:line="240"/>
-              <w:jc w:val="left"/>
-            </w:pPr>
-            <w:r>
-              <w:rPr>
-                <w:rFonts w:ascii="Calibri" w:cs="Calibri" w:eastAsia="Calibri" w:hAnsi="Calibri"/>
-                <w:b/>
-                <w:bCs/>
-                <w:sz w:val="17"/>
-                <w:szCs w:val="17"/>
-              </w:rPr>
-              <w:t xml:space="preserve">Estimate</w:t>
-            </w:r>
-          </w:p>
-        </w:tc>
-        <w:tc>
-          <w:tcPr>
-            <w:tcW w:type="dxa" w:w="2674"/>
-            <w:tcBorders>
-              <w:top w:val="single" w:color="52514e" w:sz="4"/>
-              <w:left w:val="none" w:color="FFFFFF" w:sz="0"/>
-              <w:bottom w:val="single" w:color="52514e" w:sz="4"/>
-              <w:right w:val="none" w:color="FFFFFF" w:sz="0"/>
-            </w:tcBorders>
-            <w:tcMar>
-              <w:top w:type="dxa" w:w="40"/>
-              <w:left w:type="dxa" w:w="60"/>
-              <w:bottom w:type="dxa" w:w="40"/>
-              <w:right w:type="dxa" w:w="60"/>
-            </w:tcMar>
-            <w:vAlign w:val="center"/>
-          </w:tcPr>
-          <w:p>
-            <w:pPr>
-              <w:spacing w:after="0" w:line="240"/>
-              <w:jc w:val="center"/>
-            </w:pPr>
-            <w:r>
-              <w:rPr>
-                <w:rFonts w:ascii="Calibri" w:cs="Calibri" w:eastAsia="Calibri" w:hAnsi="Calibri"/>
-                <w:b/>
-                <w:bCs/>
-                <w:sz w:val="17"/>
-                <w:szCs w:val="17"/>
-              </w:rPr>
-              <w:t xml:space="preserve">Closed-shell Zn</w:t>
-            </w:r>
-            <w:r>
-              <w:rPr>
-                <w:rFonts w:ascii="Calibri" w:cs="Calibri" w:eastAsia="Calibri" w:hAnsi="Calibri"/>
-                <w:b/>
-                <w:bCs/>
-                <w:sz w:val="17"/>
-                <w:szCs w:val="17"/>
-                <w:vertAlign w:val="subscript"/>
-              </w:rPr>
-              <w:t xml:space="preserve">4</w:t>
-            </w:r>
-            <w:r>
-              <w:rPr>
-                <w:rFonts w:ascii="Calibri" w:cs="Calibri" w:eastAsia="Calibri" w:hAnsi="Calibri"/>
-                <w:b/>
-                <w:bCs/>
-                <w:sz w:val="17"/>
-                <w:szCs w:val="17"/>
-              </w:rPr>
-              <w:t xml:space="preserve">O: MAE (bias)</w:t>
-            </w:r>
-          </w:p>
-        </w:tc>
-        <w:tc>
-          <w:tcPr>
-            <w:tcW w:type="dxa" w:w="2674"/>
-            <w:tcBorders>
-              <w:top w:val="single" w:color="52514e" w:sz="4"/>
-              <w:left w:val="none" w:color="FFFFFF" w:sz="0"/>
-              <w:bottom w:val="single" w:color="52514e" w:sz="4"/>
-              <w:right w:val="none" w:color="FFFFFF" w:sz="0"/>
-            </w:tcBorders>
-            <w:tcMar>
-              <w:top w:type="dxa" w:w="40"/>
-              <w:left w:type="dxa" w:w="60"/>
-              <w:bottom w:type="dxa" w:w="40"/>
-              <w:right w:type="dxa" w:w="60"/>
-            </w:tcMar>
-            <w:vAlign w:val="center"/>
-          </w:tcPr>
-          <w:p>
-            <w:pPr>
-              <w:spacing w:after="0" w:line="240"/>
-              <w:jc w:val="center"/>
-            </w:pPr>
-            <w:r>
-              <w:rPr>
-                <w:rFonts w:ascii="Calibri" w:cs="Calibri" w:eastAsia="Calibri" w:hAnsi="Calibri"/>
-                <w:b/>
-                <w:bCs/>
-                <w:sz w:val="17"/>
-                <w:szCs w:val="17"/>
-              </w:rPr>
-              <w:t xml:space="preserve">Open-shell 3d: MAE (bias)</w:t>
-            </w:r>
-          </w:p>
-        </w:tc>
-      </w:tr>
-      <w:tr>
-        <w:tc>
-          <w:tcPr>
-            <w:tcW w:type="dxa" w:w="4011"/>
-            <w:tcBorders>
-              <w:top w:val="none" w:color="FFFFFF" w:sz="0"/>
-              <w:left w:val="none" w:color="FFFFFF" w:sz="0"/>
-              <w:bottom w:val="none" w:color="FFFFFF" w:sz="0"/>
-              <w:right w:val="none" w:color="FFFFFF" w:sz="0"/>
-            </w:tcBorders>
-            <w:tcMar>
-              <w:top w:type="dxa" w:w="40"/>
-              <w:left w:type="dxa" w:w="60"/>
-              <w:bottom w:type="dxa" w:w="40"/>
-              <w:right w:type="dxa" w:w="60"/>
-            </w:tcMar>
-            <w:vAlign w:val="center"/>
-          </w:tcPr>
-          <w:p>
-            <w:pPr>
-              <w:spacing w:after="0" w:line="240"/>
-              <w:jc w:val="left"/>
-            </w:pPr>
-            <w:r>
-              <w:rPr>
-                <w:rFonts w:ascii="Calibri" w:cs="Calibri" w:eastAsia="Calibri" w:hAnsi="Calibri"/>
-                <w:b w:val="false"/>
-                <w:bCs w:val="false"/>
-                <w:sz w:val="17"/>
-                <w:szCs w:val="17"/>
-              </w:rPr>
-              <w:t xml:space="preserve">Model μ before DFT</w:t>
-            </w:r>
-          </w:p>
-        </w:tc>
-        <w:tc>
-          <w:tcPr>
-            <w:tcW w:type="dxa" w:w="2674"/>
-            <w:tcBorders>
-              <w:top w:val="none" w:color="FFFFFF" w:sz="0"/>
-              <w:left w:val="none" w:color="FFFFFF" w:sz="0"/>
-              <w:bottom w:val="none" w:color="FFFFFF" w:sz="0"/>
-              <w:right w:val="none" w:color="FFFFFF" w:sz="0"/>
-            </w:tcBorders>
-            <w:tcMar>
-              <w:top w:type="dxa" w:w="40"/>
-              <w:left w:type="dxa" w:w="60"/>
-              <w:bottom w:type="dxa" w:w="40"/>
-              <w:right w:type="dxa" w:w="60"/>
-            </w:tcMar>
-            <w:vAlign w:val="center"/>
-          </w:tcPr>
-          <w:p>
-            <w:pPr>
-              <w:spacing w:after="0" w:line="240"/>
-              <w:jc w:val="center"/>
-            </w:pPr>
-            <w:r>
-              <w:rPr>
-                <w:rFonts w:ascii="Calibri" w:cs="Calibri" w:eastAsia="Calibri" w:hAnsi="Calibri"/>
-                <w:b w:val="false"/>
-                <w:bCs w:val="false"/>
-                <w:sz w:val="17"/>
-                <w:szCs w:val="17"/>
-              </w:rPr>
-              <w:t xml:space="preserve">0.96 (-0.96), n = 5</w:t>
-            </w:r>
-          </w:p>
-        </w:tc>
-        <w:tc>
-          <w:tcPr>
-            <w:tcW w:type="dxa" w:w="2674"/>
-            <w:tcBorders>
-              <w:top w:val="none" w:color="FFFFFF" w:sz="0"/>
-              <w:left w:val="none" w:color="FFFFFF" w:sz="0"/>
-              <w:bottom w:val="none" w:color="FFFFFF" w:sz="0"/>
-              <w:right w:val="none" w:color="FFFFFF" w:sz="0"/>
-            </w:tcBorders>
-            <w:tcMar>
-              <w:top w:type="dxa" w:w="40"/>
-              <w:left w:type="dxa" w:w="60"/>
-              <w:bottom w:type="dxa" w:w="40"/>
-              <w:right w:type="dxa" w:w="60"/>
-            </w:tcMar>
-            <w:vAlign w:val="center"/>
-          </w:tcPr>
-          <w:p>
-            <w:pPr>
-              <w:spacing w:after="0" w:line="240"/>
-              <w:jc w:val="center"/>
-            </w:pPr>
-            <w:r>
-              <w:rPr>
-                <w:rFonts w:ascii="Calibri" w:cs="Calibri" w:eastAsia="Calibri" w:hAnsi="Calibri"/>
-                <w:b w:val="false"/>
-                <w:bCs w:val="false"/>
-                <w:sz w:val="17"/>
-                <w:szCs w:val="17"/>
-              </w:rPr>
-              <w:t xml:space="preserve">0.23 (+0.09), n = 13</w:t>
-            </w:r>
-          </w:p>
-        </w:tc>
-      </w:tr>
-      <w:tr>
-        <w:tc>
-          <w:tcPr>
-            <w:tcW w:type="dxa" w:w="4011"/>
-            <w:tcBorders>
-              <w:top w:val="none" w:color="FFFFFF" w:sz="0"/>
-              <w:left w:val="none" w:color="FFFFFF" w:sz="0"/>
-              <w:bottom w:val="none" w:color="FFFFFF" w:sz="0"/>
-              <w:right w:val="none" w:color="FFFFFF" w:sz="0"/>
-            </w:tcBorders>
-            <w:tcMar>
-              <w:top w:type="dxa" w:w="40"/>
-              <w:left w:type="dxa" w:w="60"/>
-              <w:bottom w:type="dxa" w:w="40"/>
-              <w:right w:type="dxa" w:w="60"/>
-            </w:tcMar>
-            <w:vAlign w:val="center"/>
-          </w:tcPr>
-          <w:p>
-            <w:pPr>
-              <w:spacing w:after="0" w:line="240"/>
-              <w:jc w:val="left"/>
-            </w:pPr>
-            <w:r>
-              <w:rPr>
-                <w:rFonts w:ascii="Calibri" w:cs="Calibri" w:eastAsia="Calibri" w:hAnsi="Calibri"/>
-                <w:b w:val="false"/>
-                <w:bCs w:val="false"/>
-                <w:sz w:val="17"/>
-                <w:szCs w:val="17"/>
-              </w:rPr>
-              <w:t xml:space="preserve">GFN1-xTB, DFT geometry (Γ)</w:t>
-            </w:r>
-          </w:p>
-        </w:tc>
-        <w:tc>
-          <w:tcPr>
-            <w:tcW w:type="dxa" w:w="2674"/>
-            <w:tcBorders>
-              <w:top w:val="none" w:color="FFFFFF" w:sz="0"/>
-              <w:left w:val="none" w:color="FFFFFF" w:sz="0"/>
-              <w:bottom w:val="none" w:color="FFFFFF" w:sz="0"/>
-              <w:right w:val="none" w:color="FFFFFF" w:sz="0"/>
-            </w:tcBorders>
-            <w:tcMar>
-              <w:top w:type="dxa" w:w="40"/>
-              <w:left w:type="dxa" w:w="60"/>
-              <w:bottom w:type="dxa" w:w="40"/>
-              <w:right w:type="dxa" w:w="60"/>
-            </w:tcMar>
-            <w:vAlign w:val="center"/>
-          </w:tcPr>
-          <w:p>
-            <w:pPr>
-              <w:spacing w:after="0" w:line="240"/>
-              <w:jc w:val="center"/>
-            </w:pPr>
-            <w:r>
-              <w:rPr>
-                <w:rFonts w:ascii="Calibri" w:cs="Calibri" w:eastAsia="Calibri" w:hAnsi="Calibri"/>
-                <w:b w:val="false"/>
-                <w:bCs w:val="false"/>
-                <w:sz w:val="17"/>
-                <w:szCs w:val="17"/>
-              </w:rPr>
-              <w:t xml:space="preserve">0.14 (-0.07), n = 5</w:t>
-            </w:r>
-          </w:p>
-        </w:tc>
-        <w:tc>
-          <w:tcPr>
-            <w:tcW w:type="dxa" w:w="2674"/>
-            <w:tcBorders>
-              <w:top w:val="none" w:color="FFFFFF" w:sz="0"/>
-              <w:left w:val="none" w:color="FFFFFF" w:sz="0"/>
-              <w:bottom w:val="none" w:color="FFFFFF" w:sz="0"/>
-              <w:right w:val="none" w:color="FFFFFF" w:sz="0"/>
-            </w:tcBorders>
-            <w:tcMar>
-              <w:top w:type="dxa" w:w="40"/>
-              <w:left w:type="dxa" w:w="60"/>
-              <w:bottom w:type="dxa" w:w="40"/>
-              <w:right w:type="dxa" w:w="60"/>
-            </w:tcMar>
-            <w:vAlign w:val="center"/>
-          </w:tcPr>
-          <w:p>
-            <w:pPr>
-              <w:spacing w:after="0" w:line="240"/>
-              <w:jc w:val="center"/>
-            </w:pPr>
-            <w:r>
-              <w:rPr>
-                <w:rFonts w:ascii="Calibri" w:cs="Calibri" w:eastAsia="Calibri" w:hAnsi="Calibri"/>
-                <w:b w:val="false"/>
-                <w:bCs w:val="false"/>
-                <w:sz w:val="17"/>
-                <w:szCs w:val="17"/>
-              </w:rPr>
-              <w:t xml:space="preserve">0.52 (+0.14), n = 13</w:t>
-            </w:r>
-          </w:p>
-        </w:tc>
-      </w:tr>
-      <w:tr>
-        <w:tc>
-          <w:tcPr>
-            <w:tcW w:type="dxa" w:w="4011"/>
-            <w:tcBorders>
-              <w:top w:val="none" w:color="FFFFFF" w:sz="0"/>
-              <w:left w:val="none" w:color="FFFFFF" w:sz="0"/>
-              <w:bottom w:val="none" w:color="FFFFFF" w:sz="0"/>
-              <w:right w:val="none" w:color="FFFFFF" w:sz="0"/>
-            </w:tcBorders>
-            <w:tcMar>
-              <w:top w:type="dxa" w:w="40"/>
-              <w:left w:type="dxa" w:w="60"/>
-              <w:bottom w:type="dxa" w:w="40"/>
-              <w:right w:type="dxa" w:w="60"/>
-            </w:tcMar>
-            <w:vAlign w:val="center"/>
-          </w:tcPr>
-          <w:p>
-            <w:pPr>
-              <w:spacing w:after="0" w:line="240"/>
-              <w:jc w:val="left"/>
-            </w:pPr>
-            <w:r>
-              <w:rPr>
-                <w:rFonts w:ascii="Calibri" w:cs="Calibri" w:eastAsia="Calibri" w:hAnsi="Calibri"/>
-                <w:b w:val="false"/>
-                <w:bCs w:val="false"/>
-                <w:sz w:val="17"/>
-                <w:szCs w:val="17"/>
-              </w:rPr>
-              <w:t xml:space="preserve">GFN1-xTB, DFT geometry, k-mesh supercell</w:t>
-            </w:r>
-          </w:p>
-        </w:tc>
-        <w:tc>
-          <w:tcPr>
-            <w:tcW w:type="dxa" w:w="2674"/>
-            <w:tcBorders>
-              <w:top w:val="none" w:color="FFFFFF" w:sz="0"/>
-              <w:left w:val="none" w:color="FFFFFF" w:sz="0"/>
-              <w:bottom w:val="none" w:color="FFFFFF" w:sz="0"/>
-              <w:right w:val="none" w:color="FFFFFF" w:sz="0"/>
-            </w:tcBorders>
-            <w:tcMar>
-              <w:top w:type="dxa" w:w="40"/>
-              <w:left w:type="dxa" w:w="60"/>
-              <w:bottom w:type="dxa" w:w="40"/>
-              <w:right w:type="dxa" w:w="60"/>
-            </w:tcMar>
-            <w:vAlign w:val="center"/>
-          </w:tcPr>
-          <w:p>
-            <w:pPr>
-              <w:spacing w:after="0" w:line="240"/>
-              <w:jc w:val="center"/>
-            </w:pPr>
-            <w:r>
-              <w:rPr>
-                <w:rFonts w:ascii="Calibri" w:cs="Calibri" w:eastAsia="Calibri" w:hAnsi="Calibri"/>
-                <w:b w:val="false"/>
-                <w:bCs w:val="false"/>
-                <w:sz w:val="17"/>
-                <w:szCs w:val="17"/>
-              </w:rPr>
-              <w:t xml:space="preserve">0.17 (-0.08), n = 3</w:t>
-            </w:r>
-          </w:p>
-        </w:tc>
-        <w:tc>
-          <w:tcPr>
-            <w:tcW w:type="dxa" w:w="2674"/>
-            <w:tcBorders>
-              <w:top w:val="none" w:color="FFFFFF" w:sz="0"/>
-              <w:left w:val="none" w:color="FFFFFF" w:sz="0"/>
-              <w:bottom w:val="none" w:color="FFFFFF" w:sz="0"/>
-              <w:right w:val="none" w:color="FFFFFF" w:sz="0"/>
-            </w:tcBorders>
-            <w:tcMar>
-              <w:top w:type="dxa" w:w="40"/>
-              <w:left w:type="dxa" w:w="60"/>
-              <w:bottom w:type="dxa" w:w="40"/>
-              <w:right w:type="dxa" w:w="60"/>
-            </w:tcMar>
-            <w:vAlign w:val="center"/>
-          </w:tcPr>
-          <w:p>
-            <w:pPr>
-              <w:spacing w:after="0" w:line="240"/>
-              <w:jc w:val="center"/>
-            </w:pPr>
-            <w:r>
-              <w:rPr>
-                <w:rFonts w:ascii="Calibri" w:cs="Calibri" w:eastAsia="Calibri" w:hAnsi="Calibri"/>
-                <w:b w:val="false"/>
-                <w:bCs w:val="false"/>
-                <w:sz w:val="17"/>
-                <w:szCs w:val="17"/>
-              </w:rPr>
-              <w:t xml:space="preserve">0.78 (+0.12), n = 7</w:t>
-            </w:r>
-          </w:p>
-        </w:tc>
-      </w:tr>
-      <w:tr>
-        <w:tc>
-          <w:tcPr>
-            <w:tcW w:type="dxa" w:w="4011"/>
-            <w:tcBorders>
-              <w:top w:val="none" w:color="FFFFFF" w:sz="0"/>
-              <w:left w:val="none" w:color="FFFFFF" w:sz="0"/>
-              <w:bottom w:val="none" w:color="FFFFFF" w:sz="0"/>
-              <w:right w:val="none" w:color="FFFFFF" w:sz="0"/>
-            </w:tcBorders>
-            <w:tcMar>
-              <w:top w:type="dxa" w:w="40"/>
-              <w:left w:type="dxa" w:w="60"/>
-              <w:bottom w:type="dxa" w:w="40"/>
-              <w:right w:type="dxa" w:w="60"/>
-            </w:tcMar>
-            <w:vAlign w:val="center"/>
-          </w:tcPr>
-          <w:p>
-            <w:pPr>
-              <w:spacing w:after="0" w:line="240"/>
-              <w:jc w:val="left"/>
-            </w:pPr>
-            <w:r>
-              <w:rPr>
-                <w:rFonts w:ascii="Calibri" w:cs="Calibri" w:eastAsia="Calibri" w:hAnsi="Calibri"/>
-                <w:b w:val="false"/>
-                <w:bCs w:val="false"/>
-                <w:sz w:val="17"/>
-                <w:szCs w:val="17"/>
-              </w:rPr>
-              <w:t xml:space="preserve">GFN1-xTB, pre-relaxed geometry (ML potential)</w:t>
-            </w:r>
-          </w:p>
-        </w:tc>
-        <w:tc>
-          <w:tcPr>
-            <w:tcW w:type="dxa" w:w="2674"/>
-            <w:tcBorders>
-              <w:top w:val="none" w:color="FFFFFF" w:sz="0"/>
-              <w:left w:val="none" w:color="FFFFFF" w:sz="0"/>
-              <w:bottom w:val="none" w:color="FFFFFF" w:sz="0"/>
-              <w:right w:val="none" w:color="FFFFFF" w:sz="0"/>
-            </w:tcBorders>
-            <w:tcMar>
-              <w:top w:type="dxa" w:w="40"/>
-              <w:left w:type="dxa" w:w="60"/>
-              <w:bottom w:type="dxa" w:w="40"/>
-              <w:right w:type="dxa" w:w="60"/>
-            </w:tcMar>
-            <w:vAlign w:val="center"/>
-          </w:tcPr>
-          <w:p>
-            <w:pPr>
-              <w:spacing w:after="0" w:line="240"/>
-              <w:jc w:val="center"/>
-            </w:pPr>
-            <w:r>
-              <w:rPr>
-                <w:rFonts w:ascii="Calibri" w:cs="Calibri" w:eastAsia="Calibri" w:hAnsi="Calibri"/>
-                <w:b w:val="false"/>
-                <w:bCs w:val="false"/>
-                <w:sz w:val="17"/>
-                <w:szCs w:val="17"/>
-              </w:rPr>
-              <w:t xml:space="preserve">0.23 (-0.22), n = 5</w:t>
-            </w:r>
-          </w:p>
-        </w:tc>
-        <w:tc>
-          <w:tcPr>
-            <w:tcW w:type="dxa" w:w="2674"/>
-            <w:tcBorders>
-              <w:top w:val="none" w:color="FFFFFF" w:sz="0"/>
-              <w:left w:val="none" w:color="FFFFFF" w:sz="0"/>
-              <w:bottom w:val="none" w:color="FFFFFF" w:sz="0"/>
-              <w:right w:val="none" w:color="FFFFFF" w:sz="0"/>
-            </w:tcBorders>
-            <w:tcMar>
-              <w:top w:type="dxa" w:w="40"/>
-              <w:left w:type="dxa" w:w="60"/>
-              <w:bottom w:type="dxa" w:w="40"/>
-              <w:right w:type="dxa" w:w="60"/>
-            </w:tcMar>
-            <w:vAlign w:val="center"/>
-          </w:tcPr>
-          <w:p>
-            <w:pPr>
-              <w:spacing w:after="0" w:line="240"/>
-              <w:jc w:val="center"/>
-            </w:pPr>
-            <w:r>
-              <w:rPr>
-                <w:rFonts w:ascii="Calibri" w:cs="Calibri" w:eastAsia="Calibri" w:hAnsi="Calibri"/>
-                <w:b w:val="false"/>
-                <w:bCs w:val="false"/>
-                <w:sz w:val="17"/>
-                <w:szCs w:val="17"/>
-              </w:rPr>
-              <w:t xml:space="preserve">0.53 (+0.11), n = 12</w:t>
-            </w:r>
-          </w:p>
-        </w:tc>
-      </w:tr>
-      <w:tr>
-        <w:tc>
-          <w:tcPr>
-            <w:tcW w:type="dxa" w:w="4011"/>
-            <w:tcBorders>
-              <w:top w:val="none" w:color="FFFFFF" w:sz="0"/>
-              <w:left w:val="none" w:color="FFFFFF" w:sz="0"/>
-              <w:bottom w:val="single" w:color="52514e" w:sz="4"/>
-              <w:right w:val="none" w:color="FFFFFF" w:sz="0"/>
-            </w:tcBorders>
-            <w:tcMar>
-              <w:top w:type="dxa" w:w="40"/>
-              <w:left w:type="dxa" w:w="60"/>
-              <w:bottom w:type="dxa" w:w="40"/>
-              <w:right w:type="dxa" w:w="60"/>
-            </w:tcMar>
-            <w:vAlign w:val="center"/>
-          </w:tcPr>
-          <w:p>
-            <w:pPr>
-              <w:spacing w:after="0" w:line="240"/>
-              <w:jc w:val="left"/>
-            </w:pPr>
-            <w:r>
-              <w:rPr>
-                <w:rFonts w:ascii="Calibri" w:cs="Calibri" w:eastAsia="Calibri" w:hAnsi="Calibri"/>
-                <w:b w:val="false"/>
-                <w:bCs w:val="false"/>
-                <w:sz w:val="17"/>
-                <w:szCs w:val="17"/>
-              </w:rPr>
-              <w:t xml:space="preserve">GFN1-xTB, as-assembled geometry</w:t>
-            </w:r>
-          </w:p>
-        </w:tc>
-        <w:tc>
-          <w:tcPr>
-            <w:tcW w:type="dxa" w:w="2674"/>
-            <w:tcBorders>
-              <w:top w:val="none" w:color="FFFFFF" w:sz="0"/>
-              <w:left w:val="none" w:color="FFFFFF" w:sz="0"/>
-              <w:bottom w:val="single" w:color="52514e" w:sz="4"/>
-              <w:right w:val="none" w:color="FFFFFF" w:sz="0"/>
-            </w:tcBorders>
-            <w:tcMar>
-              <w:top w:type="dxa" w:w="40"/>
-              <w:left w:type="dxa" w:w="60"/>
-              <w:bottom w:type="dxa" w:w="40"/>
-              <w:right w:type="dxa" w:w="60"/>
-            </w:tcMar>
-            <w:vAlign w:val="center"/>
-          </w:tcPr>
-          <w:p>
-            <w:pPr>
-              <w:spacing w:after="0" w:line="240"/>
-              <w:jc w:val="center"/>
-            </w:pPr>
-            <w:r>
-              <w:rPr>
-                <w:rFonts w:ascii="Calibri" w:cs="Calibri" w:eastAsia="Calibri" w:hAnsi="Calibri"/>
-                <w:b w:val="false"/>
-                <w:bCs w:val="false"/>
-                <w:sz w:val="17"/>
-                <w:szCs w:val="17"/>
-              </w:rPr>
-              <w:t xml:space="preserve">0.43 (-0.30), n = 5</w:t>
-            </w:r>
-          </w:p>
-        </w:tc>
-        <w:tc>
-          <w:tcPr>
-            <w:tcW w:type="dxa" w:w="2674"/>
-            <w:tcBorders>
-              <w:top w:val="none" w:color="FFFFFF" w:sz="0"/>
-              <w:left w:val="none" w:color="FFFFFF" w:sz="0"/>
-              <w:bottom w:val="single" w:color="52514e" w:sz="4"/>
-              <w:right w:val="none" w:color="FFFFFF" w:sz="0"/>
-            </w:tcBorders>
-            <w:tcMar>
-              <w:top w:type="dxa" w:w="40"/>
-              <w:left w:type="dxa" w:w="60"/>
-              <w:bottom w:type="dxa" w:w="40"/>
-              <w:right w:type="dxa" w:w="60"/>
-            </w:tcMar>
-            <w:vAlign w:val="center"/>
-          </w:tcPr>
-          <w:p>
-            <w:pPr>
-              <w:spacing w:after="0" w:line="240"/>
-              <w:jc w:val="center"/>
-            </w:pPr>
-            <w:r>
-              <w:rPr>
-                <w:rFonts w:ascii="Calibri" w:cs="Calibri" w:eastAsia="Calibri" w:hAnsi="Calibri"/>
-                <w:b w:val="false"/>
-                <w:bCs w:val="false"/>
-                <w:sz w:val="17"/>
-                <w:szCs w:val="17"/>
-              </w:rPr>
-              <w:t xml:space="preserve">0.61 (+0.29), n = 13</w:t>
-            </w:r>
-          </w:p>
-        </w:tc>
-      </w:tr>
-    </w:tbl>
-    <w:p>
-      <w:pPr>
-        <w:spacing w:after="160"/>
-      </w:pPr>
+        <w:t xml:space="preserve">O predictions rise by 0.35 eV, to an in-sample error that is still 0.47 eV, and the paired substituent, metal and net trends of Section 3.1 are unchanged. Eighteen points cannot reweight a forest grown on twenty thousand, and nothing in the workflow claimed they would: the acquisition rule rewards low predicted gaps and uncertainty, not model improvement. The retrospective benchmark on QMOF separates the two effects (Fig. 9, Table S20). After 27 labels, the number of frameworks selected in this work, the acquisition rule has found 13.3 ± 2.8 structures with gaps below 0.5 eV against 3.6 ± 1.6 for random selection, and it recovers 60 % of the ten lowest gaps in the pool against 17 %. Running the same rule without ever retraining gives 13.3 hits. The greedy and plain lower confidence bound variants give 15.4 and 15.2, a little more, because they ignore the diversity caps that spread each batch over several families, and pure uncertainty sampling finds 1.1. Over the same 27 labels the MAE on an external out-of-distribution test set falls by only 7 meV, and by 17 meV after 59 labels, the same as with random labelling (17 meV). The parts of the loop that worked are therefore the ranking by the initial model and the eligibility rules learned from the DFT failures, which removed the families that collapse; the retraining step added little at this budget. That is how the value of the loop should be stated: at equal DFT cost it returned about 3.7 times more low gap frameworks than an unguided choice would have, and it left the model essentially as it was.</w:t>
+      </w:r>
     </w:p>
     <w:p>
       <w:pPr>
@@ -13256,7 +12599,7 @@
       <w:r>
         <w:drawing>
           <wp:inline distT="0" distB="0" distL="0" distR="0">
-            <wp:extent cx="3419475" cy="3200400"/>
+            <wp:extent cx="5943600" cy="2276475"/>
             <wp:effectExtent t="0" r="0" b="0" l="0"/>
             <wp:docPr id="1" name="" descr="" title=""/>
             <wp:cNvGraphicFramePr>
@@ -13281,6 +12624,853 @@
                   <pic:spPr bwMode="auto">
                     <a:xfrm>
                       <a:off x="0" y="0"/>
+                      <a:ext cx="5943600" cy="2276475"/>
+                    </a:xfrm>
+                    <a:prstGeom prst="rect">
+                      <a:avLst/>
+                    </a:prstGeom>
+                  </pic:spPr>
+                </pic:pic>
+              </a:graphicData>
+            </a:graphic>
+          </wp:inline>
+        </w:drawing>
+      </w:r>
+    </w:p>
+    <w:p>
+      <w:pPr>
+        <w:spacing w:after="240" w:line="252"/>
+        <w:jc w:val="both"/>
+      </w:pPr>
+      <w:r>
+        <w:rPr>
+          <w:rFonts w:ascii="Calibri" w:cs="Calibri" w:eastAsia="Calibri" w:hAnsi="Calibri"/>
+          <w:b/>
+          <w:bCs/>
+          <w:sz w:val="19"/>
+          <w:szCs w:val="19"/>
+        </w:rPr>
+        <w:t xml:space="preserve">Figure 9. </w:t>
+      </w:r>
+      <w:r>
+        <w:rPr>
+          <w:rFonts w:ascii="Calibri" w:cs="Calibri" w:eastAsia="Calibri" w:hAnsi="Calibri"/>
+          <w:sz w:val="19"/>
+          <w:szCs w:val="19"/>
+        </w:rPr>
+        <w:t xml:space="preserve">Retrospective active learning benchmark on QMOF (20 repeats, pools of 150 out-of-distribution structures with the catalogue's chemistry, batches of 11, 8, 8 and then 8). (a) Labelled structures with PBE gap below 0.5 eV and (b) recall of the ten lowest gaps in the pool against labels acquired, for six selection strategies; shaded bands are one standard deviation for the acquisition rule of this work and for random selection. (c) Change of the MAE on a fixed external out-of-distribution test set. The dotted line marks the 27 frameworks selected in the prospective campaign.</w:t>
+      </w:r>
+    </w:p>
+    <w:p>
+      <w:pPr>
+        <w:pStyle w:val="Heading2"/>
+        <w:spacing w:after="100" w:before="240"/>
+      </w:pPr>
+      <w:r>
+        <w:rPr>
+          <w:rFonts w:ascii="Calibri" w:cs="Calibri" w:eastAsia="Calibri" w:hAnsi="Calibri"/>
+          <w:b/>
+          <w:bCs/>
+          <w:i/>
+          <w:iCs/>
+          <w:sz w:val="23"/>
+          <w:szCs w:val="23"/>
+        </w:rPr>
+        <w:t xml:space="preserve">3.5 Periodic GFN1-xTB as a check that needs no training data</w:t>
+      </w:r>
+    </w:p>
+    <w:p>
+      <w:pPr>
+        <w:spacing w:after="120" w:line="276"/>
+        <w:jc w:val="both"/>
+      </w:pPr>
+      <w:r>
+        <w:rPr>
+          <w:rFonts w:ascii="Calibri" w:cs="Calibri" w:eastAsia="Calibri" w:hAnsi="Calibri"/>
+          <w:sz w:val="22"/>
+          <w:szCs w:val="22"/>
+        </w:rPr>
+        <w:t xml:space="preserve">On the 2,000-structure QMOF subset, periodic GFN1-xTB reproduces the PBE gaps of closed-shell frameworks with an MAE of 0.40 eV and a Spearman correlation of 0.90 (n = 791), but not those of open-shell 3d frameworks (MAE 0.73 eV, ρ = 0.29, n = 1,205), in line with Jose and Walsh [25] (Table S17, Fig. S7). The finite cluster treatment, which cuts the framework into a neutral fragment, collapses 98 % of the gaps below 0.1 eV regardless of the chemistry. An earlier version of this work had concluded from such clusters that GFN1-xTB is unusable for MOF band gaps, and we report the comparison so that the artefact is not repeated. Against hybrid HSE06 gaps the periodic xTB values are 1.3 to 1.5 eV too low, as PBE itself is.</w:t>
+      </w:r>
+    </w:p>
+    <w:p>
+      <w:pPr>
+        <w:spacing w:after="120" w:line="276"/>
+        <w:jc w:val="both"/>
+      </w:pPr>
+      <w:r>
+        <w:rPr>
+          <w:rFonts w:ascii="Calibri" w:cs="Calibri" w:eastAsia="Calibri" w:hAnsi="Calibri"/>
+          <w:sz w:val="22"/>
+          <w:szCs w:val="22"/>
+        </w:rPr>
+        <w:t xml:space="preserve">The useful result is on the generated frameworks (Table 3, Fig. 10). At the DFT geometry, GFN1-xTB reproduces the five Zn</w:t>
+      </w:r>
+      <w:r>
+        <w:rPr>
+          <w:rFonts w:ascii="Calibri" w:cs="Calibri" w:eastAsia="Calibri" w:hAnsi="Calibri"/>
+          <w:sz w:val="22"/>
+          <w:szCs w:val="22"/>
+          <w:vertAlign w:val="subscript"/>
+        </w:rPr>
+        <w:t xml:space="preserve">4</w:t>
+      </w:r>
+      <w:r>
+        <w:rPr>
+          <w:rFonts w:ascii="Calibri" w:cs="Calibri" w:eastAsia="Calibri" w:hAnsi="Calibri"/>
+          <w:sz w:val="22"/>
+          <w:szCs w:val="22"/>
+        </w:rPr>
+        <w:t xml:space="preserve">O labels with an MAE of 0.14 eV, where the model erred by 0.96 eV, and it does so without any training data. At the pre-relaxed geometry, which is available for every candidate at a cost of seconds to minutes, the MAE is 0.23 eV; at the as-assembled PORMAKE geometry it is 0.43 eV, because the compressed bonds of the raw assembly distort the frontier orbitals. The frontier orbitals of xTB also agree with the DFT band edges in character: for all five Zn</w:t>
+      </w:r>
+      <w:r>
+        <w:rPr>
+          <w:rFonts w:ascii="Calibri" w:cs="Calibri" w:eastAsia="Calibri" w:hAnsi="Calibri"/>
+          <w:sz w:val="22"/>
+          <w:szCs w:val="22"/>
+          <w:vertAlign w:val="subscript"/>
+        </w:rPr>
+        <w:t xml:space="preserve">4</w:t>
+      </w:r>
+      <w:r>
+        <w:rPr>
+          <w:rFonts w:ascii="Calibri" w:cs="Calibri" w:eastAsia="Calibri" w:hAnsi="Calibri"/>
+          <w:sz w:val="22"/>
+          <w:szCs w:val="22"/>
+        </w:rPr>
+        <w:t xml:space="preserve">O frameworks the dominant site group at the HOMO and at the LUMO is the same in both methods, and the linker fraction of the HOMO follows the same order across linkers (Table S19). For the 13 open-shell labels the picture reverses: the spin restricted xTB gaps have an MAE of 0.52 eV and no rank correlation with the labels, and across the catalogue the xTB and model predictions correlate for the closed-shell frameworks (ρ = 0.59) but not for the open-shell ones (ρ = 0.16). The two estimates complement each other. The practical rule is to run periodic xTB on pre-relaxed geometries for every closed-shell candidate before trusting a QMOF-trained model on it, at a cost that is negligible next to a single DFT relaxation.</w:t>
+      </w:r>
+    </w:p>
+    <w:p>
+      <w:pPr>
+        <w:keepNext/>
+        <w:spacing w:after="80" w:before="200" w:line="252"/>
+        <w:jc w:val="both"/>
+      </w:pPr>
+      <w:r>
+        <w:rPr>
+          <w:rFonts w:ascii="Calibri" w:cs="Calibri" w:eastAsia="Calibri" w:hAnsi="Calibri"/>
+          <w:b/>
+          <w:bCs/>
+          <w:sz w:val="19"/>
+          <w:szCs w:val="19"/>
+        </w:rPr>
+        <w:t xml:space="preserve">Table 3. </w:t>
+      </w:r>
+      <w:r>
+        <w:rPr>
+          <w:rFonts w:ascii="Calibri" w:cs="Calibri" w:eastAsia="Calibri" w:hAnsi="Calibri"/>
+          <w:sz w:val="19"/>
+          <w:szCs w:val="19"/>
+        </w:rPr>
+        <w:t xml:space="preserve">Mean absolute error and bias (eV) of the model and of periodic GFN1-xTB at three geometries against the accepted PBE-D3(BJ) labels, by electronic group. The k-mesh supercell row covers the labels whose static k-mesh supercell has at most 700 atoms; the pre-relaxed row covers the frameworks that had a machine-learned pre-relaxed geometry. Per framework values are in Table S18.</w:t>
+      </w:r>
+    </w:p>
+    <w:tbl>
+      <w:tblPr>
+        <w:tblW w:type="dxa" w:w="9360"/>
+        <w:tblBorders>
+          <w:top w:val="single" w:color="auto" w:sz="4"/>
+          <w:left w:val="single" w:color="auto" w:sz="4"/>
+          <w:bottom w:val="single" w:color="auto" w:sz="4"/>
+          <w:right w:val="single" w:color="auto" w:sz="4"/>
+          <w:insideH w:val="single" w:color="auto" w:sz="4"/>
+          <w:insideV w:val="single" w:color="auto" w:sz="4"/>
+        </w:tblBorders>
+      </w:tblPr>
+      <w:tblGrid>
+        <w:gridCol w:w="4011"/>
+        <w:gridCol w:w="2674"/>
+        <w:gridCol w:w="2674"/>
+      </w:tblGrid>
+      <w:tr>
+        <w:trPr>
+          <w:tblHeader/>
+        </w:trPr>
+        <w:tc>
+          <w:tcPr>
+            <w:tcW w:type="dxa" w:w="4011"/>
+            <w:tcBorders>
+              <w:top w:val="single" w:color="52514e" w:sz="4"/>
+              <w:left w:val="none" w:color="FFFFFF" w:sz="0"/>
+              <w:bottom w:val="single" w:color="52514e" w:sz="4"/>
+              <w:right w:val="none" w:color="FFFFFF" w:sz="0"/>
+            </w:tcBorders>
+            <w:tcMar>
+              <w:top w:type="dxa" w:w="40"/>
+              <w:left w:type="dxa" w:w="60"/>
+              <w:bottom w:type="dxa" w:w="40"/>
+              <w:right w:type="dxa" w:w="60"/>
+            </w:tcMar>
+            <w:vAlign w:val="center"/>
+          </w:tcPr>
+          <w:p>
+            <w:pPr>
+              <w:spacing w:after="0" w:line="240"/>
+              <w:jc w:val="left"/>
+            </w:pPr>
+            <w:r>
+              <w:rPr>
+                <w:rFonts w:ascii="Calibri" w:cs="Calibri" w:eastAsia="Calibri" w:hAnsi="Calibri"/>
+                <w:b/>
+                <w:bCs/>
+                <w:sz w:val="17"/>
+                <w:szCs w:val="17"/>
+              </w:rPr>
+              <w:t xml:space="preserve">Estimate</w:t>
+            </w:r>
+          </w:p>
+        </w:tc>
+        <w:tc>
+          <w:tcPr>
+            <w:tcW w:type="dxa" w:w="2674"/>
+            <w:tcBorders>
+              <w:top w:val="single" w:color="52514e" w:sz="4"/>
+              <w:left w:val="none" w:color="FFFFFF" w:sz="0"/>
+              <w:bottom w:val="single" w:color="52514e" w:sz="4"/>
+              <w:right w:val="none" w:color="FFFFFF" w:sz="0"/>
+            </w:tcBorders>
+            <w:tcMar>
+              <w:top w:type="dxa" w:w="40"/>
+              <w:left w:type="dxa" w:w="60"/>
+              <w:bottom w:type="dxa" w:w="40"/>
+              <w:right w:type="dxa" w:w="60"/>
+            </w:tcMar>
+            <w:vAlign w:val="center"/>
+          </w:tcPr>
+          <w:p>
+            <w:pPr>
+              <w:spacing w:after="0" w:line="240"/>
+              <w:jc w:val="center"/>
+            </w:pPr>
+            <w:r>
+              <w:rPr>
+                <w:rFonts w:ascii="Calibri" w:cs="Calibri" w:eastAsia="Calibri" w:hAnsi="Calibri"/>
+                <w:b/>
+                <w:bCs/>
+                <w:sz w:val="17"/>
+                <w:szCs w:val="17"/>
+              </w:rPr>
+              <w:t xml:space="preserve">Closed-shell Zn</w:t>
+            </w:r>
+            <w:r>
+              <w:rPr>
+                <w:rFonts w:ascii="Calibri" w:cs="Calibri" w:eastAsia="Calibri" w:hAnsi="Calibri"/>
+                <w:b/>
+                <w:bCs/>
+                <w:sz w:val="17"/>
+                <w:szCs w:val="17"/>
+                <w:vertAlign w:val="subscript"/>
+              </w:rPr>
+              <w:t xml:space="preserve">4</w:t>
+            </w:r>
+            <w:r>
+              <w:rPr>
+                <w:rFonts w:ascii="Calibri" w:cs="Calibri" w:eastAsia="Calibri" w:hAnsi="Calibri"/>
+                <w:b/>
+                <w:bCs/>
+                <w:sz w:val="17"/>
+                <w:szCs w:val="17"/>
+              </w:rPr>
+              <w:t xml:space="preserve">O: MAE (bias)</w:t>
+            </w:r>
+          </w:p>
+        </w:tc>
+        <w:tc>
+          <w:tcPr>
+            <w:tcW w:type="dxa" w:w="2674"/>
+            <w:tcBorders>
+              <w:top w:val="single" w:color="52514e" w:sz="4"/>
+              <w:left w:val="none" w:color="FFFFFF" w:sz="0"/>
+              <w:bottom w:val="single" w:color="52514e" w:sz="4"/>
+              <w:right w:val="none" w:color="FFFFFF" w:sz="0"/>
+            </w:tcBorders>
+            <w:tcMar>
+              <w:top w:type="dxa" w:w="40"/>
+              <w:left w:type="dxa" w:w="60"/>
+              <w:bottom w:type="dxa" w:w="40"/>
+              <w:right w:type="dxa" w:w="60"/>
+            </w:tcMar>
+            <w:vAlign w:val="center"/>
+          </w:tcPr>
+          <w:p>
+            <w:pPr>
+              <w:spacing w:after="0" w:line="240"/>
+              <w:jc w:val="center"/>
+            </w:pPr>
+            <w:r>
+              <w:rPr>
+                <w:rFonts w:ascii="Calibri" w:cs="Calibri" w:eastAsia="Calibri" w:hAnsi="Calibri"/>
+                <w:b/>
+                <w:bCs/>
+                <w:sz w:val="17"/>
+                <w:szCs w:val="17"/>
+              </w:rPr>
+              <w:t xml:space="preserve">Open-shell 3d: MAE (bias)</w:t>
+            </w:r>
+          </w:p>
+        </w:tc>
+      </w:tr>
+      <w:tr>
+        <w:tc>
+          <w:tcPr>
+            <w:tcW w:type="dxa" w:w="4011"/>
+            <w:tcBorders>
+              <w:top w:val="none" w:color="FFFFFF" w:sz="0"/>
+              <w:left w:val="none" w:color="FFFFFF" w:sz="0"/>
+              <w:bottom w:val="none" w:color="FFFFFF" w:sz="0"/>
+              <w:right w:val="none" w:color="FFFFFF" w:sz="0"/>
+            </w:tcBorders>
+            <w:tcMar>
+              <w:top w:type="dxa" w:w="40"/>
+              <w:left w:type="dxa" w:w="60"/>
+              <w:bottom w:type="dxa" w:w="40"/>
+              <w:right w:type="dxa" w:w="60"/>
+            </w:tcMar>
+            <w:vAlign w:val="center"/>
+          </w:tcPr>
+          <w:p>
+            <w:pPr>
+              <w:spacing w:after="0" w:line="240"/>
+              <w:jc w:val="left"/>
+            </w:pPr>
+            <w:r>
+              <w:rPr>
+                <w:rFonts w:ascii="Calibri" w:cs="Calibri" w:eastAsia="Calibri" w:hAnsi="Calibri"/>
+                <w:b w:val="false"/>
+                <w:bCs w:val="false"/>
+                <w:sz w:val="17"/>
+                <w:szCs w:val="17"/>
+              </w:rPr>
+              <w:t xml:space="preserve">Model μ before DFT</w:t>
+            </w:r>
+          </w:p>
+        </w:tc>
+        <w:tc>
+          <w:tcPr>
+            <w:tcW w:type="dxa" w:w="2674"/>
+            <w:tcBorders>
+              <w:top w:val="none" w:color="FFFFFF" w:sz="0"/>
+              <w:left w:val="none" w:color="FFFFFF" w:sz="0"/>
+              <w:bottom w:val="none" w:color="FFFFFF" w:sz="0"/>
+              <w:right w:val="none" w:color="FFFFFF" w:sz="0"/>
+            </w:tcBorders>
+            <w:tcMar>
+              <w:top w:type="dxa" w:w="40"/>
+              <w:left w:type="dxa" w:w="60"/>
+              <w:bottom w:type="dxa" w:w="40"/>
+              <w:right w:type="dxa" w:w="60"/>
+            </w:tcMar>
+            <w:vAlign w:val="center"/>
+          </w:tcPr>
+          <w:p>
+            <w:pPr>
+              <w:spacing w:after="0" w:line="240"/>
+              <w:jc w:val="center"/>
+            </w:pPr>
+            <w:r>
+              <w:rPr>
+                <w:rFonts w:ascii="Calibri" w:cs="Calibri" w:eastAsia="Calibri" w:hAnsi="Calibri"/>
+                <w:b w:val="false"/>
+                <w:bCs w:val="false"/>
+                <w:sz w:val="17"/>
+                <w:szCs w:val="17"/>
+              </w:rPr>
+              <w:t xml:space="preserve">0.96 (-0.96), n = 5</w:t>
+            </w:r>
+          </w:p>
+        </w:tc>
+        <w:tc>
+          <w:tcPr>
+            <w:tcW w:type="dxa" w:w="2674"/>
+            <w:tcBorders>
+              <w:top w:val="none" w:color="FFFFFF" w:sz="0"/>
+              <w:left w:val="none" w:color="FFFFFF" w:sz="0"/>
+              <w:bottom w:val="none" w:color="FFFFFF" w:sz="0"/>
+              <w:right w:val="none" w:color="FFFFFF" w:sz="0"/>
+            </w:tcBorders>
+            <w:tcMar>
+              <w:top w:type="dxa" w:w="40"/>
+              <w:left w:type="dxa" w:w="60"/>
+              <w:bottom w:type="dxa" w:w="40"/>
+              <w:right w:type="dxa" w:w="60"/>
+            </w:tcMar>
+            <w:vAlign w:val="center"/>
+          </w:tcPr>
+          <w:p>
+            <w:pPr>
+              <w:spacing w:after="0" w:line="240"/>
+              <w:jc w:val="center"/>
+            </w:pPr>
+            <w:r>
+              <w:rPr>
+                <w:rFonts w:ascii="Calibri" w:cs="Calibri" w:eastAsia="Calibri" w:hAnsi="Calibri"/>
+                <w:b w:val="false"/>
+                <w:bCs w:val="false"/>
+                <w:sz w:val="17"/>
+                <w:szCs w:val="17"/>
+              </w:rPr>
+              <w:t xml:space="preserve">0.23 (+0.09), n = 13</w:t>
+            </w:r>
+          </w:p>
+        </w:tc>
+      </w:tr>
+      <w:tr>
+        <w:tc>
+          <w:tcPr>
+            <w:tcW w:type="dxa" w:w="4011"/>
+            <w:tcBorders>
+              <w:top w:val="none" w:color="FFFFFF" w:sz="0"/>
+              <w:left w:val="none" w:color="FFFFFF" w:sz="0"/>
+              <w:bottom w:val="none" w:color="FFFFFF" w:sz="0"/>
+              <w:right w:val="none" w:color="FFFFFF" w:sz="0"/>
+            </w:tcBorders>
+            <w:tcMar>
+              <w:top w:type="dxa" w:w="40"/>
+              <w:left w:type="dxa" w:w="60"/>
+              <w:bottom w:type="dxa" w:w="40"/>
+              <w:right w:type="dxa" w:w="60"/>
+            </w:tcMar>
+            <w:vAlign w:val="center"/>
+          </w:tcPr>
+          <w:p>
+            <w:pPr>
+              <w:spacing w:after="0" w:line="240"/>
+              <w:jc w:val="left"/>
+            </w:pPr>
+            <w:r>
+              <w:rPr>
+                <w:rFonts w:ascii="Calibri" w:cs="Calibri" w:eastAsia="Calibri" w:hAnsi="Calibri"/>
+                <w:b w:val="false"/>
+                <w:bCs w:val="false"/>
+                <w:sz w:val="17"/>
+                <w:szCs w:val="17"/>
+              </w:rPr>
+              <w:t xml:space="preserve">GFN1-xTB, DFT geometry (Γ)</w:t>
+            </w:r>
+          </w:p>
+        </w:tc>
+        <w:tc>
+          <w:tcPr>
+            <w:tcW w:type="dxa" w:w="2674"/>
+            <w:tcBorders>
+              <w:top w:val="none" w:color="FFFFFF" w:sz="0"/>
+              <w:left w:val="none" w:color="FFFFFF" w:sz="0"/>
+              <w:bottom w:val="none" w:color="FFFFFF" w:sz="0"/>
+              <w:right w:val="none" w:color="FFFFFF" w:sz="0"/>
+            </w:tcBorders>
+            <w:tcMar>
+              <w:top w:type="dxa" w:w="40"/>
+              <w:left w:type="dxa" w:w="60"/>
+              <w:bottom w:type="dxa" w:w="40"/>
+              <w:right w:type="dxa" w:w="60"/>
+            </w:tcMar>
+            <w:vAlign w:val="center"/>
+          </w:tcPr>
+          <w:p>
+            <w:pPr>
+              <w:spacing w:after="0" w:line="240"/>
+              <w:jc w:val="center"/>
+            </w:pPr>
+            <w:r>
+              <w:rPr>
+                <w:rFonts w:ascii="Calibri" w:cs="Calibri" w:eastAsia="Calibri" w:hAnsi="Calibri"/>
+                <w:b w:val="false"/>
+                <w:bCs w:val="false"/>
+                <w:sz w:val="17"/>
+                <w:szCs w:val="17"/>
+              </w:rPr>
+              <w:t xml:space="preserve">0.14 (-0.07), n = 5</w:t>
+            </w:r>
+          </w:p>
+        </w:tc>
+        <w:tc>
+          <w:tcPr>
+            <w:tcW w:type="dxa" w:w="2674"/>
+            <w:tcBorders>
+              <w:top w:val="none" w:color="FFFFFF" w:sz="0"/>
+              <w:left w:val="none" w:color="FFFFFF" w:sz="0"/>
+              <w:bottom w:val="none" w:color="FFFFFF" w:sz="0"/>
+              <w:right w:val="none" w:color="FFFFFF" w:sz="0"/>
+            </w:tcBorders>
+            <w:tcMar>
+              <w:top w:type="dxa" w:w="40"/>
+              <w:left w:type="dxa" w:w="60"/>
+              <w:bottom w:type="dxa" w:w="40"/>
+              <w:right w:type="dxa" w:w="60"/>
+            </w:tcMar>
+            <w:vAlign w:val="center"/>
+          </w:tcPr>
+          <w:p>
+            <w:pPr>
+              <w:spacing w:after="0" w:line="240"/>
+              <w:jc w:val="center"/>
+            </w:pPr>
+            <w:r>
+              <w:rPr>
+                <w:rFonts w:ascii="Calibri" w:cs="Calibri" w:eastAsia="Calibri" w:hAnsi="Calibri"/>
+                <w:b w:val="false"/>
+                <w:bCs w:val="false"/>
+                <w:sz w:val="17"/>
+                <w:szCs w:val="17"/>
+              </w:rPr>
+              <w:t xml:space="preserve">0.52 (+0.14), n = 13</w:t>
+            </w:r>
+          </w:p>
+        </w:tc>
+      </w:tr>
+      <w:tr>
+        <w:tc>
+          <w:tcPr>
+            <w:tcW w:type="dxa" w:w="4011"/>
+            <w:tcBorders>
+              <w:top w:val="none" w:color="FFFFFF" w:sz="0"/>
+              <w:left w:val="none" w:color="FFFFFF" w:sz="0"/>
+              <w:bottom w:val="none" w:color="FFFFFF" w:sz="0"/>
+              <w:right w:val="none" w:color="FFFFFF" w:sz="0"/>
+            </w:tcBorders>
+            <w:tcMar>
+              <w:top w:type="dxa" w:w="40"/>
+              <w:left w:type="dxa" w:w="60"/>
+              <w:bottom w:type="dxa" w:w="40"/>
+              <w:right w:type="dxa" w:w="60"/>
+            </w:tcMar>
+            <w:vAlign w:val="center"/>
+          </w:tcPr>
+          <w:p>
+            <w:pPr>
+              <w:spacing w:after="0" w:line="240"/>
+              <w:jc w:val="left"/>
+            </w:pPr>
+            <w:r>
+              <w:rPr>
+                <w:rFonts w:ascii="Calibri" w:cs="Calibri" w:eastAsia="Calibri" w:hAnsi="Calibri"/>
+                <w:b w:val="false"/>
+                <w:bCs w:val="false"/>
+                <w:sz w:val="17"/>
+                <w:szCs w:val="17"/>
+              </w:rPr>
+              <w:t xml:space="preserve">GFN1-xTB, DFT geometry, k-mesh supercell</w:t>
+            </w:r>
+          </w:p>
+        </w:tc>
+        <w:tc>
+          <w:tcPr>
+            <w:tcW w:type="dxa" w:w="2674"/>
+            <w:tcBorders>
+              <w:top w:val="none" w:color="FFFFFF" w:sz="0"/>
+              <w:left w:val="none" w:color="FFFFFF" w:sz="0"/>
+              <w:bottom w:val="none" w:color="FFFFFF" w:sz="0"/>
+              <w:right w:val="none" w:color="FFFFFF" w:sz="0"/>
+            </w:tcBorders>
+            <w:tcMar>
+              <w:top w:type="dxa" w:w="40"/>
+              <w:left w:type="dxa" w:w="60"/>
+              <w:bottom w:type="dxa" w:w="40"/>
+              <w:right w:type="dxa" w:w="60"/>
+            </w:tcMar>
+            <w:vAlign w:val="center"/>
+          </w:tcPr>
+          <w:p>
+            <w:pPr>
+              <w:spacing w:after="0" w:line="240"/>
+              <w:jc w:val="center"/>
+            </w:pPr>
+            <w:r>
+              <w:rPr>
+                <w:rFonts w:ascii="Calibri" w:cs="Calibri" w:eastAsia="Calibri" w:hAnsi="Calibri"/>
+                <w:b w:val="false"/>
+                <w:bCs w:val="false"/>
+                <w:sz w:val="17"/>
+                <w:szCs w:val="17"/>
+              </w:rPr>
+              <w:t xml:space="preserve">0.17 (-0.08), n = 3</w:t>
+            </w:r>
+          </w:p>
+        </w:tc>
+        <w:tc>
+          <w:tcPr>
+            <w:tcW w:type="dxa" w:w="2674"/>
+            <w:tcBorders>
+              <w:top w:val="none" w:color="FFFFFF" w:sz="0"/>
+              <w:left w:val="none" w:color="FFFFFF" w:sz="0"/>
+              <w:bottom w:val="none" w:color="FFFFFF" w:sz="0"/>
+              <w:right w:val="none" w:color="FFFFFF" w:sz="0"/>
+            </w:tcBorders>
+            <w:tcMar>
+              <w:top w:type="dxa" w:w="40"/>
+              <w:left w:type="dxa" w:w="60"/>
+              <w:bottom w:type="dxa" w:w="40"/>
+              <w:right w:type="dxa" w:w="60"/>
+            </w:tcMar>
+            <w:vAlign w:val="center"/>
+          </w:tcPr>
+          <w:p>
+            <w:pPr>
+              <w:spacing w:after="0" w:line="240"/>
+              <w:jc w:val="center"/>
+            </w:pPr>
+            <w:r>
+              <w:rPr>
+                <w:rFonts w:ascii="Calibri" w:cs="Calibri" w:eastAsia="Calibri" w:hAnsi="Calibri"/>
+                <w:b w:val="false"/>
+                <w:bCs w:val="false"/>
+                <w:sz w:val="17"/>
+                <w:szCs w:val="17"/>
+              </w:rPr>
+              <w:t xml:space="preserve">0.78 (+0.12), n = 7</w:t>
+            </w:r>
+          </w:p>
+        </w:tc>
+      </w:tr>
+      <w:tr>
+        <w:tc>
+          <w:tcPr>
+            <w:tcW w:type="dxa" w:w="4011"/>
+            <w:tcBorders>
+              <w:top w:val="none" w:color="FFFFFF" w:sz="0"/>
+              <w:left w:val="none" w:color="FFFFFF" w:sz="0"/>
+              <w:bottom w:val="none" w:color="FFFFFF" w:sz="0"/>
+              <w:right w:val="none" w:color="FFFFFF" w:sz="0"/>
+            </w:tcBorders>
+            <w:tcMar>
+              <w:top w:type="dxa" w:w="40"/>
+              <w:left w:type="dxa" w:w="60"/>
+              <w:bottom w:type="dxa" w:w="40"/>
+              <w:right w:type="dxa" w:w="60"/>
+            </w:tcMar>
+            <w:vAlign w:val="center"/>
+          </w:tcPr>
+          <w:p>
+            <w:pPr>
+              <w:spacing w:after="0" w:line="240"/>
+              <w:jc w:val="left"/>
+            </w:pPr>
+            <w:r>
+              <w:rPr>
+                <w:rFonts w:ascii="Calibri" w:cs="Calibri" w:eastAsia="Calibri" w:hAnsi="Calibri"/>
+                <w:b w:val="false"/>
+                <w:bCs w:val="false"/>
+                <w:sz w:val="17"/>
+                <w:szCs w:val="17"/>
+              </w:rPr>
+              <w:t xml:space="preserve">GFN1-xTB, pre-relaxed geometry (ML potential)</w:t>
+            </w:r>
+          </w:p>
+        </w:tc>
+        <w:tc>
+          <w:tcPr>
+            <w:tcW w:type="dxa" w:w="2674"/>
+            <w:tcBorders>
+              <w:top w:val="none" w:color="FFFFFF" w:sz="0"/>
+              <w:left w:val="none" w:color="FFFFFF" w:sz="0"/>
+              <w:bottom w:val="none" w:color="FFFFFF" w:sz="0"/>
+              <w:right w:val="none" w:color="FFFFFF" w:sz="0"/>
+            </w:tcBorders>
+            <w:tcMar>
+              <w:top w:type="dxa" w:w="40"/>
+              <w:left w:type="dxa" w:w="60"/>
+              <w:bottom w:type="dxa" w:w="40"/>
+              <w:right w:type="dxa" w:w="60"/>
+            </w:tcMar>
+            <w:vAlign w:val="center"/>
+          </w:tcPr>
+          <w:p>
+            <w:pPr>
+              <w:spacing w:after="0" w:line="240"/>
+              <w:jc w:val="center"/>
+            </w:pPr>
+            <w:r>
+              <w:rPr>
+                <w:rFonts w:ascii="Calibri" w:cs="Calibri" w:eastAsia="Calibri" w:hAnsi="Calibri"/>
+                <w:b w:val="false"/>
+                <w:bCs w:val="false"/>
+                <w:sz w:val="17"/>
+                <w:szCs w:val="17"/>
+              </w:rPr>
+              <w:t xml:space="preserve">0.23 (-0.22), n = 5</w:t>
+            </w:r>
+          </w:p>
+        </w:tc>
+        <w:tc>
+          <w:tcPr>
+            <w:tcW w:type="dxa" w:w="2674"/>
+            <w:tcBorders>
+              <w:top w:val="none" w:color="FFFFFF" w:sz="0"/>
+              <w:left w:val="none" w:color="FFFFFF" w:sz="0"/>
+              <w:bottom w:val="none" w:color="FFFFFF" w:sz="0"/>
+              <w:right w:val="none" w:color="FFFFFF" w:sz="0"/>
+            </w:tcBorders>
+            <w:tcMar>
+              <w:top w:type="dxa" w:w="40"/>
+              <w:left w:type="dxa" w:w="60"/>
+              <w:bottom w:type="dxa" w:w="40"/>
+              <w:right w:type="dxa" w:w="60"/>
+            </w:tcMar>
+            <w:vAlign w:val="center"/>
+          </w:tcPr>
+          <w:p>
+            <w:pPr>
+              <w:spacing w:after="0" w:line="240"/>
+              <w:jc w:val="center"/>
+            </w:pPr>
+            <w:r>
+              <w:rPr>
+                <w:rFonts w:ascii="Calibri" w:cs="Calibri" w:eastAsia="Calibri" w:hAnsi="Calibri"/>
+                <w:b w:val="false"/>
+                <w:bCs w:val="false"/>
+                <w:sz w:val="17"/>
+                <w:szCs w:val="17"/>
+              </w:rPr>
+              <w:t xml:space="preserve">0.53 (+0.11), n = 12</w:t>
+            </w:r>
+          </w:p>
+        </w:tc>
+      </w:tr>
+      <w:tr>
+        <w:tc>
+          <w:tcPr>
+            <w:tcW w:type="dxa" w:w="4011"/>
+            <w:tcBorders>
+              <w:top w:val="none" w:color="FFFFFF" w:sz="0"/>
+              <w:left w:val="none" w:color="FFFFFF" w:sz="0"/>
+              <w:bottom w:val="single" w:color="52514e" w:sz="4"/>
+              <w:right w:val="none" w:color="FFFFFF" w:sz="0"/>
+            </w:tcBorders>
+            <w:tcMar>
+              <w:top w:type="dxa" w:w="40"/>
+              <w:left w:type="dxa" w:w="60"/>
+              <w:bottom w:type="dxa" w:w="40"/>
+              <w:right w:type="dxa" w:w="60"/>
+            </w:tcMar>
+            <w:vAlign w:val="center"/>
+          </w:tcPr>
+          <w:p>
+            <w:pPr>
+              <w:spacing w:after="0" w:line="240"/>
+              <w:jc w:val="left"/>
+            </w:pPr>
+            <w:r>
+              <w:rPr>
+                <w:rFonts w:ascii="Calibri" w:cs="Calibri" w:eastAsia="Calibri" w:hAnsi="Calibri"/>
+                <w:b w:val="false"/>
+                <w:bCs w:val="false"/>
+                <w:sz w:val="17"/>
+                <w:szCs w:val="17"/>
+              </w:rPr>
+              <w:t xml:space="preserve">GFN1-xTB, as-assembled geometry</w:t>
+            </w:r>
+          </w:p>
+        </w:tc>
+        <w:tc>
+          <w:tcPr>
+            <w:tcW w:type="dxa" w:w="2674"/>
+            <w:tcBorders>
+              <w:top w:val="none" w:color="FFFFFF" w:sz="0"/>
+              <w:left w:val="none" w:color="FFFFFF" w:sz="0"/>
+              <w:bottom w:val="single" w:color="52514e" w:sz="4"/>
+              <w:right w:val="none" w:color="FFFFFF" w:sz="0"/>
+            </w:tcBorders>
+            <w:tcMar>
+              <w:top w:type="dxa" w:w="40"/>
+              <w:left w:type="dxa" w:w="60"/>
+              <w:bottom w:type="dxa" w:w="40"/>
+              <w:right w:type="dxa" w:w="60"/>
+            </w:tcMar>
+            <w:vAlign w:val="center"/>
+          </w:tcPr>
+          <w:p>
+            <w:pPr>
+              <w:spacing w:after="0" w:line="240"/>
+              <w:jc w:val="center"/>
+            </w:pPr>
+            <w:r>
+              <w:rPr>
+                <w:rFonts w:ascii="Calibri" w:cs="Calibri" w:eastAsia="Calibri" w:hAnsi="Calibri"/>
+                <w:b w:val="false"/>
+                <w:bCs w:val="false"/>
+                <w:sz w:val="17"/>
+                <w:szCs w:val="17"/>
+              </w:rPr>
+              <w:t xml:space="preserve">0.43 (-0.30), n = 5</w:t>
+            </w:r>
+          </w:p>
+        </w:tc>
+        <w:tc>
+          <w:tcPr>
+            <w:tcW w:type="dxa" w:w="2674"/>
+            <w:tcBorders>
+              <w:top w:val="none" w:color="FFFFFF" w:sz="0"/>
+              <w:left w:val="none" w:color="FFFFFF" w:sz="0"/>
+              <w:bottom w:val="single" w:color="52514e" w:sz="4"/>
+              <w:right w:val="none" w:color="FFFFFF" w:sz="0"/>
+            </w:tcBorders>
+            <w:tcMar>
+              <w:top w:type="dxa" w:w="40"/>
+              <w:left w:type="dxa" w:w="60"/>
+              <w:bottom w:type="dxa" w:w="40"/>
+              <w:right w:type="dxa" w:w="60"/>
+            </w:tcMar>
+            <w:vAlign w:val="center"/>
+          </w:tcPr>
+          <w:p>
+            <w:pPr>
+              <w:spacing w:after="0" w:line="240"/>
+              <w:jc w:val="center"/>
+            </w:pPr>
+            <w:r>
+              <w:rPr>
+                <w:rFonts w:ascii="Calibri" w:cs="Calibri" w:eastAsia="Calibri" w:hAnsi="Calibri"/>
+                <w:b w:val="false"/>
+                <w:bCs w:val="false"/>
+                <w:sz w:val="17"/>
+                <w:szCs w:val="17"/>
+              </w:rPr>
+              <w:t xml:space="preserve">0.61 (+0.29), n = 13</w:t>
+            </w:r>
+          </w:p>
+        </w:tc>
+      </w:tr>
+    </w:tbl>
+    <w:p>
+      <w:pPr>
+        <w:spacing w:after="160"/>
+      </w:pPr>
+    </w:p>
+    <w:p>
+      <w:pPr>
+        <w:keepNext/>
+        <w:spacing w:after="60" w:before="200"/>
+        <w:jc w:val="center"/>
+      </w:pPr>
+      <w:r>
+        <w:drawing>
+          <wp:inline distT="0" distB="0" distL="0" distR="0">
+            <wp:extent cx="3419475" cy="3200400"/>
+            <wp:effectExtent t="0" r="0" b="0" l="0"/>
+            <wp:docPr id="1" name="" descr="" title=""/>
+            <wp:cNvGraphicFramePr>
+              <a:graphicFrameLocks xmlns:a="http://schemas.openxmlformats.org/drawingml/2006/main" noChangeAspect="1"/>
+            </wp:cNvGraphicFramePr>
+            <a:graphic xmlns:a="http://schemas.openxmlformats.org/drawingml/2006/main">
+              <a:graphicData uri="http://schemas.openxmlformats.org/drawingml/2006/picture">
+                <pic:pic xmlns:pic="http://schemas.openxmlformats.org/drawingml/2006/picture">
+                  <pic:nvPicPr>
+                    <pic:cNvPr id="0" name="" descr=""/>
+                    <pic:cNvPicPr>
+                      <a:picLocks noChangeAspect="1" noChangeArrowheads="1"/>
+                    </pic:cNvPicPr>
+                  </pic:nvPicPr>
+                  <pic:blipFill>
+                    <a:blip r:embed="rId16" cstate="none"/>
+                    <a:srcRect/>
+                    <a:stretch>
+                      <a:fillRect/>
+                    </a:stretch>
+                  </pic:blipFill>
+                  <pic:spPr bwMode="auto">
+                    <a:xfrm>
+                      <a:off x="0" y="0"/>
                       <a:ext cx="3419475" cy="3200400"/>
                     </a:xfrm>
                     <a:prstGeom prst="rect">
@@ -13307,7 +13497,7 @@
           <w:sz w:val="19"/>
           <w:szCs w:val="19"/>
         </w:rPr>
-        <w:t xml:space="preserve">Figure 9. </w:t>
+        <w:t xml:space="preserve">Figure 10. </w:t>
       </w:r>
       <w:r>
         <w:rPr>
@@ -13364,7 +13554,7 @@
           <w:sz w:val="22"/>
           <w:szCs w:val="22"/>
         </w:rPr>
-        <w:t xml:space="preserve">Four limitations bound the conclusions. First, PBE underestimates band gaps and, for open-shell 3d metals without a Hubbard correction, can close them spuriously [53]; the gaps reported here are PBE labels on the QMOF scale, not predictions of measured gaps. The 10,800 QMOF structures with both PBE and HSE06 gaps make the consequence concrete (Table S21, Fig. S7): for open-shell 3d frameworks the HSE06 gap exceeds the PBE gap by 2.2 eV at the median, and only 2 % of the frameworks with a PBE gap below 1 eV keep an HSE06 gap below 1 eV (15 % below 2 eV), against 16 % and 42 % for the other frameworks. A low PBE gap in an open-shell framework is therefore a flag for hybrid functional follow-up [54], which the low gap Fe and Co frameworks of Table 1 merit. Second, the labels depend on the spin solution. Only two or three solutions were tried per framework, the broken symmetry statics were run on the geometry relaxed in the ferromagnetic state, and the Co</w:t>
+        <w:t xml:space="preserve">Four limitations bound the conclusions. First, PBE underestimates band gaps and, for open-shell 3d metals without a Hubbard correction, can close them spuriously [53]; the gaps reported here are PBE labels on the QMOF scale, not predictions of measured gaps. The 10,800 QMOF structures with both PBE and HSE06 gaps make the consequence concrete (Table S21, Fig. S8): for open-shell 3d frameworks the HSE06 gap exceeds the PBE gap by 2.2 eV at the median, and only 2 % of the frameworks with a PBE gap below 1 eV keep an HSE06 gap below 1 eV (15 % below 2 eV), against 16 % and 42 % for the other frameworks. A low PBE gap in an open-shell framework is therefore a flag for hybrid functional follow-up [54], which the low gap Fe and Co frameworks of Table 1 merit. Second, the labels depend on the spin solution. Only two or three solutions were tried per framework, the broken symmetry statics were run on the geometry relaxed in the ferromagnetic state, and the Co</w:t>
       </w:r>
       <w:r>
         <w:rPr>
@@ -13705,7 +13895,7 @@
           <w:sz w:val="22"/>
           <w:szCs w:val="22"/>
         </w:rPr>
-        <w:t xml:space="preserve">Supplementary material to this article (Tables S1 to S21 and Figures S1 to S7) is available online.</w:t>
+        <w:t xml:space="preserve">Supplementary material to this article (Tables S1 to S21 and Figures S1 to S8) is available online.</w:t>
       </w:r>
     </w:p>
     <w:p>

</xml_diff>